<commit_message>
generate precending documentation BRD structure
</commit_message>
<xml_diff>
--- a/Business Requirements Document/Business Requirements Document.docx
+++ b/Business Requirements Document/Business Requirements Document.docx
@@ -4,19 +4,4037 @@
   <w:body>
     <w:p>
       <w:pPr>
-        <w:rPr>
-          <w:rFonts w:ascii="Times New Roman" w:hAnsi="Times New Roman" w:cs="Times New Roman"/>
-        </w:rPr>
-      </w:pPr>
+        <w:jc w:val="right"/>
+        <w:rPr>
+          <w:rFonts w:ascii="Times New Roman" w:hAnsi="Times New Roman" w:cs="Times New Roman"/>
+        </w:rPr>
+      </w:pPr>
+      <w:r>
+        <w:rPr>
+          <w:rFonts w:ascii="Times New Roman" w:hAnsi="Times New Roman" w:cs="Times New Roman"/>
+          <w:noProof/>
+        </w:rPr>
+        <w:drawing>
+          <wp:anchor distT="0" distB="0" distL="114300" distR="114300" simplePos="0" relativeHeight="251658240" behindDoc="0" locked="0" layoutInCell="1" allowOverlap="1" wp14:anchorId="6020BEAC" wp14:editId="5F5FD016">
+            <wp:simplePos x="0" y="0"/>
+            <wp:positionH relativeFrom="margin">
+              <wp:posOffset>-76200</wp:posOffset>
+            </wp:positionH>
+            <wp:positionV relativeFrom="margin">
+              <wp:posOffset>0</wp:posOffset>
+            </wp:positionV>
+            <wp:extent cx="2156460" cy="842770"/>
+            <wp:effectExtent l="0" t="0" r="0" b="0"/>
+            <wp:wrapSquare wrapText="bothSides"/>
+            <wp:docPr id="582978018" name="Picture 1"/>
+            <wp:cNvGraphicFramePr>
+              <a:graphicFrameLocks xmlns:a="http://schemas.openxmlformats.org/drawingml/2006/main" noChangeAspect="1"/>
+            </wp:cNvGraphicFramePr>
+            <a:graphic xmlns:a="http://schemas.openxmlformats.org/drawingml/2006/main">
+              <a:graphicData uri="http://schemas.openxmlformats.org/drawingml/2006/picture">
+                <pic:pic xmlns:pic="http://schemas.openxmlformats.org/drawingml/2006/picture">
+                  <pic:nvPicPr>
+                    <pic:cNvPr id="0" name="Picture 1"/>
+                    <pic:cNvPicPr>
+                      <a:picLocks noChangeAspect="1" noChangeArrowheads="1"/>
+                    </pic:cNvPicPr>
+                  </pic:nvPicPr>
+                  <pic:blipFill>
+                    <a:blip r:embed="rId8" cstate="print">
+                      <a:extLst>
+                        <a:ext uri="{28A0092B-C50C-407E-A947-70E740481C1C}">
+                          <a14:useLocalDpi xmlns:a14="http://schemas.microsoft.com/office/drawing/2010/main" val="0"/>
+                        </a:ext>
+                      </a:extLst>
+                    </a:blip>
+                    <a:srcRect/>
+                    <a:stretch>
+                      <a:fillRect/>
+                    </a:stretch>
+                  </pic:blipFill>
+                  <pic:spPr bwMode="auto">
+                    <a:xfrm>
+                      <a:off x="0" y="0"/>
+                      <a:ext cx="2156460" cy="842770"/>
+                    </a:xfrm>
+                    <a:prstGeom prst="rect">
+                      <a:avLst/>
+                    </a:prstGeom>
+                    <a:noFill/>
+                    <a:ln>
+                      <a:noFill/>
+                    </a:ln>
+                  </pic:spPr>
+                </pic:pic>
+              </a:graphicData>
+            </a:graphic>
+          </wp:anchor>
+        </w:drawing>
+      </w:r>
+      <w:r>
+        <w:rPr>
+          <w:rFonts w:ascii="Times New Roman" w:hAnsi="Times New Roman" w:cs="Times New Roman"/>
+          <w:noProof/>
+        </w:rPr>
+        <w:drawing>
+          <wp:inline distT="0" distB="0" distL="0" distR="0" wp14:anchorId="3C37E38B" wp14:editId="5EE05669">
+            <wp:extent cx="1586865" cy="785125"/>
+            <wp:effectExtent l="0" t="0" r="0" b="0"/>
+            <wp:docPr id="663822568" name="Picture 2"/>
+            <wp:cNvGraphicFramePr>
+              <a:graphicFrameLocks xmlns:a="http://schemas.openxmlformats.org/drawingml/2006/main" noChangeAspect="1"/>
+            </wp:cNvGraphicFramePr>
+            <a:graphic xmlns:a="http://schemas.openxmlformats.org/drawingml/2006/main">
+              <a:graphicData uri="http://schemas.openxmlformats.org/drawingml/2006/picture">
+                <pic:pic xmlns:pic="http://schemas.openxmlformats.org/drawingml/2006/picture">
+                  <pic:nvPicPr>
+                    <pic:cNvPr id="0" name="Picture 3"/>
+                    <pic:cNvPicPr>
+                      <a:picLocks noChangeAspect="1" noChangeArrowheads="1"/>
+                    </pic:cNvPicPr>
+                  </pic:nvPicPr>
+                  <pic:blipFill>
+                    <a:blip r:embed="rId9" cstate="print">
+                      <a:extLst>
+                        <a:ext uri="{28A0092B-C50C-407E-A947-70E740481C1C}">
+                          <a14:useLocalDpi xmlns:a14="http://schemas.microsoft.com/office/drawing/2010/main" val="0"/>
+                        </a:ext>
+                      </a:extLst>
+                    </a:blip>
+                    <a:srcRect/>
+                    <a:stretch>
+                      <a:fillRect/>
+                    </a:stretch>
+                  </pic:blipFill>
+                  <pic:spPr bwMode="auto">
+                    <a:xfrm>
+                      <a:off x="0" y="0"/>
+                      <a:ext cx="1605565" cy="794377"/>
+                    </a:xfrm>
+                    <a:prstGeom prst="rect">
+                      <a:avLst/>
+                    </a:prstGeom>
+                    <a:noFill/>
+                    <a:ln>
+                      <a:noFill/>
+                    </a:ln>
+                  </pic:spPr>
+                </pic:pic>
+              </a:graphicData>
+            </a:graphic>
+          </wp:inline>
+        </w:drawing>
+      </w:r>
+    </w:p>
+    <w:p>
+      <w:pPr>
+        <w:jc w:val="center"/>
+        <w:rPr>
+          <w:rFonts w:ascii="Times New Roman" w:hAnsi="Times New Roman" w:cs="Times New Roman"/>
+        </w:rPr>
+      </w:pPr>
+    </w:p>
+    <w:p>
+      <w:pPr>
+        <w:jc w:val="center"/>
+        <w:rPr>
+          <w:rFonts w:ascii="Times New Roman" w:hAnsi="Times New Roman" w:cs="Times New Roman"/>
+          <w:b/>
+          <w:bCs/>
+          <w:sz w:val="40"/>
+          <w:szCs w:val="40"/>
+        </w:rPr>
+      </w:pPr>
+      <w:r>
+        <w:rPr>
+          <w:rFonts w:ascii="Times New Roman" w:hAnsi="Times New Roman" w:cs="Times New Roman"/>
+          <w:b/>
+          <w:bCs/>
+          <w:sz w:val="40"/>
+          <w:szCs w:val="40"/>
+        </w:rPr>
+        <w:t xml:space="preserve">BUSINESS REQUIREMENTS </w:t>
+      </w:r>
+    </w:p>
+    <w:p>
+      <w:pPr>
+        <w:jc w:val="center"/>
+        <w:rPr>
+          <w:rFonts w:ascii="Times New Roman" w:hAnsi="Times New Roman" w:cs="Times New Roman"/>
+          <w:b/>
+          <w:bCs/>
+          <w:sz w:val="40"/>
+          <w:szCs w:val="40"/>
+        </w:rPr>
+      </w:pPr>
+      <w:r>
+        <w:rPr>
+          <w:rFonts w:ascii="Times New Roman" w:hAnsi="Times New Roman" w:cs="Times New Roman"/>
+          <w:b/>
+          <w:bCs/>
+          <w:sz w:val="40"/>
+          <w:szCs w:val="40"/>
+        </w:rPr>
+        <w:t>DOCUMENT</w:t>
+      </w:r>
+    </w:p>
+    <w:p>
+      <w:pPr>
+        <w:jc w:val="center"/>
+        <w:rPr>
+          <w:rFonts w:ascii="Times New Roman" w:hAnsi="Times New Roman" w:cs="Times New Roman"/>
+          <w:b/>
+          <w:bCs/>
+          <w:sz w:val="40"/>
+          <w:szCs w:val="40"/>
+        </w:rPr>
+      </w:pPr>
+      <w:r>
+        <w:rPr>
+          <w:rFonts w:ascii="Times New Roman" w:hAnsi="Times New Roman" w:cs="Times New Roman"/>
+          <w:b/>
+          <w:bCs/>
+          <w:sz w:val="40"/>
+          <w:szCs w:val="40"/>
+        </w:rPr>
+        <w:t>FOR</w:t>
+      </w:r>
+    </w:p>
+    <w:p>
+      <w:pPr>
+        <w:jc w:val="center"/>
+        <w:rPr>
+          <w:rFonts w:ascii="Times New Roman" w:hAnsi="Times New Roman" w:cs="Times New Roman"/>
+          <w:b/>
+          <w:bCs/>
+          <w:sz w:val="32"/>
+          <w:szCs w:val="32"/>
+        </w:rPr>
+      </w:pPr>
+    </w:p>
+    <w:p>
+      <w:pPr>
+        <w:jc w:val="center"/>
+        <w:rPr>
+          <w:rFonts w:ascii="Times New Roman" w:hAnsi="Times New Roman" w:cs="Times New Roman"/>
+          <w:b/>
+          <w:bCs/>
+          <w:sz w:val="36"/>
+          <w:szCs w:val="36"/>
+        </w:rPr>
+      </w:pPr>
+      <w:r>
+        <w:rPr>
+          <w:rFonts w:ascii="Times New Roman" w:hAnsi="Times New Roman" w:cs="Times New Roman"/>
+          <w:b/>
+          <w:bCs/>
+          <w:sz w:val="36"/>
+          <w:szCs w:val="36"/>
+        </w:rPr>
+        <w:t>WORK CALENDAR MANAGEMENT BY DEPARTMENT</w:t>
+      </w:r>
+    </w:p>
+    <w:p>
+      <w:pPr>
+        <w:jc w:val="center"/>
+        <w:rPr>
+          <w:rFonts w:ascii="Times New Roman" w:hAnsi="Times New Roman" w:cs="Times New Roman"/>
+          <w:b/>
+          <w:bCs/>
+          <w:sz w:val="36"/>
+          <w:szCs w:val="36"/>
+        </w:rPr>
+      </w:pPr>
+      <w:r>
+        <w:rPr>
+          <w:rFonts w:ascii="Times New Roman" w:hAnsi="Times New Roman" w:cs="Times New Roman"/>
+          <w:b/>
+          <w:bCs/>
+          <w:sz w:val="36"/>
+          <w:szCs w:val="36"/>
+        </w:rPr>
+        <w:t>IN ERP SYSTEMS</w:t>
+      </w:r>
+    </w:p>
+    <w:p>
+      <w:pPr>
+        <w:jc w:val="center"/>
+        <w:rPr>
+          <w:rFonts w:ascii="Times New Roman" w:hAnsi="Times New Roman" w:cs="Times New Roman"/>
+          <w:b/>
+          <w:bCs/>
+          <w:sz w:val="36"/>
+          <w:szCs w:val="36"/>
+        </w:rPr>
+      </w:pPr>
+    </w:p>
+    <w:p>
+      <w:pPr>
+        <w:jc w:val="center"/>
+        <w:rPr>
+          <w:rFonts w:ascii="Times New Roman" w:hAnsi="Times New Roman" w:cs="Times New Roman"/>
+          <w:color w:val="000000" w:themeColor="text1"/>
+          <w:sz w:val="28"/>
+          <w:szCs w:val="28"/>
+        </w:rPr>
+      </w:pPr>
+      <w:r>
+        <w:rPr>
+          <w:rFonts w:ascii="Times New Roman" w:hAnsi="Times New Roman" w:cs="Times New Roman"/>
+          <w:color w:val="000000" w:themeColor="text1"/>
+          <w:sz w:val="28"/>
+          <w:szCs w:val="28"/>
+        </w:rPr>
+        <w:t>Version 1.0</w:t>
+      </w:r>
+    </w:p>
+    <w:p>
+      <w:pPr>
+        <w:jc w:val="center"/>
+        <w:rPr>
+          <w:rFonts w:ascii="Times New Roman" w:hAnsi="Times New Roman" w:cs="Times New Roman"/>
+          <w:color w:val="000000" w:themeColor="text1"/>
+          <w:sz w:val="28"/>
+          <w:szCs w:val="28"/>
+        </w:rPr>
+      </w:pPr>
+    </w:p>
+    <w:p>
+      <w:pPr>
+        <w:rPr>
+          <w:rFonts w:ascii="Times New Roman" w:hAnsi="Times New Roman" w:cs="Times New Roman"/>
+          <w:color w:val="000000" w:themeColor="text1"/>
+          <w:sz w:val="28"/>
+          <w:szCs w:val="28"/>
+        </w:rPr>
+      </w:pPr>
+      <w:r>
+        <w:rPr>
+          <w:rFonts w:ascii="Times New Roman" w:hAnsi="Times New Roman" w:cs="Times New Roman"/>
+          <w:color w:val="000000" w:themeColor="text1"/>
+          <w:sz w:val="28"/>
+          <w:szCs w:val="28"/>
+        </w:rPr>
+        <w:t xml:space="preserve">                                 </w:t>
+      </w:r>
+      <w:r>
+        <w:rPr>
+          <w:rFonts w:ascii="Times New Roman" w:hAnsi="Times New Roman" w:cs="Times New Roman"/>
+          <w:color w:val="000000" w:themeColor="text1"/>
+          <w:sz w:val="28"/>
+          <w:szCs w:val="28"/>
+        </w:rPr>
+        <w:t xml:space="preserve">    </w:t>
+      </w:r>
+      <w:r>
+        <w:rPr>
+          <w:rFonts w:ascii="Times New Roman" w:hAnsi="Times New Roman" w:cs="Times New Roman"/>
+          <w:color w:val="000000" w:themeColor="text1"/>
+          <w:sz w:val="28"/>
+          <w:szCs w:val="28"/>
+        </w:rPr>
+        <w:t xml:space="preserve">   - Ho Chi Minh, </w:t>
+      </w:r>
+      <w:r>
+        <w:rPr>
+          <w:rFonts w:ascii="Times New Roman" w:hAnsi="Times New Roman" w:cs="Times New Roman"/>
+          <w:color w:val="000000" w:themeColor="text1"/>
+          <w:sz w:val="28"/>
+          <w:szCs w:val="28"/>
+        </w:rPr>
+        <w:t>April</w:t>
+      </w:r>
+      <w:r>
+        <w:rPr>
+          <w:rFonts w:ascii="Times New Roman" w:hAnsi="Times New Roman" w:cs="Times New Roman"/>
+          <w:color w:val="000000" w:themeColor="text1"/>
+          <w:sz w:val="28"/>
+          <w:szCs w:val="28"/>
+        </w:rPr>
+        <w:t xml:space="preserve"> </w:t>
+      </w:r>
+      <w:r>
+        <w:rPr>
+          <w:rFonts w:ascii="Times New Roman" w:hAnsi="Times New Roman" w:cs="Times New Roman"/>
+          <w:color w:val="000000" w:themeColor="text1"/>
+          <w:sz w:val="28"/>
+          <w:szCs w:val="28"/>
+        </w:rPr>
+        <w:t>08</w:t>
+      </w:r>
+      <w:r>
+        <w:rPr>
+          <w:rFonts w:ascii="Times New Roman" w:hAnsi="Times New Roman" w:cs="Times New Roman"/>
+          <w:color w:val="000000" w:themeColor="text1"/>
+          <w:sz w:val="28"/>
+          <w:szCs w:val="28"/>
+          <w:vertAlign w:val="superscript"/>
+        </w:rPr>
+        <w:t>th</w:t>
+      </w:r>
+      <w:r>
+        <w:rPr>
+          <w:rFonts w:ascii="Times New Roman" w:hAnsi="Times New Roman" w:cs="Times New Roman"/>
+          <w:color w:val="000000" w:themeColor="text1"/>
+          <w:sz w:val="28"/>
+          <w:szCs w:val="28"/>
+        </w:rPr>
+        <w:t>, 202</w:t>
+      </w:r>
+      <w:r>
+        <w:rPr>
+          <w:rFonts w:ascii="Times New Roman" w:hAnsi="Times New Roman" w:cs="Times New Roman"/>
+          <w:color w:val="000000" w:themeColor="text1"/>
+          <w:sz w:val="28"/>
+          <w:szCs w:val="28"/>
+        </w:rPr>
+        <w:t>6</w:t>
+      </w:r>
+      <w:r>
+        <w:rPr>
+          <w:rFonts w:ascii="Times New Roman" w:hAnsi="Times New Roman" w:cs="Times New Roman"/>
+          <w:color w:val="000000" w:themeColor="text1"/>
+          <w:sz w:val="28"/>
+          <w:szCs w:val="28"/>
+        </w:rPr>
+        <w:t xml:space="preserve"> </w:t>
+      </w:r>
+      <w:r>
+        <w:rPr>
+          <w:rFonts w:ascii="Times New Roman" w:hAnsi="Times New Roman" w:cs="Times New Roman"/>
+          <w:color w:val="000000" w:themeColor="text1"/>
+          <w:sz w:val="28"/>
+          <w:szCs w:val="28"/>
+        </w:rPr>
+        <w:t>–</w:t>
+      </w:r>
+    </w:p>
+    <w:p>
+      <w:pPr>
+        <w:rPr>
+          <w:rFonts w:ascii="Times New Roman" w:hAnsi="Times New Roman" w:cs="Times New Roman"/>
+          <w:color w:val="000000" w:themeColor="text1"/>
+          <w:sz w:val="28"/>
+          <w:szCs w:val="28"/>
+        </w:rPr>
+      </w:pPr>
+    </w:p>
+    <w:p>
+      <w:pPr>
+        <w:jc w:val="center"/>
+        <w:rPr>
+          <w:rFonts w:ascii="Times New Roman" w:hAnsi="Times New Roman" w:cs="Times New Roman"/>
+          <w:b/>
+          <w:bCs/>
+          <w:sz w:val="36"/>
+          <w:szCs w:val="36"/>
+        </w:rPr>
+      </w:pPr>
+    </w:p>
+    <w:tbl>
+      <w:tblPr>
+        <w:tblStyle w:val="TableGrid"/>
+        <w:tblW w:w="0" w:type="auto"/>
+        <w:tblLook w:val="04A0" w:firstRow="1" w:lastRow="0" w:firstColumn="1" w:lastColumn="0" w:noHBand="0" w:noVBand="1"/>
+      </w:tblPr>
+      <w:tblGrid>
+        <w:gridCol w:w="3256"/>
+        <w:gridCol w:w="6094"/>
+      </w:tblGrid>
+      <w:tr>
+        <w:tc>
+          <w:tcPr>
+            <w:tcW w:w="3256" w:type="dxa"/>
+          </w:tcPr>
+          <w:p>
+            <w:pPr>
+              <w:rPr>
+                <w:rFonts w:ascii="Times New Roman" w:hAnsi="Times New Roman" w:cs="Times New Roman"/>
+                <w:b/>
+                <w:bCs/>
+              </w:rPr>
+            </w:pPr>
+            <w:r>
+              <w:rPr>
+                <w:rFonts w:ascii="Times New Roman" w:hAnsi="Times New Roman" w:cs="Times New Roman"/>
+                <w:b/>
+                <w:bCs/>
+              </w:rPr>
+              <w:t>Project Sponsor:</w:t>
+            </w:r>
+          </w:p>
+        </w:tc>
+        <w:tc>
+          <w:tcPr>
+            <w:tcW w:w="6094" w:type="dxa"/>
+          </w:tcPr>
+          <w:p>
+            <w:pPr>
+              <w:rPr>
+                <w:rFonts w:ascii="Times New Roman" w:hAnsi="Times New Roman" w:cs="Times New Roman"/>
+              </w:rPr>
+            </w:pPr>
+            <w:r>
+              <w:rPr>
+                <w:rFonts w:ascii="Times New Roman" w:hAnsi="Times New Roman" w:cs="Times New Roman"/>
+              </w:rPr>
+              <w:t>FPT University HCM</w:t>
+            </w:r>
+          </w:p>
+        </w:tc>
+      </w:tr>
+      <w:tr>
+        <w:tc>
+          <w:tcPr>
+            <w:tcW w:w="3256" w:type="dxa"/>
+          </w:tcPr>
+          <w:p>
+            <w:pPr>
+              <w:rPr>
+                <w:rFonts w:ascii="Times New Roman" w:hAnsi="Times New Roman" w:cs="Times New Roman"/>
+                <w:b/>
+                <w:bCs/>
+              </w:rPr>
+            </w:pPr>
+            <w:r>
+              <w:rPr>
+                <w:rFonts w:ascii="Times New Roman" w:hAnsi="Times New Roman" w:cs="Times New Roman"/>
+                <w:b/>
+                <w:bCs/>
+              </w:rPr>
+              <w:t>Business Project Manager:</w:t>
+            </w:r>
+          </w:p>
+        </w:tc>
+        <w:tc>
+          <w:tcPr>
+            <w:tcW w:w="6094" w:type="dxa"/>
+          </w:tcPr>
+          <w:p>
+            <w:pPr>
+              <w:rPr>
+                <w:rFonts w:ascii="Times New Roman" w:hAnsi="Times New Roman" w:cs="Times New Roman"/>
+              </w:rPr>
+            </w:pPr>
+            <w:r>
+              <w:rPr>
+                <w:rFonts w:ascii="Times New Roman" w:hAnsi="Times New Roman" w:cs="Times New Roman"/>
+              </w:rPr>
+              <w:t>Anh Tran Tuan</w:t>
+            </w:r>
+          </w:p>
+        </w:tc>
+      </w:tr>
+      <w:tr>
+        <w:tc>
+          <w:tcPr>
+            <w:tcW w:w="3256" w:type="dxa"/>
+          </w:tcPr>
+          <w:p>
+            <w:pPr>
+              <w:rPr>
+                <w:rFonts w:ascii="Times New Roman" w:hAnsi="Times New Roman" w:cs="Times New Roman"/>
+                <w:b/>
+                <w:bCs/>
+              </w:rPr>
+            </w:pPr>
+            <w:r>
+              <w:rPr>
+                <w:rFonts w:ascii="Times New Roman" w:hAnsi="Times New Roman" w:cs="Times New Roman"/>
+                <w:b/>
+                <w:bCs/>
+              </w:rPr>
+              <w:t>IT Project Manager:</w:t>
+            </w:r>
+          </w:p>
+        </w:tc>
+        <w:tc>
+          <w:tcPr>
+            <w:tcW w:w="6094" w:type="dxa"/>
+          </w:tcPr>
+          <w:p>
+            <w:pPr>
+              <w:rPr>
+                <w:rFonts w:ascii="Times New Roman" w:hAnsi="Times New Roman" w:cs="Times New Roman"/>
+              </w:rPr>
+            </w:pPr>
+            <w:r>
+              <w:rPr>
+                <w:rFonts w:ascii="Times New Roman" w:hAnsi="Times New Roman" w:cs="Times New Roman"/>
+              </w:rPr>
+              <w:t>Phu Tran Gia</w:t>
+            </w:r>
+          </w:p>
+        </w:tc>
+      </w:tr>
+      <w:tr>
+        <w:tc>
+          <w:tcPr>
+            <w:tcW w:w="3256" w:type="dxa"/>
+          </w:tcPr>
+          <w:p>
+            <w:pPr>
+              <w:rPr>
+                <w:rFonts w:ascii="Times New Roman" w:hAnsi="Times New Roman" w:cs="Times New Roman"/>
+                <w:b/>
+                <w:bCs/>
+              </w:rPr>
+            </w:pPr>
+            <w:r>
+              <w:rPr>
+                <w:rFonts w:ascii="Times New Roman" w:hAnsi="Times New Roman" w:cs="Times New Roman"/>
+                <w:b/>
+                <w:bCs/>
+              </w:rPr>
+              <w:t>Business Analyst</w:t>
+            </w:r>
+          </w:p>
+        </w:tc>
+        <w:tc>
+          <w:tcPr>
+            <w:tcW w:w="6094" w:type="dxa"/>
+          </w:tcPr>
+          <w:p>
+            <w:pPr>
+              <w:rPr>
+                <w:rFonts w:ascii="Times New Roman" w:hAnsi="Times New Roman" w:cs="Times New Roman"/>
+                <w:b/>
+                <w:bCs/>
+              </w:rPr>
+            </w:pPr>
+            <w:r>
+              <w:rPr>
+                <w:rFonts w:ascii="Times New Roman" w:hAnsi="Times New Roman" w:cs="Times New Roman"/>
+              </w:rPr>
+              <w:t>Anh Tran Tuan</w:t>
+            </w:r>
+          </w:p>
+        </w:tc>
+      </w:tr>
+    </w:tbl>
+    <w:p>
+      <w:pPr>
+        <w:rPr>
+          <w:rFonts w:ascii="Times New Roman" w:hAnsi="Times New Roman" w:cs="Times New Roman"/>
+          <w:b/>
+          <w:bCs/>
+          <w:sz w:val="36"/>
+          <w:szCs w:val="36"/>
+        </w:rPr>
+      </w:pPr>
+    </w:p>
+    <w:tbl>
+      <w:tblPr>
+        <w:tblStyle w:val="TableGrid"/>
+        <w:tblW w:w="0" w:type="auto"/>
+        <w:tblLook w:val="04A0" w:firstRow="1" w:lastRow="0" w:firstColumn="1" w:lastColumn="0" w:noHBand="0" w:noVBand="1"/>
+      </w:tblPr>
+      <w:tblGrid>
+        <w:gridCol w:w="3256"/>
+        <w:gridCol w:w="6094"/>
+      </w:tblGrid>
+      <w:tr>
+        <w:tc>
+          <w:tcPr>
+            <w:tcW w:w="3256" w:type="dxa"/>
+          </w:tcPr>
+          <w:p>
+            <w:pPr>
+              <w:rPr>
+                <w:rFonts w:ascii="Times New Roman" w:hAnsi="Times New Roman" w:cs="Times New Roman"/>
+                <w:b/>
+                <w:bCs/>
+              </w:rPr>
+            </w:pPr>
+            <w:r>
+              <w:rPr>
+                <w:rFonts w:ascii="Times New Roman" w:hAnsi="Times New Roman" w:cs="Times New Roman"/>
+                <w:b/>
+                <w:bCs/>
+              </w:rPr>
+              <w:t>Document Author:</w:t>
+            </w:r>
+          </w:p>
+        </w:tc>
+        <w:tc>
+          <w:tcPr>
+            <w:tcW w:w="6094" w:type="dxa"/>
+          </w:tcPr>
+          <w:p>
+            <w:pPr>
+              <w:rPr>
+                <w:rFonts w:ascii="Times New Roman" w:hAnsi="Times New Roman" w:cs="Times New Roman"/>
+              </w:rPr>
+            </w:pPr>
+            <w:r>
+              <w:rPr>
+                <w:rFonts w:ascii="Times New Roman" w:hAnsi="Times New Roman" w:cs="Times New Roman"/>
+              </w:rPr>
+              <w:t>Anh Tran Tuan</w:t>
+            </w:r>
+          </w:p>
+        </w:tc>
+      </w:tr>
+      <w:tr>
+        <w:tc>
+          <w:tcPr>
+            <w:tcW w:w="3256" w:type="dxa"/>
+          </w:tcPr>
+          <w:p>
+            <w:pPr>
+              <w:rPr>
+                <w:rFonts w:ascii="Times New Roman" w:hAnsi="Times New Roman" w:cs="Times New Roman"/>
+                <w:b/>
+                <w:bCs/>
+              </w:rPr>
+            </w:pPr>
+            <w:r>
+              <w:rPr>
+                <w:rFonts w:ascii="Times New Roman" w:hAnsi="Times New Roman" w:cs="Times New Roman"/>
+                <w:b/>
+                <w:bCs/>
+              </w:rPr>
+              <w:t>Version Number:</w:t>
+            </w:r>
+          </w:p>
+        </w:tc>
+        <w:tc>
+          <w:tcPr>
+            <w:tcW w:w="6094" w:type="dxa"/>
+          </w:tcPr>
+          <w:p>
+            <w:pPr>
+              <w:rPr>
+                <w:rFonts w:ascii="Times New Roman" w:hAnsi="Times New Roman" w:cs="Times New Roman"/>
+              </w:rPr>
+            </w:pPr>
+            <w:r>
+              <w:rPr>
+                <w:rFonts w:ascii="Times New Roman" w:hAnsi="Times New Roman" w:cs="Times New Roman"/>
+              </w:rPr>
+              <w:t>v1.0</w:t>
+            </w:r>
+          </w:p>
+        </w:tc>
+      </w:tr>
+      <w:tr>
+        <w:tc>
+          <w:tcPr>
+            <w:tcW w:w="3256" w:type="dxa"/>
+          </w:tcPr>
+          <w:p>
+            <w:pPr>
+              <w:rPr>
+                <w:rFonts w:ascii="Times New Roman" w:hAnsi="Times New Roman" w:cs="Times New Roman"/>
+                <w:b/>
+                <w:bCs/>
+              </w:rPr>
+            </w:pPr>
+            <w:r>
+              <w:rPr>
+                <w:rFonts w:ascii="Times New Roman" w:hAnsi="Times New Roman" w:cs="Times New Roman"/>
+                <w:b/>
+                <w:bCs/>
+              </w:rPr>
+              <w:t>Last Updated:</w:t>
+            </w:r>
+          </w:p>
+        </w:tc>
+        <w:tc>
+          <w:tcPr>
+            <w:tcW w:w="6094" w:type="dxa"/>
+          </w:tcPr>
+          <w:p>
+            <w:pPr>
+              <w:rPr>
+                <w:rFonts w:ascii="Times New Roman" w:hAnsi="Times New Roman" w:cs="Times New Roman"/>
+              </w:rPr>
+            </w:pPr>
+            <w:r>
+              <w:rPr>
+                <w:rFonts w:ascii="Times New Roman" w:hAnsi="Times New Roman" w:cs="Times New Roman"/>
+              </w:rPr>
+              <w:t>08.04.2026</w:t>
+            </w:r>
+          </w:p>
+        </w:tc>
+      </w:tr>
+      <w:tr>
+        <w:tc>
+          <w:tcPr>
+            <w:tcW w:w="3256" w:type="dxa"/>
+          </w:tcPr>
+          <w:p>
+            <w:pPr>
+              <w:rPr>
+                <w:rFonts w:ascii="Times New Roman" w:hAnsi="Times New Roman" w:cs="Times New Roman"/>
+                <w:b/>
+                <w:bCs/>
+              </w:rPr>
+            </w:pPr>
+            <w:r>
+              <w:rPr>
+                <w:rFonts w:ascii="Times New Roman" w:hAnsi="Times New Roman" w:cs="Times New Roman"/>
+                <w:b/>
+                <w:bCs/>
+              </w:rPr>
+              <w:t>Status:</w:t>
+            </w:r>
+          </w:p>
+        </w:tc>
+        <w:tc>
+          <w:tcPr>
+            <w:tcW w:w="6094" w:type="dxa"/>
+          </w:tcPr>
+          <w:p>
+            <w:pPr>
+              <w:rPr>
+                <w:rFonts w:ascii="Times New Roman" w:hAnsi="Times New Roman" w:cs="Times New Roman"/>
+              </w:rPr>
+            </w:pPr>
+            <w:r>
+              <w:rPr>
+                <w:rFonts w:ascii="Times New Roman" w:hAnsi="Times New Roman" w:cs="Times New Roman"/>
+              </w:rPr>
+              <w:t>Draft</w:t>
+            </w:r>
+          </w:p>
+        </w:tc>
+      </w:tr>
+    </w:tbl>
+    <w:p>
+      <w:pPr>
+        <w:rPr>
+          <w:rFonts w:ascii="Times New Roman" w:hAnsi="Times New Roman" w:cs="Times New Roman"/>
+          <w:b/>
+          <w:bCs/>
+          <w:sz w:val="22"/>
+          <w:szCs w:val="22"/>
+        </w:rPr>
+        <w:sectPr>
+          <w:headerReference w:type="default" r:id="rId10"/>
+          <w:footerReference w:type="default" r:id="rId11"/>
+          <w:headerReference w:type="first" r:id="rId12"/>
+          <w:pgSz w:w="12240" w:h="15840"/>
+          <w:pgMar w:top="1440" w:right="1440" w:bottom="1440" w:left="1440" w:header="709" w:footer="709" w:gutter="0"/>
+          <w:pgNumType w:start="1"/>
+          <w:cols w:space="708"/>
+          <w:titlePg/>
+          <w:docGrid w:linePitch="360"/>
+        </w:sectPr>
+      </w:pPr>
+    </w:p>
+    <w:p>
+      <w:pPr>
+        <w:rPr>
+          <w:rFonts w:ascii="Times New Roman" w:hAnsi="Times New Roman" w:cs="Times New Roman"/>
+          <w:b/>
+          <w:bCs/>
+          <w:sz w:val="28"/>
+          <w:szCs w:val="28"/>
+        </w:rPr>
+      </w:pPr>
+      <w:r>
+        <w:rPr>
+          <w:rFonts w:ascii="Times New Roman" w:hAnsi="Times New Roman" w:cs="Times New Roman"/>
+          <w:b/>
+          <w:bCs/>
+          <w:sz w:val="28"/>
+          <w:szCs w:val="28"/>
+        </w:rPr>
+        <w:lastRenderedPageBreak/>
+        <w:t>DOCUMENT CONTROL</w:t>
+      </w:r>
+    </w:p>
+    <w:p>
+      <w:pPr>
+        <w:rPr>
+          <w:rFonts w:ascii="Times New Roman" w:hAnsi="Times New Roman" w:cs="Times New Roman"/>
+          <w:b/>
+          <w:bCs/>
+          <w:sz w:val="28"/>
+          <w:szCs w:val="28"/>
+        </w:rPr>
+      </w:pPr>
+      <w:r>
+        <w:rPr>
+          <w:rFonts w:ascii="Times New Roman" w:hAnsi="Times New Roman" w:cs="Times New Roman"/>
+          <w:b/>
+          <w:bCs/>
+          <w:sz w:val="28"/>
+          <w:szCs w:val="28"/>
+        </w:rPr>
+        <w:t>Contacts</w:t>
+      </w:r>
+    </w:p>
+    <w:tbl>
+      <w:tblPr>
+        <w:tblStyle w:val="TableGrid"/>
+        <w:tblW w:w="0" w:type="auto"/>
+        <w:tblLook w:val="04A0" w:firstRow="1" w:lastRow="0" w:firstColumn="1" w:lastColumn="0" w:noHBand="0" w:noVBand="1"/>
+      </w:tblPr>
+      <w:tblGrid>
+        <w:gridCol w:w="2405"/>
+        <w:gridCol w:w="6945"/>
+      </w:tblGrid>
+      <w:tr>
+        <w:tc>
+          <w:tcPr>
+            <w:tcW w:w="2405" w:type="dxa"/>
+          </w:tcPr>
+          <w:p>
+            <w:pPr>
+              <w:rPr>
+                <w:rFonts w:ascii="Times New Roman" w:hAnsi="Times New Roman" w:cs="Times New Roman"/>
+                <w:b/>
+                <w:bCs/>
+              </w:rPr>
+            </w:pPr>
+            <w:r>
+              <w:rPr>
+                <w:rFonts w:ascii="Times New Roman" w:hAnsi="Times New Roman" w:cs="Times New Roman"/>
+                <w:b/>
+                <w:bCs/>
+              </w:rPr>
+              <w:t>Name:</w:t>
+            </w:r>
+          </w:p>
+        </w:tc>
+        <w:tc>
+          <w:tcPr>
+            <w:tcW w:w="6945" w:type="dxa"/>
+          </w:tcPr>
+          <w:p>
+            <w:pPr>
+              <w:pStyle w:val="Header"/>
+              <w:tabs>
+                <w:tab w:val="clear" w:pos="4680"/>
+                <w:tab w:val="clear" w:pos="9360"/>
+              </w:tabs>
+              <w:rPr>
+                <w:rFonts w:ascii="Times New Roman" w:hAnsi="Times New Roman" w:cs="Times New Roman"/>
+              </w:rPr>
+            </w:pPr>
+            <w:r>
+              <w:rPr>
+                <w:rFonts w:ascii="Times New Roman" w:hAnsi="Times New Roman" w:cs="Times New Roman"/>
+              </w:rPr>
+              <w:t>Anh Tran Tuan</w:t>
+            </w:r>
+          </w:p>
+        </w:tc>
+      </w:tr>
+      <w:tr>
+        <w:tc>
+          <w:tcPr>
+            <w:tcW w:w="2405" w:type="dxa"/>
+          </w:tcPr>
+          <w:p>
+            <w:pPr>
+              <w:rPr>
+                <w:rFonts w:ascii="Times New Roman" w:hAnsi="Times New Roman" w:cs="Times New Roman"/>
+                <w:b/>
+                <w:bCs/>
+              </w:rPr>
+            </w:pPr>
+            <w:r>
+              <w:rPr>
+                <w:rFonts w:ascii="Times New Roman" w:hAnsi="Times New Roman" w:cs="Times New Roman"/>
+                <w:b/>
+                <w:bCs/>
+              </w:rPr>
+              <w:t>Title:</w:t>
+            </w:r>
+          </w:p>
+        </w:tc>
+        <w:tc>
+          <w:tcPr>
+            <w:tcW w:w="6945" w:type="dxa"/>
+          </w:tcPr>
+          <w:p>
+            <w:pPr>
+              <w:pStyle w:val="Header"/>
+              <w:tabs>
+                <w:tab w:val="clear" w:pos="4680"/>
+                <w:tab w:val="clear" w:pos="9360"/>
+              </w:tabs>
+              <w:rPr>
+                <w:rFonts w:ascii="Times New Roman" w:hAnsi="Times New Roman" w:cs="Times New Roman"/>
+              </w:rPr>
+            </w:pPr>
+            <w:r>
+              <w:rPr>
+                <w:rFonts w:ascii="Times New Roman" w:hAnsi="Times New Roman" w:cs="Times New Roman"/>
+              </w:rPr>
+              <w:t>Business Analyst</w:t>
+            </w:r>
+          </w:p>
+        </w:tc>
+      </w:tr>
+      <w:tr>
+        <w:tc>
+          <w:tcPr>
+            <w:tcW w:w="2405" w:type="dxa"/>
+          </w:tcPr>
+          <w:p>
+            <w:pPr>
+              <w:rPr>
+                <w:rFonts w:ascii="Times New Roman" w:hAnsi="Times New Roman" w:cs="Times New Roman"/>
+                <w:b/>
+                <w:bCs/>
+              </w:rPr>
+            </w:pPr>
+            <w:r>
+              <w:rPr>
+                <w:rFonts w:ascii="Times New Roman" w:hAnsi="Times New Roman" w:cs="Times New Roman"/>
+                <w:b/>
+                <w:bCs/>
+              </w:rPr>
+              <w:t>Location:</w:t>
+            </w:r>
+          </w:p>
+        </w:tc>
+        <w:tc>
+          <w:tcPr>
+            <w:tcW w:w="6945" w:type="dxa"/>
+          </w:tcPr>
+          <w:p>
+            <w:pPr>
+              <w:pStyle w:val="Header"/>
+              <w:tabs>
+                <w:tab w:val="clear" w:pos="4680"/>
+                <w:tab w:val="clear" w:pos="9360"/>
+              </w:tabs>
+              <w:rPr>
+                <w:rFonts w:ascii="Times New Roman" w:hAnsi="Times New Roman" w:cs="Times New Roman"/>
+              </w:rPr>
+            </w:pPr>
+            <w:r>
+              <w:rPr>
+                <w:rFonts w:ascii="Times New Roman" w:hAnsi="Times New Roman" w:cs="Times New Roman"/>
+              </w:rPr>
+              <w:t>Long Thanh My Ward, HCMC</w:t>
+            </w:r>
+          </w:p>
+        </w:tc>
+      </w:tr>
+      <w:tr>
+        <w:tc>
+          <w:tcPr>
+            <w:tcW w:w="2405" w:type="dxa"/>
+          </w:tcPr>
+          <w:p>
+            <w:pPr>
+              <w:rPr>
+                <w:rFonts w:ascii="Times New Roman" w:hAnsi="Times New Roman" w:cs="Times New Roman"/>
+                <w:b/>
+                <w:bCs/>
+              </w:rPr>
+            </w:pPr>
+            <w:r>
+              <w:rPr>
+                <w:rFonts w:ascii="Times New Roman" w:hAnsi="Times New Roman" w:cs="Times New Roman"/>
+                <w:b/>
+                <w:bCs/>
+              </w:rPr>
+              <w:t>Contact Number:</w:t>
+            </w:r>
+          </w:p>
+        </w:tc>
+        <w:tc>
+          <w:tcPr>
+            <w:tcW w:w="6945" w:type="dxa"/>
+          </w:tcPr>
+          <w:p>
+            <w:pPr>
+              <w:pStyle w:val="Header"/>
+              <w:tabs>
+                <w:tab w:val="clear" w:pos="4680"/>
+                <w:tab w:val="clear" w:pos="9360"/>
+              </w:tabs>
+              <w:rPr>
+                <w:rFonts w:ascii="Times New Roman" w:hAnsi="Times New Roman" w:cs="Times New Roman"/>
+              </w:rPr>
+            </w:pPr>
+            <w:r>
+              <w:rPr>
+                <w:rFonts w:ascii="Times New Roman" w:hAnsi="Times New Roman" w:cs="Times New Roman"/>
+              </w:rPr>
+              <w:t>(+84) 901498220</w:t>
+            </w:r>
+          </w:p>
+        </w:tc>
+      </w:tr>
+      <w:tr>
+        <w:tc>
+          <w:tcPr>
+            <w:tcW w:w="2405" w:type="dxa"/>
+          </w:tcPr>
+          <w:p>
+            <w:pPr>
+              <w:rPr>
+                <w:rFonts w:ascii="Times New Roman" w:hAnsi="Times New Roman" w:cs="Times New Roman"/>
+                <w:b/>
+                <w:bCs/>
+              </w:rPr>
+            </w:pPr>
+            <w:r>
+              <w:rPr>
+                <w:rFonts w:ascii="Times New Roman" w:hAnsi="Times New Roman" w:cs="Times New Roman"/>
+                <w:b/>
+                <w:bCs/>
+              </w:rPr>
+              <w:t>Email:</w:t>
+            </w:r>
+          </w:p>
+        </w:tc>
+        <w:tc>
+          <w:tcPr>
+            <w:tcW w:w="6945" w:type="dxa"/>
+          </w:tcPr>
+          <w:p>
+            <w:pPr>
+              <w:pStyle w:val="Header"/>
+              <w:tabs>
+                <w:tab w:val="clear" w:pos="4680"/>
+                <w:tab w:val="clear" w:pos="9360"/>
+              </w:tabs>
+              <w:rPr>
+                <w:rFonts w:ascii="Times New Roman" w:hAnsi="Times New Roman" w:cs="Times New Roman"/>
+              </w:rPr>
+            </w:pPr>
+            <w:r>
+              <w:rPr>
+                <w:rFonts w:ascii="Times New Roman" w:hAnsi="Times New Roman" w:cs="Times New Roman"/>
+              </w:rPr>
+              <w:t>trantuananhhh8088@gmail.com</w:t>
+            </w:r>
+          </w:p>
+        </w:tc>
+      </w:tr>
+    </w:tbl>
+    <w:p>
+      <w:pPr>
+        <w:rPr>
+          <w:rFonts w:ascii="Times New Roman" w:hAnsi="Times New Roman" w:cs="Times New Roman"/>
+          <w:b/>
+          <w:bCs/>
+          <w:sz w:val="26"/>
+          <w:szCs w:val="26"/>
+        </w:rPr>
+      </w:pPr>
+    </w:p>
+    <w:tbl>
+      <w:tblPr>
+        <w:tblStyle w:val="TableGrid"/>
+        <w:tblW w:w="0" w:type="auto"/>
+        <w:tblLook w:val="04A0" w:firstRow="1" w:lastRow="0" w:firstColumn="1" w:lastColumn="0" w:noHBand="0" w:noVBand="1"/>
+      </w:tblPr>
+      <w:tblGrid>
+        <w:gridCol w:w="2405"/>
+        <w:gridCol w:w="6945"/>
+      </w:tblGrid>
+      <w:tr>
+        <w:tc>
+          <w:tcPr>
+            <w:tcW w:w="2405" w:type="dxa"/>
+          </w:tcPr>
+          <w:p>
+            <w:pPr>
+              <w:rPr>
+                <w:rFonts w:ascii="Times New Roman" w:hAnsi="Times New Roman" w:cs="Times New Roman"/>
+                <w:b/>
+                <w:bCs/>
+              </w:rPr>
+            </w:pPr>
+            <w:r>
+              <w:rPr>
+                <w:rFonts w:ascii="Times New Roman" w:hAnsi="Times New Roman" w:cs="Times New Roman"/>
+                <w:b/>
+                <w:bCs/>
+              </w:rPr>
+              <w:t>Name:</w:t>
+            </w:r>
+          </w:p>
+        </w:tc>
+        <w:tc>
+          <w:tcPr>
+            <w:tcW w:w="6945" w:type="dxa"/>
+          </w:tcPr>
+          <w:p>
+            <w:pPr>
+              <w:pStyle w:val="Header"/>
+              <w:tabs>
+                <w:tab w:val="clear" w:pos="4680"/>
+                <w:tab w:val="clear" w:pos="9360"/>
+              </w:tabs>
+              <w:rPr>
+                <w:rFonts w:ascii="Times New Roman" w:hAnsi="Times New Roman" w:cs="Times New Roman"/>
+              </w:rPr>
+            </w:pPr>
+            <w:r>
+              <w:rPr>
+                <w:rFonts w:ascii="Times New Roman" w:hAnsi="Times New Roman" w:cs="Times New Roman"/>
+              </w:rPr>
+              <w:t>FPT University HCM</w:t>
+            </w:r>
+          </w:p>
+        </w:tc>
+      </w:tr>
+      <w:tr>
+        <w:tc>
+          <w:tcPr>
+            <w:tcW w:w="2405" w:type="dxa"/>
+          </w:tcPr>
+          <w:p>
+            <w:pPr>
+              <w:rPr>
+                <w:rFonts w:ascii="Times New Roman" w:hAnsi="Times New Roman" w:cs="Times New Roman"/>
+                <w:b/>
+                <w:bCs/>
+              </w:rPr>
+            </w:pPr>
+            <w:r>
+              <w:rPr>
+                <w:rFonts w:ascii="Times New Roman" w:hAnsi="Times New Roman" w:cs="Times New Roman"/>
+                <w:b/>
+                <w:bCs/>
+              </w:rPr>
+              <w:t>Title:</w:t>
+            </w:r>
+          </w:p>
+        </w:tc>
+        <w:tc>
+          <w:tcPr>
+            <w:tcW w:w="6945" w:type="dxa"/>
+          </w:tcPr>
+          <w:p>
+            <w:pPr>
+              <w:pStyle w:val="Header"/>
+              <w:tabs>
+                <w:tab w:val="clear" w:pos="4680"/>
+                <w:tab w:val="clear" w:pos="9360"/>
+              </w:tabs>
+              <w:rPr>
+                <w:rFonts w:ascii="Times New Roman" w:hAnsi="Times New Roman" w:cs="Times New Roman"/>
+              </w:rPr>
+            </w:pPr>
+            <w:r>
+              <w:rPr>
+                <w:rFonts w:ascii="Times New Roman" w:hAnsi="Times New Roman" w:cs="Times New Roman"/>
+              </w:rPr>
+              <w:t>Mentor | Supervisor</w:t>
+            </w:r>
+          </w:p>
+        </w:tc>
+      </w:tr>
+      <w:tr>
+        <w:tc>
+          <w:tcPr>
+            <w:tcW w:w="2405" w:type="dxa"/>
+          </w:tcPr>
+          <w:p>
+            <w:pPr>
+              <w:rPr>
+                <w:rFonts w:ascii="Times New Roman" w:hAnsi="Times New Roman" w:cs="Times New Roman"/>
+                <w:b/>
+                <w:bCs/>
+              </w:rPr>
+            </w:pPr>
+            <w:r>
+              <w:rPr>
+                <w:rFonts w:ascii="Times New Roman" w:hAnsi="Times New Roman" w:cs="Times New Roman"/>
+                <w:b/>
+                <w:bCs/>
+              </w:rPr>
+              <w:t>Location:</w:t>
+            </w:r>
+          </w:p>
+        </w:tc>
+        <w:tc>
+          <w:tcPr>
+            <w:tcW w:w="6945" w:type="dxa"/>
+          </w:tcPr>
+          <w:p>
+            <w:pPr>
+              <w:pStyle w:val="Header"/>
+              <w:tabs>
+                <w:tab w:val="clear" w:pos="4680"/>
+                <w:tab w:val="clear" w:pos="9360"/>
+              </w:tabs>
+              <w:rPr>
+                <w:rFonts w:ascii="Times New Roman" w:hAnsi="Times New Roman" w:cs="Times New Roman"/>
+              </w:rPr>
+            </w:pPr>
+            <w:r>
+              <w:rPr>
+                <w:rFonts w:ascii="Times New Roman" w:hAnsi="Times New Roman" w:cs="Times New Roman"/>
+              </w:rPr>
+              <w:t>Long Thanh My Ward, HCMC</w:t>
+            </w:r>
+          </w:p>
+        </w:tc>
+      </w:tr>
+      <w:tr>
+        <w:tc>
+          <w:tcPr>
+            <w:tcW w:w="2405" w:type="dxa"/>
+          </w:tcPr>
+          <w:p>
+            <w:pPr>
+              <w:rPr>
+                <w:rFonts w:ascii="Times New Roman" w:hAnsi="Times New Roman" w:cs="Times New Roman"/>
+                <w:b/>
+                <w:bCs/>
+              </w:rPr>
+            </w:pPr>
+            <w:r>
+              <w:rPr>
+                <w:rFonts w:ascii="Times New Roman" w:hAnsi="Times New Roman" w:cs="Times New Roman"/>
+                <w:b/>
+                <w:bCs/>
+              </w:rPr>
+              <w:t>Contact Number:</w:t>
+            </w:r>
+          </w:p>
+        </w:tc>
+        <w:tc>
+          <w:tcPr>
+            <w:tcW w:w="6945" w:type="dxa"/>
+          </w:tcPr>
+          <w:p>
+            <w:pPr>
+              <w:pStyle w:val="Header"/>
+              <w:tabs>
+                <w:tab w:val="clear" w:pos="4680"/>
+                <w:tab w:val="clear" w:pos="9360"/>
+              </w:tabs>
+              <w:rPr>
+                <w:rFonts w:ascii="Times New Roman" w:hAnsi="Times New Roman" w:cs="Times New Roman"/>
+              </w:rPr>
+            </w:pPr>
+            <w:r>
+              <w:rPr>
+                <w:rFonts w:ascii="Times New Roman" w:hAnsi="Times New Roman" w:cs="Times New Roman"/>
+              </w:rPr>
+              <w:t>(+84)</w:t>
+            </w:r>
+            <w:r>
+              <w:rPr>
+                <w:rFonts w:ascii="Times New Roman" w:hAnsi="Times New Roman" w:cs="Times New Roman"/>
+              </w:rPr>
+              <w:t xml:space="preserve"> xxxxx</w:t>
+            </w:r>
+          </w:p>
+        </w:tc>
+      </w:tr>
+      <w:tr>
+        <w:tc>
+          <w:tcPr>
+            <w:tcW w:w="2405" w:type="dxa"/>
+          </w:tcPr>
+          <w:p>
+            <w:pPr>
+              <w:rPr>
+                <w:rFonts w:ascii="Times New Roman" w:hAnsi="Times New Roman" w:cs="Times New Roman"/>
+                <w:b/>
+                <w:bCs/>
+              </w:rPr>
+            </w:pPr>
+            <w:r>
+              <w:rPr>
+                <w:rFonts w:ascii="Times New Roman" w:hAnsi="Times New Roman" w:cs="Times New Roman"/>
+                <w:b/>
+                <w:bCs/>
+              </w:rPr>
+              <w:t>Email:</w:t>
+            </w:r>
+          </w:p>
+        </w:tc>
+        <w:tc>
+          <w:tcPr>
+            <w:tcW w:w="6945" w:type="dxa"/>
+          </w:tcPr>
+          <w:p>
+            <w:pPr>
+              <w:pStyle w:val="Header"/>
+              <w:tabs>
+                <w:tab w:val="clear" w:pos="4680"/>
+                <w:tab w:val="clear" w:pos="9360"/>
+              </w:tabs>
+              <w:rPr>
+                <w:rFonts w:ascii="Times New Roman" w:hAnsi="Times New Roman" w:cs="Times New Roman"/>
+              </w:rPr>
+            </w:pPr>
+            <w:r>
+              <w:rPr>
+                <w:rFonts w:ascii="Times New Roman" w:hAnsi="Times New Roman" w:cs="Times New Roman"/>
+              </w:rPr>
+              <w:t>abc@fpt.com</w:t>
+            </w:r>
+          </w:p>
+        </w:tc>
+      </w:tr>
+    </w:tbl>
+    <w:p>
+      <w:pPr>
+        <w:rPr>
+          <w:rFonts w:ascii="Times New Roman" w:hAnsi="Times New Roman" w:cs="Times New Roman"/>
+          <w:b/>
+          <w:bCs/>
+          <w:sz w:val="26"/>
+          <w:szCs w:val="26"/>
+        </w:rPr>
+      </w:pPr>
+    </w:p>
+    <w:p>
+      <w:pPr>
+        <w:rPr>
+          <w:rFonts w:ascii="Times New Roman" w:hAnsi="Times New Roman" w:cs="Times New Roman"/>
+          <w:b/>
+          <w:bCs/>
+          <w:sz w:val="28"/>
+          <w:szCs w:val="28"/>
+        </w:rPr>
+      </w:pPr>
+      <w:r>
+        <w:rPr>
+          <w:rFonts w:ascii="Times New Roman" w:hAnsi="Times New Roman" w:cs="Times New Roman"/>
+          <w:b/>
+          <w:bCs/>
+          <w:sz w:val="28"/>
+          <w:szCs w:val="28"/>
+        </w:rPr>
+        <w:t>Document Approval</w:t>
+      </w:r>
+    </w:p>
+    <w:tbl>
+      <w:tblPr>
+        <w:tblStyle w:val="TableGrid"/>
+        <w:tblW w:w="0" w:type="auto"/>
+        <w:tblLook w:val="04A0" w:firstRow="1" w:lastRow="0" w:firstColumn="1" w:lastColumn="0" w:noHBand="0" w:noVBand="1"/>
+      </w:tblPr>
+      <w:tblGrid>
+        <w:gridCol w:w="2337"/>
+        <w:gridCol w:w="2337"/>
+        <w:gridCol w:w="2338"/>
+        <w:gridCol w:w="2338"/>
+      </w:tblGrid>
+      <w:tr>
+        <w:tc>
+          <w:tcPr>
+            <w:tcW w:w="2337" w:type="dxa"/>
+          </w:tcPr>
+          <w:p>
+            <w:pPr>
+              <w:rPr>
+                <w:rFonts w:ascii="Times New Roman" w:hAnsi="Times New Roman" w:cs="Times New Roman"/>
+                <w:b/>
+                <w:bCs/>
+              </w:rPr>
+            </w:pPr>
+            <w:r>
+              <w:rPr>
+                <w:rFonts w:ascii="Times New Roman" w:hAnsi="Times New Roman" w:cs="Times New Roman"/>
+                <w:b/>
+                <w:bCs/>
+              </w:rPr>
+              <w:t>Approver</w:t>
+            </w:r>
+          </w:p>
+        </w:tc>
+        <w:tc>
+          <w:tcPr>
+            <w:tcW w:w="2337" w:type="dxa"/>
+          </w:tcPr>
+          <w:p>
+            <w:pPr>
+              <w:rPr>
+                <w:rFonts w:ascii="Times New Roman" w:hAnsi="Times New Roman" w:cs="Times New Roman"/>
+                <w:b/>
+                <w:bCs/>
+              </w:rPr>
+            </w:pPr>
+            <w:r>
+              <w:rPr>
+                <w:rFonts w:ascii="Times New Roman" w:hAnsi="Times New Roman" w:cs="Times New Roman"/>
+                <w:b/>
+                <w:bCs/>
+              </w:rPr>
+              <w:t>Title</w:t>
+            </w:r>
+          </w:p>
+        </w:tc>
+        <w:tc>
+          <w:tcPr>
+            <w:tcW w:w="2338" w:type="dxa"/>
+          </w:tcPr>
+          <w:p>
+            <w:pPr>
+              <w:rPr>
+                <w:rFonts w:ascii="Times New Roman" w:hAnsi="Times New Roman" w:cs="Times New Roman"/>
+                <w:b/>
+                <w:bCs/>
+              </w:rPr>
+            </w:pPr>
+            <w:r>
+              <w:rPr>
+                <w:rFonts w:ascii="Times New Roman" w:hAnsi="Times New Roman" w:cs="Times New Roman"/>
+                <w:b/>
+                <w:bCs/>
+              </w:rPr>
+              <w:t>Business Area</w:t>
+            </w:r>
+          </w:p>
+        </w:tc>
+        <w:tc>
+          <w:tcPr>
+            <w:tcW w:w="2338" w:type="dxa"/>
+          </w:tcPr>
+          <w:p>
+            <w:pPr>
+              <w:rPr>
+                <w:rFonts w:ascii="Times New Roman" w:hAnsi="Times New Roman" w:cs="Times New Roman"/>
+                <w:b/>
+                <w:bCs/>
+              </w:rPr>
+            </w:pPr>
+            <w:r>
+              <w:rPr>
+                <w:rFonts w:ascii="Times New Roman" w:hAnsi="Times New Roman" w:cs="Times New Roman"/>
+                <w:b/>
+                <w:bCs/>
+              </w:rPr>
+              <w:t>Approval Date</w:t>
+            </w:r>
+          </w:p>
+        </w:tc>
+      </w:tr>
+      <w:tr>
+        <w:tc>
+          <w:tcPr>
+            <w:tcW w:w="2337" w:type="dxa"/>
+          </w:tcPr>
+          <w:p>
+            <w:pPr>
+              <w:pStyle w:val="Header"/>
+              <w:tabs>
+                <w:tab w:val="clear" w:pos="4680"/>
+                <w:tab w:val="clear" w:pos="9360"/>
+              </w:tabs>
+              <w:rPr>
+                <w:rFonts w:ascii="Times New Roman" w:hAnsi="Times New Roman" w:cs="Times New Roman"/>
+              </w:rPr>
+            </w:pPr>
+            <w:r>
+              <w:rPr>
+                <w:rFonts w:ascii="Times New Roman" w:hAnsi="Times New Roman" w:cs="Times New Roman"/>
+              </w:rPr>
+              <w:t>FPT University HCM</w:t>
+            </w:r>
+          </w:p>
+        </w:tc>
+        <w:tc>
+          <w:tcPr>
+            <w:tcW w:w="2337" w:type="dxa"/>
+          </w:tcPr>
+          <w:p>
+            <w:pPr>
+              <w:pStyle w:val="Header"/>
+              <w:tabs>
+                <w:tab w:val="clear" w:pos="4680"/>
+                <w:tab w:val="clear" w:pos="9360"/>
+              </w:tabs>
+              <w:rPr>
+                <w:rFonts w:ascii="Times New Roman" w:hAnsi="Times New Roman" w:cs="Times New Roman"/>
+              </w:rPr>
+            </w:pPr>
+            <w:r>
+              <w:rPr>
+                <w:rFonts w:ascii="Times New Roman" w:hAnsi="Times New Roman" w:cs="Times New Roman"/>
+              </w:rPr>
+              <w:t>Project Sponsor</w:t>
+            </w:r>
+          </w:p>
+        </w:tc>
+        <w:tc>
+          <w:tcPr>
+            <w:tcW w:w="2338" w:type="dxa"/>
+          </w:tcPr>
+          <w:p>
+            <w:pPr>
+              <w:rPr>
+                <w:rFonts w:ascii="Times New Roman" w:hAnsi="Times New Roman" w:cs="Times New Roman"/>
+              </w:rPr>
+            </w:pPr>
+            <w:r>
+              <w:rPr>
+                <w:rFonts w:ascii="Times New Roman" w:hAnsi="Times New Roman" w:cs="Times New Roman"/>
+              </w:rPr>
+              <w:t>SAP ERP Academic</w:t>
+            </w:r>
+          </w:p>
+        </w:tc>
+        <w:tc>
+          <w:tcPr>
+            <w:tcW w:w="2338" w:type="dxa"/>
+          </w:tcPr>
+          <w:p>
+            <w:pPr>
+              <w:pStyle w:val="Header"/>
+              <w:tabs>
+                <w:tab w:val="clear" w:pos="4680"/>
+                <w:tab w:val="clear" w:pos="9360"/>
+              </w:tabs>
+              <w:rPr>
+                <w:rFonts w:ascii="Times New Roman" w:hAnsi="Times New Roman" w:cs="Times New Roman"/>
+              </w:rPr>
+            </w:pPr>
+            <w:r>
+              <w:rPr>
+                <w:rFonts w:ascii="Times New Roman" w:hAnsi="Times New Roman" w:cs="Times New Roman"/>
+              </w:rPr>
+              <w:t>01.01.2026</w:t>
+            </w:r>
+          </w:p>
+        </w:tc>
+      </w:tr>
+      <w:tr>
+        <w:tc>
+          <w:tcPr>
+            <w:tcW w:w="2337" w:type="dxa"/>
+          </w:tcPr>
+          <w:p>
+            <w:pPr>
+              <w:pStyle w:val="Header"/>
+              <w:tabs>
+                <w:tab w:val="clear" w:pos="4680"/>
+                <w:tab w:val="clear" w:pos="9360"/>
+              </w:tabs>
+              <w:rPr>
+                <w:rFonts w:ascii="Times New Roman" w:hAnsi="Times New Roman" w:cs="Times New Roman"/>
+              </w:rPr>
+            </w:pPr>
+            <w:r>
+              <w:rPr>
+                <w:rFonts w:ascii="Times New Roman" w:hAnsi="Times New Roman" w:cs="Times New Roman"/>
+              </w:rPr>
+              <w:t>Fsoft Mentor</w:t>
+            </w:r>
+          </w:p>
+        </w:tc>
+        <w:tc>
+          <w:tcPr>
+            <w:tcW w:w="2337" w:type="dxa"/>
+          </w:tcPr>
+          <w:p>
+            <w:pPr>
+              <w:pStyle w:val="Header"/>
+              <w:tabs>
+                <w:tab w:val="clear" w:pos="4680"/>
+                <w:tab w:val="clear" w:pos="9360"/>
+              </w:tabs>
+              <w:rPr>
+                <w:rFonts w:ascii="Times New Roman" w:hAnsi="Times New Roman" w:cs="Times New Roman"/>
+              </w:rPr>
+            </w:pPr>
+            <w:r>
+              <w:rPr>
+                <w:rFonts w:ascii="Times New Roman" w:hAnsi="Times New Roman" w:cs="Times New Roman"/>
+              </w:rPr>
+              <w:t>Project Owner</w:t>
+            </w:r>
+          </w:p>
+        </w:tc>
+        <w:tc>
+          <w:tcPr>
+            <w:tcW w:w="2338" w:type="dxa"/>
+          </w:tcPr>
+          <w:p>
+            <w:pPr>
+              <w:rPr>
+                <w:rFonts w:ascii="Times New Roman" w:hAnsi="Times New Roman" w:cs="Times New Roman"/>
+              </w:rPr>
+            </w:pPr>
+            <w:r>
+              <w:rPr>
+                <w:rFonts w:ascii="Times New Roman" w:hAnsi="Times New Roman" w:cs="Times New Roman"/>
+              </w:rPr>
+              <w:t>SAP ERP Academic</w:t>
+            </w:r>
+          </w:p>
+        </w:tc>
+        <w:tc>
+          <w:tcPr>
+            <w:tcW w:w="2338" w:type="dxa"/>
+          </w:tcPr>
+          <w:p>
+            <w:pPr>
+              <w:pStyle w:val="Header"/>
+              <w:tabs>
+                <w:tab w:val="clear" w:pos="4680"/>
+                <w:tab w:val="clear" w:pos="9360"/>
+              </w:tabs>
+              <w:rPr>
+                <w:rFonts w:ascii="Times New Roman" w:hAnsi="Times New Roman" w:cs="Times New Roman"/>
+              </w:rPr>
+            </w:pPr>
+            <w:r>
+              <w:rPr>
+                <w:rFonts w:ascii="Times New Roman" w:hAnsi="Times New Roman" w:cs="Times New Roman"/>
+              </w:rPr>
+              <w:t>01.01.2026</w:t>
+            </w:r>
+          </w:p>
+        </w:tc>
+      </w:tr>
+      <w:tr>
+        <w:tc>
+          <w:tcPr>
+            <w:tcW w:w="2337" w:type="dxa"/>
+          </w:tcPr>
+          <w:p>
+            <w:pPr>
+              <w:rPr>
+                <w:rFonts w:ascii="Times New Roman" w:hAnsi="Times New Roman" w:cs="Times New Roman"/>
+                <w:b/>
+                <w:bCs/>
+              </w:rPr>
+            </w:pPr>
+            <w:r>
+              <w:rPr>
+                <w:rFonts w:ascii="Times New Roman" w:hAnsi="Times New Roman" w:cs="Times New Roman"/>
+              </w:rPr>
+              <w:t>Phu Tran Gia</w:t>
+            </w:r>
+          </w:p>
+        </w:tc>
+        <w:tc>
+          <w:tcPr>
+            <w:tcW w:w="2337" w:type="dxa"/>
+          </w:tcPr>
+          <w:p>
+            <w:pPr>
+              <w:pStyle w:val="Header"/>
+              <w:tabs>
+                <w:tab w:val="clear" w:pos="4680"/>
+                <w:tab w:val="clear" w:pos="9360"/>
+              </w:tabs>
+              <w:rPr>
+                <w:rFonts w:ascii="Times New Roman" w:hAnsi="Times New Roman" w:cs="Times New Roman"/>
+              </w:rPr>
+            </w:pPr>
+            <w:r>
+              <w:rPr>
+                <w:rFonts w:ascii="Times New Roman" w:hAnsi="Times New Roman" w:cs="Times New Roman"/>
+              </w:rPr>
+              <w:t xml:space="preserve">IT </w:t>
+            </w:r>
+            <w:r>
+              <w:rPr>
+                <w:rFonts w:ascii="Times New Roman" w:hAnsi="Times New Roman" w:cs="Times New Roman"/>
+              </w:rPr>
+              <w:t>Project Manager</w:t>
+            </w:r>
+          </w:p>
+        </w:tc>
+        <w:tc>
+          <w:tcPr>
+            <w:tcW w:w="2338" w:type="dxa"/>
+          </w:tcPr>
+          <w:p>
+            <w:pPr>
+              <w:pStyle w:val="Header"/>
+              <w:tabs>
+                <w:tab w:val="clear" w:pos="4680"/>
+                <w:tab w:val="clear" w:pos="9360"/>
+              </w:tabs>
+              <w:rPr>
+                <w:rFonts w:ascii="Times New Roman" w:hAnsi="Times New Roman" w:cs="Times New Roman"/>
+              </w:rPr>
+            </w:pPr>
+            <w:r>
+              <w:rPr>
+                <w:rFonts w:ascii="Times New Roman" w:hAnsi="Times New Roman" w:cs="Times New Roman"/>
+              </w:rPr>
+              <w:t>Technical Student</w:t>
+            </w:r>
+          </w:p>
+        </w:tc>
+        <w:tc>
+          <w:tcPr>
+            <w:tcW w:w="2338" w:type="dxa"/>
+          </w:tcPr>
+          <w:p>
+            <w:pPr>
+              <w:pStyle w:val="Header"/>
+              <w:tabs>
+                <w:tab w:val="clear" w:pos="4680"/>
+                <w:tab w:val="clear" w:pos="9360"/>
+              </w:tabs>
+              <w:rPr>
+                <w:rFonts w:ascii="Times New Roman" w:hAnsi="Times New Roman" w:cs="Times New Roman"/>
+              </w:rPr>
+            </w:pPr>
+            <w:r>
+              <w:rPr>
+                <w:rFonts w:ascii="Times New Roman" w:hAnsi="Times New Roman" w:cs="Times New Roman"/>
+              </w:rPr>
+              <w:t>01.01.2026</w:t>
+            </w:r>
+          </w:p>
+        </w:tc>
+      </w:tr>
+    </w:tbl>
+    <w:p>
+      <w:pPr>
+        <w:rPr>
+          <w:rFonts w:ascii="Times New Roman" w:hAnsi="Times New Roman" w:cs="Times New Roman"/>
+          <w:b/>
+          <w:bCs/>
+        </w:rPr>
+      </w:pPr>
+    </w:p>
+    <w:p>
+      <w:pPr>
+        <w:rPr>
+          <w:rFonts w:ascii="Times New Roman" w:hAnsi="Times New Roman" w:cs="Times New Roman"/>
+          <w:b/>
+          <w:bCs/>
+          <w:sz w:val="28"/>
+          <w:szCs w:val="28"/>
+        </w:rPr>
+      </w:pPr>
+      <w:r>
+        <w:rPr>
+          <w:rFonts w:ascii="Times New Roman" w:hAnsi="Times New Roman" w:cs="Times New Roman"/>
+          <w:b/>
+          <w:bCs/>
+          <w:sz w:val="28"/>
+          <w:szCs w:val="28"/>
+        </w:rPr>
+        <w:t xml:space="preserve">Document </w:t>
+      </w:r>
+      <w:r>
+        <w:rPr>
+          <w:rFonts w:ascii="Times New Roman" w:hAnsi="Times New Roman" w:cs="Times New Roman"/>
+          <w:b/>
+          <w:bCs/>
+          <w:sz w:val="28"/>
+          <w:szCs w:val="28"/>
+        </w:rPr>
+        <w:t>Distribution</w:t>
+      </w:r>
+    </w:p>
+    <w:tbl>
+      <w:tblPr>
+        <w:tblStyle w:val="TableGrid"/>
+        <w:tblW w:w="0" w:type="auto"/>
+        <w:tblLook w:val="04A0" w:firstRow="1" w:lastRow="0" w:firstColumn="1" w:lastColumn="0" w:noHBand="0" w:noVBand="1"/>
+      </w:tblPr>
+      <w:tblGrid>
+        <w:gridCol w:w="3116"/>
+        <w:gridCol w:w="3117"/>
+        <w:gridCol w:w="3117"/>
+      </w:tblGrid>
+      <w:tr>
+        <w:tc>
+          <w:tcPr>
+            <w:tcW w:w="3116" w:type="dxa"/>
+          </w:tcPr>
+          <w:p>
+            <w:pPr>
+              <w:rPr>
+                <w:rFonts w:ascii="Times New Roman" w:hAnsi="Times New Roman" w:cs="Times New Roman"/>
+                <w:b/>
+                <w:bCs/>
+              </w:rPr>
+            </w:pPr>
+            <w:r>
+              <w:rPr>
+                <w:rFonts w:ascii="Times New Roman" w:hAnsi="Times New Roman" w:cs="Times New Roman"/>
+                <w:b/>
+                <w:bCs/>
+              </w:rPr>
+              <w:t>Name</w:t>
+            </w:r>
+          </w:p>
+        </w:tc>
+        <w:tc>
+          <w:tcPr>
+            <w:tcW w:w="3117" w:type="dxa"/>
+          </w:tcPr>
+          <w:p>
+            <w:pPr>
+              <w:rPr>
+                <w:rFonts w:ascii="Times New Roman" w:hAnsi="Times New Roman" w:cs="Times New Roman"/>
+                <w:b/>
+                <w:bCs/>
+              </w:rPr>
+            </w:pPr>
+            <w:r>
+              <w:rPr>
+                <w:rFonts w:ascii="Times New Roman" w:hAnsi="Times New Roman" w:cs="Times New Roman"/>
+                <w:b/>
+                <w:bCs/>
+              </w:rPr>
+              <w:t>Title</w:t>
+            </w:r>
+          </w:p>
+        </w:tc>
+        <w:tc>
+          <w:tcPr>
+            <w:tcW w:w="3117" w:type="dxa"/>
+          </w:tcPr>
+          <w:p>
+            <w:pPr>
+              <w:rPr>
+                <w:rFonts w:ascii="Times New Roman" w:hAnsi="Times New Roman" w:cs="Times New Roman"/>
+                <w:b/>
+                <w:bCs/>
+              </w:rPr>
+            </w:pPr>
+            <w:r>
+              <w:rPr>
+                <w:rFonts w:ascii="Times New Roman" w:hAnsi="Times New Roman" w:cs="Times New Roman"/>
+                <w:b/>
+                <w:bCs/>
+              </w:rPr>
+              <w:t>Business Area</w:t>
+            </w:r>
+          </w:p>
+        </w:tc>
+      </w:tr>
+      <w:tr>
+        <w:tc>
+          <w:tcPr>
+            <w:tcW w:w="3116" w:type="dxa"/>
+          </w:tcPr>
+          <w:p>
+            <w:pPr>
+              <w:rPr>
+                <w:rFonts w:ascii="Times New Roman" w:hAnsi="Times New Roman" w:cs="Times New Roman"/>
+              </w:rPr>
+            </w:pPr>
+            <w:r>
+              <w:rPr>
+                <w:rFonts w:ascii="Times New Roman" w:hAnsi="Times New Roman" w:cs="Times New Roman"/>
+              </w:rPr>
+              <w:t>ABAP Developer Team</w:t>
+            </w:r>
+          </w:p>
+        </w:tc>
+        <w:tc>
+          <w:tcPr>
+            <w:tcW w:w="3117" w:type="dxa"/>
+          </w:tcPr>
+          <w:p>
+            <w:pPr>
+              <w:pStyle w:val="Header"/>
+              <w:tabs>
+                <w:tab w:val="clear" w:pos="4680"/>
+                <w:tab w:val="clear" w:pos="9360"/>
+              </w:tabs>
+              <w:rPr>
+                <w:rFonts w:ascii="Times New Roman" w:hAnsi="Times New Roman" w:cs="Times New Roman"/>
+              </w:rPr>
+            </w:pPr>
+            <w:r>
+              <w:rPr>
+                <w:rFonts w:ascii="Times New Roman" w:hAnsi="Times New Roman" w:cs="Times New Roman"/>
+              </w:rPr>
+              <w:t>Technical Lead</w:t>
+            </w:r>
+          </w:p>
+        </w:tc>
+        <w:tc>
+          <w:tcPr>
+            <w:tcW w:w="3117" w:type="dxa"/>
+          </w:tcPr>
+          <w:p>
+            <w:pPr>
+              <w:rPr>
+                <w:rFonts w:ascii="Times New Roman" w:hAnsi="Times New Roman" w:cs="Times New Roman"/>
+              </w:rPr>
+            </w:pPr>
+            <w:r>
+              <w:rPr>
+                <w:rFonts w:ascii="Times New Roman" w:hAnsi="Times New Roman" w:cs="Times New Roman"/>
+              </w:rPr>
+              <w:t>SAP Development</w:t>
+            </w:r>
+          </w:p>
+        </w:tc>
+      </w:tr>
+      <w:tr>
+        <w:tc>
+          <w:tcPr>
+            <w:tcW w:w="3116" w:type="dxa"/>
+          </w:tcPr>
+          <w:p>
+            <w:pPr>
+              <w:rPr>
+                <w:rFonts w:ascii="Times New Roman" w:hAnsi="Times New Roman" w:cs="Times New Roman"/>
+              </w:rPr>
+            </w:pPr>
+            <w:r>
+              <w:rPr>
+                <w:rFonts w:ascii="Times New Roman" w:hAnsi="Times New Roman" w:cs="Times New Roman"/>
+              </w:rPr>
+              <w:t>Fsoft Mentor</w:t>
+            </w:r>
+          </w:p>
+        </w:tc>
+        <w:tc>
+          <w:tcPr>
+            <w:tcW w:w="3117" w:type="dxa"/>
+          </w:tcPr>
+          <w:p>
+            <w:pPr>
+              <w:rPr>
+                <w:rFonts w:ascii="Times New Roman" w:hAnsi="Times New Roman" w:cs="Times New Roman"/>
+              </w:rPr>
+            </w:pPr>
+            <w:r>
+              <w:rPr>
+                <w:rFonts w:ascii="Times New Roman" w:hAnsi="Times New Roman" w:cs="Times New Roman"/>
+              </w:rPr>
+              <w:t>Documentation Supervisor</w:t>
+            </w:r>
+          </w:p>
+        </w:tc>
+        <w:tc>
+          <w:tcPr>
+            <w:tcW w:w="3117" w:type="dxa"/>
+          </w:tcPr>
+          <w:p>
+            <w:pPr>
+              <w:rPr>
+                <w:rFonts w:ascii="Times New Roman" w:hAnsi="Times New Roman" w:cs="Times New Roman"/>
+              </w:rPr>
+            </w:pPr>
+            <w:r>
+              <w:rPr>
+                <w:rFonts w:ascii="Times New Roman" w:hAnsi="Times New Roman" w:cs="Times New Roman"/>
+              </w:rPr>
+              <w:t>Project Owner</w:t>
+            </w:r>
+          </w:p>
+        </w:tc>
+      </w:tr>
+    </w:tbl>
+    <w:p>
+      <w:pPr>
+        <w:rPr>
+          <w:rFonts w:ascii="Times New Roman" w:hAnsi="Times New Roman" w:cs="Times New Roman"/>
+          <w:b/>
+          <w:bCs/>
+          <w:sz w:val="28"/>
+          <w:szCs w:val="28"/>
+        </w:rPr>
+      </w:pPr>
+    </w:p>
+    <w:p>
+      <w:pPr>
+        <w:rPr>
+          <w:rFonts w:ascii="Times New Roman" w:hAnsi="Times New Roman" w:cs="Times New Roman"/>
+          <w:b/>
+          <w:bCs/>
+          <w:sz w:val="28"/>
+          <w:szCs w:val="28"/>
+        </w:rPr>
+      </w:pPr>
+      <w:r>
+        <w:rPr>
+          <w:rFonts w:ascii="Times New Roman" w:hAnsi="Times New Roman" w:cs="Times New Roman"/>
+          <w:b/>
+          <w:bCs/>
+          <w:sz w:val="28"/>
+          <w:szCs w:val="28"/>
+        </w:rPr>
+        <w:t>Revision History</w:t>
+      </w:r>
+    </w:p>
+    <w:tbl>
+      <w:tblPr>
+        <w:tblStyle w:val="TableGrid"/>
+        <w:tblW w:w="0" w:type="auto"/>
+        <w:tblLook w:val="04A0" w:firstRow="1" w:lastRow="0" w:firstColumn="1" w:lastColumn="0" w:noHBand="0" w:noVBand="1"/>
+      </w:tblPr>
+      <w:tblGrid>
+        <w:gridCol w:w="1296"/>
+        <w:gridCol w:w="1263"/>
+        <w:gridCol w:w="1264"/>
+        <w:gridCol w:w="4133"/>
+        <w:gridCol w:w="1394"/>
+      </w:tblGrid>
+      <w:tr>
+        <w:tc>
+          <w:tcPr>
+            <w:tcW w:w="1129" w:type="dxa"/>
+          </w:tcPr>
+          <w:p>
+            <w:pPr>
+              <w:jc w:val="both"/>
+              <w:rPr>
+                <w:rFonts w:ascii="Times New Roman" w:hAnsi="Times New Roman" w:cs="Times New Roman"/>
+                <w:b/>
+                <w:bCs/>
+              </w:rPr>
+            </w:pPr>
+            <w:r>
+              <w:rPr>
+                <w:rFonts w:ascii="Times New Roman" w:hAnsi="Times New Roman" w:cs="Times New Roman"/>
+                <w:b/>
+                <w:bCs/>
+              </w:rPr>
+              <w:t>Date</w:t>
+            </w:r>
+          </w:p>
+        </w:tc>
+        <w:tc>
+          <w:tcPr>
+            <w:tcW w:w="1276" w:type="dxa"/>
+          </w:tcPr>
+          <w:p>
+            <w:pPr>
+              <w:jc w:val="both"/>
+              <w:rPr>
+                <w:rFonts w:ascii="Times New Roman" w:hAnsi="Times New Roman" w:cs="Times New Roman"/>
+                <w:b/>
+                <w:bCs/>
+              </w:rPr>
+            </w:pPr>
+            <w:r>
+              <w:rPr>
+                <w:rFonts w:ascii="Times New Roman" w:hAnsi="Times New Roman" w:cs="Times New Roman"/>
+                <w:b/>
+                <w:bCs/>
+              </w:rPr>
+              <w:t>Author</w:t>
+            </w:r>
+          </w:p>
+        </w:tc>
+        <w:tc>
+          <w:tcPr>
+            <w:tcW w:w="1276" w:type="dxa"/>
+          </w:tcPr>
+          <w:p>
+            <w:pPr>
+              <w:jc w:val="both"/>
+              <w:rPr>
+                <w:rFonts w:ascii="Times New Roman" w:hAnsi="Times New Roman" w:cs="Times New Roman"/>
+                <w:b/>
+                <w:bCs/>
+              </w:rPr>
+            </w:pPr>
+            <w:r>
+              <w:rPr>
+                <w:rFonts w:ascii="Times New Roman" w:hAnsi="Times New Roman" w:cs="Times New Roman"/>
+                <w:b/>
+                <w:bCs/>
+              </w:rPr>
+              <w:t>Version</w:t>
+            </w:r>
+          </w:p>
+        </w:tc>
+        <w:tc>
+          <w:tcPr>
+            <w:tcW w:w="4252" w:type="dxa"/>
+          </w:tcPr>
+          <w:p>
+            <w:pPr>
+              <w:jc w:val="both"/>
+              <w:rPr>
+                <w:rFonts w:ascii="Times New Roman" w:hAnsi="Times New Roman" w:cs="Times New Roman"/>
+                <w:b/>
+                <w:bCs/>
+              </w:rPr>
+            </w:pPr>
+            <w:r>
+              <w:rPr>
+                <w:rFonts w:ascii="Times New Roman" w:hAnsi="Times New Roman" w:cs="Times New Roman"/>
+                <w:b/>
+                <w:bCs/>
+              </w:rPr>
+              <w:t>Summary of Changes</w:t>
+            </w:r>
+          </w:p>
+        </w:tc>
+        <w:tc>
+          <w:tcPr>
+            <w:tcW w:w="1417" w:type="dxa"/>
+          </w:tcPr>
+          <w:p>
+            <w:pPr>
+              <w:jc w:val="both"/>
+              <w:rPr>
+                <w:rFonts w:ascii="Times New Roman" w:hAnsi="Times New Roman" w:cs="Times New Roman"/>
+                <w:b/>
+                <w:bCs/>
+              </w:rPr>
+            </w:pPr>
+            <w:r>
+              <w:rPr>
+                <w:rFonts w:ascii="Times New Roman" w:hAnsi="Times New Roman" w:cs="Times New Roman"/>
+                <w:b/>
+                <w:bCs/>
+              </w:rPr>
+              <w:t>Status</w:t>
+            </w:r>
+          </w:p>
+        </w:tc>
+      </w:tr>
+      <w:tr>
+        <w:tc>
+          <w:tcPr>
+            <w:tcW w:w="1129" w:type="dxa"/>
+          </w:tcPr>
+          <w:p>
+            <w:pPr>
+              <w:jc w:val="both"/>
+              <w:rPr>
+                <w:rFonts w:ascii="Times New Roman" w:hAnsi="Times New Roman" w:cs="Times New Roman"/>
+              </w:rPr>
+            </w:pPr>
+            <w:r>
+              <w:rPr>
+                <w:rFonts w:ascii="Times New Roman" w:hAnsi="Times New Roman" w:cs="Times New Roman"/>
+              </w:rPr>
+              <w:t>08.04.2026</w:t>
+            </w:r>
+          </w:p>
+        </w:tc>
+        <w:tc>
+          <w:tcPr>
+            <w:tcW w:w="1276" w:type="dxa"/>
+          </w:tcPr>
+          <w:p>
+            <w:pPr>
+              <w:jc w:val="both"/>
+              <w:rPr>
+                <w:rFonts w:ascii="Times New Roman" w:hAnsi="Times New Roman" w:cs="Times New Roman"/>
+              </w:rPr>
+            </w:pPr>
+            <w:r>
+              <w:rPr>
+                <w:rFonts w:ascii="Times New Roman" w:hAnsi="Times New Roman" w:cs="Times New Roman"/>
+              </w:rPr>
+              <w:t>AnhTT</w:t>
+            </w:r>
+          </w:p>
+        </w:tc>
+        <w:tc>
+          <w:tcPr>
+            <w:tcW w:w="1276" w:type="dxa"/>
+          </w:tcPr>
+          <w:p>
+            <w:pPr>
+              <w:jc w:val="both"/>
+              <w:rPr>
+                <w:rFonts w:ascii="Times New Roman" w:hAnsi="Times New Roman" w:cs="Times New Roman"/>
+              </w:rPr>
+            </w:pPr>
+            <w:r>
+              <w:rPr>
+                <w:rFonts w:ascii="Times New Roman" w:hAnsi="Times New Roman" w:cs="Times New Roman"/>
+              </w:rPr>
+              <w:t>0.1</w:t>
+            </w:r>
+          </w:p>
+        </w:tc>
+        <w:tc>
+          <w:tcPr>
+            <w:tcW w:w="4252" w:type="dxa"/>
+          </w:tcPr>
+          <w:p>
+            <w:pPr>
+              <w:jc w:val="both"/>
+              <w:rPr>
+                <w:rFonts w:ascii="Times New Roman" w:hAnsi="Times New Roman" w:cs="Times New Roman"/>
+              </w:rPr>
+            </w:pPr>
+            <w:r>
+              <w:rPr>
+                <w:rFonts w:ascii="Times New Roman" w:hAnsi="Times New Roman" w:cs="Times New Roman"/>
+              </w:rPr>
+              <w:t>Initialize the principal structure of BRD &amp; relevant descriptions</w:t>
+            </w:r>
+          </w:p>
+        </w:tc>
+        <w:tc>
+          <w:tcPr>
+            <w:tcW w:w="1417" w:type="dxa"/>
+          </w:tcPr>
+          <w:p>
+            <w:pPr>
+              <w:jc w:val="both"/>
+              <w:rPr>
+                <w:rFonts w:ascii="Times New Roman" w:hAnsi="Times New Roman" w:cs="Times New Roman"/>
+              </w:rPr>
+            </w:pPr>
+            <w:r>
+              <w:rPr>
+                <w:rFonts w:ascii="Times New Roman" w:hAnsi="Times New Roman" w:cs="Times New Roman"/>
+              </w:rPr>
+              <w:t>Draft</w:t>
+            </w:r>
+          </w:p>
+        </w:tc>
+      </w:tr>
+      <w:tr>
+        <w:tc>
+          <w:tcPr>
+            <w:tcW w:w="1129" w:type="dxa"/>
+          </w:tcPr>
+          <w:p>
+            <w:pPr>
+              <w:jc w:val="both"/>
+              <w:rPr>
+                <w:rFonts w:ascii="Times New Roman" w:hAnsi="Times New Roman" w:cs="Times New Roman"/>
+              </w:rPr>
+            </w:pPr>
+          </w:p>
+        </w:tc>
+        <w:tc>
+          <w:tcPr>
+            <w:tcW w:w="1276" w:type="dxa"/>
+          </w:tcPr>
+          <w:p>
+            <w:pPr>
+              <w:jc w:val="both"/>
+              <w:rPr>
+                <w:rFonts w:ascii="Times New Roman" w:hAnsi="Times New Roman" w:cs="Times New Roman"/>
+              </w:rPr>
+            </w:pPr>
+          </w:p>
+        </w:tc>
+        <w:tc>
+          <w:tcPr>
+            <w:tcW w:w="1276" w:type="dxa"/>
+          </w:tcPr>
+          <w:p>
+            <w:pPr>
+              <w:jc w:val="both"/>
+              <w:rPr>
+                <w:rFonts w:ascii="Times New Roman" w:hAnsi="Times New Roman" w:cs="Times New Roman"/>
+              </w:rPr>
+            </w:pPr>
+          </w:p>
+        </w:tc>
+        <w:tc>
+          <w:tcPr>
+            <w:tcW w:w="4252" w:type="dxa"/>
+          </w:tcPr>
+          <w:p>
+            <w:pPr>
+              <w:jc w:val="both"/>
+              <w:rPr>
+                <w:rFonts w:ascii="Times New Roman" w:hAnsi="Times New Roman" w:cs="Times New Roman"/>
+              </w:rPr>
+            </w:pPr>
+          </w:p>
+        </w:tc>
+        <w:tc>
+          <w:tcPr>
+            <w:tcW w:w="1417" w:type="dxa"/>
+          </w:tcPr>
+          <w:p>
+            <w:pPr>
+              <w:jc w:val="both"/>
+              <w:rPr>
+                <w:rFonts w:ascii="Times New Roman" w:hAnsi="Times New Roman" w:cs="Times New Roman"/>
+              </w:rPr>
+            </w:pPr>
+          </w:p>
+        </w:tc>
+      </w:tr>
+      <w:tr>
+        <w:tc>
+          <w:tcPr>
+            <w:tcW w:w="1129" w:type="dxa"/>
+          </w:tcPr>
+          <w:p>
+            <w:pPr>
+              <w:jc w:val="both"/>
+              <w:rPr>
+                <w:rFonts w:ascii="Times New Roman" w:hAnsi="Times New Roman" w:cs="Times New Roman"/>
+              </w:rPr>
+            </w:pPr>
+          </w:p>
+        </w:tc>
+        <w:tc>
+          <w:tcPr>
+            <w:tcW w:w="1276" w:type="dxa"/>
+          </w:tcPr>
+          <w:p>
+            <w:pPr>
+              <w:jc w:val="both"/>
+              <w:rPr>
+                <w:rFonts w:ascii="Times New Roman" w:hAnsi="Times New Roman" w:cs="Times New Roman"/>
+              </w:rPr>
+            </w:pPr>
+          </w:p>
+        </w:tc>
+        <w:tc>
+          <w:tcPr>
+            <w:tcW w:w="1276" w:type="dxa"/>
+          </w:tcPr>
+          <w:p>
+            <w:pPr>
+              <w:jc w:val="both"/>
+              <w:rPr>
+                <w:rFonts w:ascii="Times New Roman" w:hAnsi="Times New Roman" w:cs="Times New Roman"/>
+              </w:rPr>
+            </w:pPr>
+          </w:p>
+        </w:tc>
+        <w:tc>
+          <w:tcPr>
+            <w:tcW w:w="4252" w:type="dxa"/>
+          </w:tcPr>
+          <w:p>
+            <w:pPr>
+              <w:jc w:val="both"/>
+              <w:rPr>
+                <w:rFonts w:ascii="Times New Roman" w:hAnsi="Times New Roman" w:cs="Times New Roman"/>
+              </w:rPr>
+            </w:pPr>
+          </w:p>
+        </w:tc>
+        <w:tc>
+          <w:tcPr>
+            <w:tcW w:w="1417" w:type="dxa"/>
+          </w:tcPr>
+          <w:p>
+            <w:pPr>
+              <w:jc w:val="both"/>
+              <w:rPr>
+                <w:rFonts w:ascii="Times New Roman" w:hAnsi="Times New Roman" w:cs="Times New Roman"/>
+              </w:rPr>
+            </w:pPr>
+          </w:p>
+        </w:tc>
+      </w:tr>
+      <w:tr>
+        <w:tc>
+          <w:tcPr>
+            <w:tcW w:w="1129" w:type="dxa"/>
+          </w:tcPr>
+          <w:p>
+            <w:pPr>
+              <w:jc w:val="both"/>
+              <w:rPr>
+                <w:rFonts w:ascii="Times New Roman" w:hAnsi="Times New Roman" w:cs="Times New Roman"/>
+              </w:rPr>
+            </w:pPr>
+          </w:p>
+        </w:tc>
+        <w:tc>
+          <w:tcPr>
+            <w:tcW w:w="1276" w:type="dxa"/>
+          </w:tcPr>
+          <w:p>
+            <w:pPr>
+              <w:jc w:val="both"/>
+              <w:rPr>
+                <w:rFonts w:ascii="Times New Roman" w:hAnsi="Times New Roman" w:cs="Times New Roman"/>
+              </w:rPr>
+            </w:pPr>
+          </w:p>
+        </w:tc>
+        <w:tc>
+          <w:tcPr>
+            <w:tcW w:w="1276" w:type="dxa"/>
+          </w:tcPr>
+          <w:p>
+            <w:pPr>
+              <w:jc w:val="both"/>
+              <w:rPr>
+                <w:rFonts w:ascii="Times New Roman" w:hAnsi="Times New Roman" w:cs="Times New Roman"/>
+              </w:rPr>
+            </w:pPr>
+          </w:p>
+        </w:tc>
+        <w:tc>
+          <w:tcPr>
+            <w:tcW w:w="4252" w:type="dxa"/>
+          </w:tcPr>
+          <w:p>
+            <w:pPr>
+              <w:jc w:val="both"/>
+              <w:rPr>
+                <w:rFonts w:ascii="Times New Roman" w:hAnsi="Times New Roman" w:cs="Times New Roman"/>
+              </w:rPr>
+            </w:pPr>
+          </w:p>
+        </w:tc>
+        <w:tc>
+          <w:tcPr>
+            <w:tcW w:w="1417" w:type="dxa"/>
+          </w:tcPr>
+          <w:p>
+            <w:pPr>
+              <w:jc w:val="both"/>
+              <w:rPr>
+                <w:rFonts w:ascii="Times New Roman" w:hAnsi="Times New Roman" w:cs="Times New Roman"/>
+              </w:rPr>
+            </w:pPr>
+          </w:p>
+        </w:tc>
+      </w:tr>
+    </w:tbl>
+    <w:p>
+      <w:pPr>
+        <w:jc w:val="both"/>
+        <w:rPr>
+          <w:rFonts w:ascii="Times New Roman" w:hAnsi="Times New Roman" w:cs="Times New Roman"/>
+          <w:b/>
+          <w:bCs/>
+          <w:sz w:val="32"/>
+          <w:szCs w:val="32"/>
+        </w:rPr>
+      </w:pPr>
+    </w:p>
+    <w:p>
+      <w:pPr>
+        <w:jc w:val="both"/>
+        <w:rPr>
+          <w:rFonts w:ascii="Times New Roman" w:hAnsi="Times New Roman" w:cs="Times New Roman"/>
+          <w:b/>
+          <w:bCs/>
+          <w:sz w:val="32"/>
+          <w:szCs w:val="32"/>
+        </w:rPr>
+      </w:pPr>
+    </w:p>
+    <w:p>
+      <w:pPr>
+        <w:jc w:val="both"/>
+        <w:rPr>
+          <w:rFonts w:ascii="Times New Roman" w:hAnsi="Times New Roman" w:cs="Times New Roman"/>
+          <w:b/>
+          <w:bCs/>
+          <w:sz w:val="32"/>
+          <w:szCs w:val="32"/>
+        </w:rPr>
+      </w:pPr>
+    </w:p>
+    <w:p>
+      <w:pPr>
+        <w:jc w:val="both"/>
+        <w:rPr>
+          <w:rFonts w:ascii="Times New Roman" w:hAnsi="Times New Roman" w:cs="Times New Roman"/>
+          <w:b/>
+          <w:bCs/>
+          <w:sz w:val="28"/>
+          <w:szCs w:val="28"/>
+        </w:rPr>
+      </w:pPr>
+      <w:r>
+        <w:rPr>
+          <w:rFonts w:ascii="Times New Roman" w:hAnsi="Times New Roman" w:cs="Times New Roman"/>
+          <w:b/>
+          <w:bCs/>
+          <w:sz w:val="28"/>
+          <w:szCs w:val="28"/>
+        </w:rPr>
+        <w:lastRenderedPageBreak/>
+        <w:t>Related Documents</w:t>
+      </w:r>
+    </w:p>
+    <w:tbl>
+      <w:tblPr>
+        <w:tblStyle w:val="TableGrid"/>
+        <w:tblW w:w="0" w:type="auto"/>
+        <w:tblLook w:val="04A0" w:firstRow="1" w:lastRow="0" w:firstColumn="1" w:lastColumn="0" w:noHBand="0" w:noVBand="1"/>
+      </w:tblPr>
+      <w:tblGrid>
+        <w:gridCol w:w="3823"/>
+        <w:gridCol w:w="1275"/>
+        <w:gridCol w:w="1985"/>
+        <w:gridCol w:w="2267"/>
+      </w:tblGrid>
+      <w:tr>
+        <w:tc>
+          <w:tcPr>
+            <w:tcW w:w="3823" w:type="dxa"/>
+          </w:tcPr>
+          <w:p>
+            <w:pPr>
+              <w:jc w:val="both"/>
+            </w:pPr>
+            <w:r>
+              <w:rPr>
+                <w:rFonts w:ascii="Times New Roman" w:hAnsi="Times New Roman" w:cs="Times New Roman"/>
+                <w:b/>
+                <w:bCs/>
+              </w:rPr>
+              <w:t>Document Name</w:t>
+            </w:r>
+          </w:p>
+        </w:tc>
+        <w:tc>
+          <w:tcPr>
+            <w:tcW w:w="1275" w:type="dxa"/>
+          </w:tcPr>
+          <w:p>
+            <w:pPr>
+              <w:jc w:val="both"/>
+              <w:rPr>
+                <w:rFonts w:ascii="Times New Roman" w:hAnsi="Times New Roman" w:cs="Times New Roman"/>
+                <w:b/>
+                <w:bCs/>
+              </w:rPr>
+            </w:pPr>
+            <w:r>
+              <w:rPr>
+                <w:rFonts w:ascii="Times New Roman" w:hAnsi="Times New Roman" w:cs="Times New Roman"/>
+                <w:b/>
+                <w:bCs/>
+              </w:rPr>
+              <w:t>Version</w:t>
+            </w:r>
+          </w:p>
+        </w:tc>
+        <w:tc>
+          <w:tcPr>
+            <w:tcW w:w="1985" w:type="dxa"/>
+          </w:tcPr>
+          <w:p>
+            <w:pPr>
+              <w:jc w:val="both"/>
+              <w:rPr>
+                <w:rFonts w:ascii="Times New Roman" w:hAnsi="Times New Roman" w:cs="Times New Roman"/>
+                <w:b/>
+                <w:bCs/>
+              </w:rPr>
+            </w:pPr>
+            <w:r>
+              <w:rPr>
+                <w:rFonts w:ascii="Times New Roman" w:hAnsi="Times New Roman" w:cs="Times New Roman"/>
+                <w:b/>
+                <w:bCs/>
+              </w:rPr>
+              <w:t>Author</w:t>
+            </w:r>
+          </w:p>
+        </w:tc>
+        <w:tc>
+          <w:tcPr>
+            <w:tcW w:w="2267" w:type="dxa"/>
+          </w:tcPr>
+          <w:p>
+            <w:pPr>
+              <w:jc w:val="both"/>
+              <w:rPr>
+                <w:rFonts w:ascii="Times New Roman" w:hAnsi="Times New Roman" w:cs="Times New Roman"/>
+                <w:b/>
+                <w:bCs/>
+              </w:rPr>
+            </w:pPr>
+            <w:r>
+              <w:rPr>
+                <w:rFonts w:ascii="Times New Roman" w:hAnsi="Times New Roman" w:cs="Times New Roman"/>
+                <w:b/>
+                <w:bCs/>
+              </w:rPr>
+              <w:t>Date</w:t>
+            </w:r>
+          </w:p>
+        </w:tc>
+      </w:tr>
+      <w:tr>
+        <w:tc>
+          <w:tcPr>
+            <w:tcW w:w="3823" w:type="dxa"/>
+          </w:tcPr>
+          <w:p>
+            <w:pPr>
+              <w:jc w:val="both"/>
+              <w:rPr>
+                <w:rFonts w:ascii="Times New Roman" w:hAnsi="Times New Roman" w:cs="Times New Roman"/>
+              </w:rPr>
+            </w:pPr>
+            <w:r>
+              <w:rPr>
+                <w:rFonts w:ascii="Times New Roman" w:hAnsi="Times New Roman" w:cs="Times New Roman"/>
+              </w:rPr>
+              <w:t>Creating Organizational Structure in HCM</w:t>
+            </w:r>
+          </w:p>
+        </w:tc>
+        <w:tc>
+          <w:tcPr>
+            <w:tcW w:w="1275" w:type="dxa"/>
+          </w:tcPr>
+          <w:p>
+            <w:pPr>
+              <w:jc w:val="both"/>
+              <w:rPr>
+                <w:rFonts w:ascii="Times New Roman" w:hAnsi="Times New Roman" w:cs="Times New Roman"/>
+              </w:rPr>
+            </w:pPr>
+            <w:r>
+              <w:rPr>
+                <w:rFonts w:ascii="Times New Roman" w:hAnsi="Times New Roman" w:cs="Times New Roman"/>
+              </w:rPr>
+              <w:t>v6.0</w:t>
+            </w:r>
+          </w:p>
+        </w:tc>
+        <w:tc>
+          <w:tcPr>
+            <w:tcW w:w="1985" w:type="dxa"/>
+          </w:tcPr>
+          <w:p>
+            <w:pPr>
+              <w:jc w:val="both"/>
+              <w:rPr>
+                <w:rFonts w:ascii="Times New Roman" w:hAnsi="Times New Roman" w:cs="Times New Roman"/>
+              </w:rPr>
+            </w:pPr>
+            <w:r>
+              <w:rPr>
+                <w:rFonts w:ascii="Times New Roman" w:hAnsi="Times New Roman" w:cs="Times New Roman"/>
+              </w:rPr>
+              <w:t>Sap Help Portal</w:t>
+            </w:r>
+          </w:p>
+        </w:tc>
+        <w:tc>
+          <w:tcPr>
+            <w:tcW w:w="2267" w:type="dxa"/>
+          </w:tcPr>
+          <w:p>
+            <w:pPr>
+              <w:jc w:val="both"/>
+              <w:rPr>
+                <w:rFonts w:ascii="Times New Roman" w:hAnsi="Times New Roman" w:cs="Times New Roman"/>
+              </w:rPr>
+            </w:pPr>
+            <w:r>
+              <w:rPr>
+                <w:rFonts w:ascii="Times New Roman" w:hAnsi="Times New Roman" w:cs="Times New Roman"/>
+              </w:rPr>
+              <w:t>15.01.2026</w:t>
+            </w:r>
+          </w:p>
+        </w:tc>
+      </w:tr>
+      <w:tr>
+        <w:tc>
+          <w:tcPr>
+            <w:tcW w:w="3823" w:type="dxa"/>
+          </w:tcPr>
+          <w:p>
+            <w:pPr>
+              <w:jc w:val="both"/>
+              <w:rPr>
+                <w:rFonts w:ascii="Times New Roman" w:hAnsi="Times New Roman" w:cs="Times New Roman"/>
+              </w:rPr>
+            </w:pPr>
+            <w:r>
+              <w:rPr>
+                <w:rFonts w:ascii="Times New Roman" w:hAnsi="Times New Roman" w:cs="Times New Roman"/>
+              </w:rPr>
+              <w:t>Analyzing HCM Structures</w:t>
+            </w:r>
+          </w:p>
+        </w:tc>
+        <w:tc>
+          <w:tcPr>
+            <w:tcW w:w="1275" w:type="dxa"/>
+          </w:tcPr>
+          <w:p>
+            <w:pPr>
+              <w:jc w:val="both"/>
+              <w:rPr>
+                <w:rFonts w:ascii="Times New Roman" w:hAnsi="Times New Roman" w:cs="Times New Roman"/>
+              </w:rPr>
+            </w:pPr>
+            <w:r>
+              <w:rPr>
+                <w:rFonts w:ascii="Times New Roman" w:hAnsi="Times New Roman" w:cs="Times New Roman"/>
+              </w:rPr>
+              <w:t>-</w:t>
+            </w:r>
+          </w:p>
+        </w:tc>
+        <w:tc>
+          <w:tcPr>
+            <w:tcW w:w="1985" w:type="dxa"/>
+          </w:tcPr>
+          <w:p>
+            <w:pPr>
+              <w:jc w:val="both"/>
+              <w:rPr>
+                <w:rFonts w:ascii="Times New Roman" w:hAnsi="Times New Roman" w:cs="Times New Roman"/>
+              </w:rPr>
+            </w:pPr>
+            <w:r>
+              <w:rPr>
+                <w:rFonts w:ascii="Times New Roman" w:hAnsi="Times New Roman" w:cs="Times New Roman"/>
+              </w:rPr>
+              <w:t>Learning SAP</w:t>
+            </w:r>
+          </w:p>
+        </w:tc>
+        <w:tc>
+          <w:tcPr>
+            <w:tcW w:w="2267" w:type="dxa"/>
+          </w:tcPr>
+          <w:p>
+            <w:pPr>
+              <w:jc w:val="both"/>
+              <w:rPr>
+                <w:rFonts w:ascii="Times New Roman" w:hAnsi="Times New Roman" w:cs="Times New Roman"/>
+              </w:rPr>
+            </w:pPr>
+            <w:r>
+              <w:rPr>
+                <w:rFonts w:ascii="Times New Roman" w:hAnsi="Times New Roman" w:cs="Times New Roman"/>
+              </w:rPr>
+              <w:t>15.01.2026</w:t>
+            </w:r>
+          </w:p>
+        </w:tc>
+      </w:tr>
+      <w:tr>
+        <w:tc>
+          <w:tcPr>
+            <w:tcW w:w="3823" w:type="dxa"/>
+          </w:tcPr>
+          <w:p>
+            <w:pPr>
+              <w:jc w:val="both"/>
+              <w:rPr>
+                <w:rFonts w:ascii="Times New Roman" w:hAnsi="Times New Roman" w:cs="Times New Roman"/>
+              </w:rPr>
+            </w:pPr>
+            <w:r>
+              <w:rPr>
+                <w:rFonts w:ascii="Times New Roman" w:hAnsi="Times New Roman" w:cs="Times New Roman"/>
+              </w:rPr>
+              <w:t>Enhancing the Organizational Structure</w:t>
+            </w:r>
+          </w:p>
+        </w:tc>
+        <w:tc>
+          <w:tcPr>
+            <w:tcW w:w="1275" w:type="dxa"/>
+          </w:tcPr>
+          <w:p>
+            <w:pPr>
+              <w:jc w:val="both"/>
+              <w:rPr>
+                <w:rFonts w:ascii="Times New Roman" w:hAnsi="Times New Roman" w:cs="Times New Roman"/>
+              </w:rPr>
+            </w:pPr>
+            <w:r>
+              <w:rPr>
+                <w:rFonts w:ascii="Times New Roman" w:hAnsi="Times New Roman" w:cs="Times New Roman"/>
+              </w:rPr>
+              <w:t>-</w:t>
+            </w:r>
+          </w:p>
+        </w:tc>
+        <w:tc>
+          <w:tcPr>
+            <w:tcW w:w="1985" w:type="dxa"/>
+          </w:tcPr>
+          <w:p>
+            <w:pPr>
+              <w:jc w:val="both"/>
+              <w:rPr>
+                <w:rFonts w:ascii="Times New Roman" w:hAnsi="Times New Roman" w:cs="Times New Roman"/>
+              </w:rPr>
+            </w:pPr>
+            <w:r>
+              <w:rPr>
+                <w:rFonts w:ascii="Times New Roman" w:hAnsi="Times New Roman" w:cs="Times New Roman"/>
+              </w:rPr>
+              <w:t>Learning SAP</w:t>
+            </w:r>
+          </w:p>
+        </w:tc>
+        <w:tc>
+          <w:tcPr>
+            <w:tcW w:w="2267" w:type="dxa"/>
+          </w:tcPr>
+          <w:p>
+            <w:pPr>
+              <w:jc w:val="both"/>
+              <w:rPr>
+                <w:rFonts w:ascii="Times New Roman" w:hAnsi="Times New Roman" w:cs="Times New Roman"/>
+              </w:rPr>
+            </w:pPr>
+            <w:r>
+              <w:rPr>
+                <w:rFonts w:ascii="Times New Roman" w:hAnsi="Times New Roman" w:cs="Times New Roman"/>
+              </w:rPr>
+              <w:t>15.01.2026</w:t>
+            </w:r>
+          </w:p>
+        </w:tc>
+      </w:tr>
+      <w:tr>
+        <w:tc>
+          <w:tcPr>
+            <w:tcW w:w="3823" w:type="dxa"/>
+          </w:tcPr>
+          <w:p>
+            <w:pPr>
+              <w:jc w:val="both"/>
+              <w:rPr>
+                <w:rFonts w:ascii="Times New Roman" w:hAnsi="Times New Roman" w:cs="Times New Roman"/>
+              </w:rPr>
+            </w:pPr>
+            <w:r>
+              <w:rPr>
+                <w:rFonts w:ascii="Times New Roman" w:hAnsi="Times New Roman" w:cs="Times New Roman"/>
+              </w:rPr>
+              <w:t>Mastering SAP HCM Organizational Management Concepts &amp; Key Transactions PO10, PO30, Plan Versions</w:t>
+            </w:r>
+          </w:p>
+        </w:tc>
+        <w:tc>
+          <w:tcPr>
+            <w:tcW w:w="1275" w:type="dxa"/>
+          </w:tcPr>
+          <w:p>
+            <w:pPr>
+              <w:jc w:val="both"/>
+              <w:rPr>
+                <w:rFonts w:ascii="Times New Roman" w:hAnsi="Times New Roman" w:cs="Times New Roman"/>
+              </w:rPr>
+            </w:pPr>
+            <w:r>
+              <w:rPr>
+                <w:rFonts w:ascii="Times New Roman" w:hAnsi="Times New Roman" w:cs="Times New Roman"/>
+              </w:rPr>
+              <w:t>-</w:t>
+            </w:r>
+          </w:p>
+        </w:tc>
+        <w:tc>
+          <w:tcPr>
+            <w:tcW w:w="1985" w:type="dxa"/>
+          </w:tcPr>
+          <w:p>
+            <w:pPr>
+              <w:jc w:val="both"/>
+              <w:rPr>
+                <w:rFonts w:ascii="Times New Roman" w:hAnsi="Times New Roman" w:cs="Times New Roman"/>
+              </w:rPr>
+            </w:pPr>
+            <w:r>
+              <w:rPr>
+                <w:rFonts w:ascii="Times New Roman" w:hAnsi="Times New Roman" w:cs="Times New Roman"/>
+              </w:rPr>
+              <w:t>VAUSNET</w:t>
+            </w:r>
+          </w:p>
+          <w:p>
+            <w:pPr>
+              <w:jc w:val="both"/>
+              <w:rPr>
+                <w:rFonts w:ascii="Times New Roman" w:hAnsi="Times New Roman" w:cs="Times New Roman"/>
+              </w:rPr>
+            </w:pPr>
+            <w:r>
+              <w:rPr>
+                <w:rFonts w:ascii="Times New Roman" w:hAnsi="Times New Roman" w:cs="Times New Roman"/>
+              </w:rPr>
+              <w:t>SAP Expert</w:t>
+            </w:r>
+          </w:p>
+        </w:tc>
+        <w:tc>
+          <w:tcPr>
+            <w:tcW w:w="2267" w:type="dxa"/>
+          </w:tcPr>
+          <w:p>
+            <w:pPr>
+              <w:jc w:val="both"/>
+              <w:rPr>
+                <w:rFonts w:ascii="Times New Roman" w:hAnsi="Times New Roman" w:cs="Times New Roman"/>
+              </w:rPr>
+            </w:pPr>
+            <w:r>
+              <w:rPr>
+                <w:rFonts w:ascii="Times New Roman" w:hAnsi="Times New Roman" w:cs="Times New Roman"/>
+              </w:rPr>
+              <w:t>15.01.2026</w:t>
+            </w:r>
+          </w:p>
+        </w:tc>
+      </w:tr>
+      <w:tr>
+        <w:tc>
+          <w:tcPr>
+            <w:tcW w:w="3823" w:type="dxa"/>
+          </w:tcPr>
+          <w:p>
+            <w:pPr>
+              <w:jc w:val="both"/>
+              <w:rPr>
+                <w:rFonts w:ascii="Times New Roman" w:hAnsi="Times New Roman" w:cs="Times New Roman"/>
+              </w:rPr>
+            </w:pPr>
+            <w:r>
+              <w:rPr>
+                <w:rFonts w:ascii="Times New Roman" w:hAnsi="Times New Roman" w:cs="Times New Roman"/>
+              </w:rPr>
+              <w:t>SAP HR Tutorial</w:t>
+            </w:r>
+          </w:p>
+        </w:tc>
+        <w:tc>
+          <w:tcPr>
+            <w:tcW w:w="1275" w:type="dxa"/>
+          </w:tcPr>
+          <w:p>
+            <w:pPr>
+              <w:jc w:val="both"/>
+              <w:rPr>
+                <w:rFonts w:ascii="Times New Roman" w:hAnsi="Times New Roman" w:cs="Times New Roman"/>
+              </w:rPr>
+            </w:pPr>
+            <w:r>
+              <w:rPr>
+                <w:rFonts w:ascii="Times New Roman" w:hAnsi="Times New Roman" w:cs="Times New Roman"/>
+              </w:rPr>
+              <w:t>-</w:t>
+            </w:r>
+          </w:p>
+        </w:tc>
+        <w:tc>
+          <w:tcPr>
+            <w:tcW w:w="1985" w:type="dxa"/>
+          </w:tcPr>
+          <w:p>
+            <w:pPr>
+              <w:jc w:val="both"/>
+              <w:rPr>
+                <w:rFonts w:ascii="Times New Roman" w:hAnsi="Times New Roman" w:cs="Times New Roman"/>
+              </w:rPr>
+            </w:pPr>
+            <w:r>
+              <w:rPr>
+                <w:rFonts w:ascii="Times New Roman" w:hAnsi="Times New Roman" w:cs="Times New Roman"/>
+              </w:rPr>
+              <w:t>SAP Expert</w:t>
+            </w:r>
+          </w:p>
+        </w:tc>
+        <w:tc>
+          <w:tcPr>
+            <w:tcW w:w="2267" w:type="dxa"/>
+          </w:tcPr>
+          <w:p>
+            <w:pPr>
+              <w:jc w:val="both"/>
+              <w:rPr>
+                <w:rFonts w:ascii="Times New Roman" w:hAnsi="Times New Roman" w:cs="Times New Roman"/>
+              </w:rPr>
+            </w:pPr>
+            <w:r>
+              <w:rPr>
+                <w:rFonts w:ascii="Times New Roman" w:hAnsi="Times New Roman" w:cs="Times New Roman"/>
+              </w:rPr>
+              <w:t>15.01.2026</w:t>
+            </w:r>
+          </w:p>
+        </w:tc>
+      </w:tr>
+    </w:tbl>
+    <w:p>
+      <w:pPr>
+        <w:jc w:val="both"/>
+        <w:rPr>
+          <w:rFonts w:ascii="Times New Roman" w:hAnsi="Times New Roman" w:cs="Times New Roman"/>
+        </w:rPr>
+      </w:pPr>
+    </w:p>
+    <w:sdt>
+      <w:sdtPr>
+        <w:id w:val="1555344221"/>
+        <w:docPartObj>
+          <w:docPartGallery w:val="Table of Contents"/>
+          <w:docPartUnique/>
+        </w:docPartObj>
+      </w:sdtPr>
+      <w:sdtEndPr>
+        <w:rPr>
+          <w:rFonts w:asciiTheme="minorHAnsi" w:eastAsiaTheme="minorEastAsia" w:hAnsiTheme="minorHAnsi" w:cstheme="minorBidi"/>
+          <w:b/>
+          <w:bCs/>
+          <w:noProof/>
+          <w:color w:val="auto"/>
+          <w:kern w:val="2"/>
+          <w:sz w:val="24"/>
+          <w:szCs w:val="24"/>
+          <w:lang w:eastAsia="ja-JP"/>
+          <w14:ligatures w14:val="standardContextual"/>
+        </w:rPr>
+      </w:sdtEndPr>
+      <w:sdtContent>
+        <w:p>
+          <w:pPr>
+            <w:pStyle w:val="TOCHeading"/>
+            <w:rPr>
+              <w:rFonts w:ascii="Times New Roman" w:hAnsi="Times New Roman" w:cs="Times New Roman"/>
+              <w:b/>
+              <w:bCs/>
+              <w:color w:val="000000" w:themeColor="text1"/>
+            </w:rPr>
+          </w:pPr>
+          <w:r>
+            <w:rPr>
+              <w:rFonts w:ascii="Times New Roman" w:hAnsi="Times New Roman" w:cs="Times New Roman"/>
+              <w:b/>
+              <w:bCs/>
+              <w:color w:val="000000" w:themeColor="text1"/>
+            </w:rPr>
+            <w:t>Table of Contents</w:t>
+          </w:r>
+        </w:p>
+        <w:p>
+          <w:pPr>
+            <w:pStyle w:val="TOC1"/>
+            <w:tabs>
+              <w:tab w:val="left" w:pos="480"/>
+              <w:tab w:val="right" w:leader="dot" w:pos="9350"/>
+            </w:tabs>
+            <w:rPr>
+              <w:rFonts w:ascii="Times New Roman" w:hAnsi="Times New Roman" w:cs="Times New Roman"/>
+              <w:noProof/>
+            </w:rPr>
+          </w:pPr>
+          <w:r>
+            <w:rPr>
+              <w:rFonts w:ascii="Times New Roman" w:hAnsi="Times New Roman" w:cs="Times New Roman"/>
+            </w:rPr>
+            <w:fldChar w:fldCharType="begin"/>
+          </w:r>
+          <w:r>
+            <w:rPr>
+              <w:rFonts w:ascii="Times New Roman" w:hAnsi="Times New Roman" w:cs="Times New Roman"/>
+            </w:rPr>
+            <w:instrText xml:space="preserve"> TOC \o "1-3" \h \z \u </w:instrText>
+          </w:r>
+          <w:r>
+            <w:rPr>
+              <w:rFonts w:ascii="Times New Roman" w:hAnsi="Times New Roman" w:cs="Times New Roman"/>
+            </w:rPr>
+            <w:fldChar w:fldCharType="separate"/>
+          </w:r>
+          <w:hyperlink w:anchor="_Toc226556362" w:history="1">
+            <w:r>
+              <w:rPr>
+                <w:rStyle w:val="Hyperlink"/>
+                <w:rFonts w:ascii="Times New Roman" w:hAnsi="Times New Roman" w:cs="Times New Roman"/>
+                <w:b/>
+                <w:bCs/>
+                <w:noProof/>
+              </w:rPr>
+              <w:t>1</w:t>
+            </w:r>
+            <w:r>
+              <w:rPr>
+                <w:rFonts w:ascii="Times New Roman" w:hAnsi="Times New Roman" w:cs="Times New Roman"/>
+                <w:noProof/>
+              </w:rPr>
+              <w:tab/>
+            </w:r>
+            <w:r>
+              <w:rPr>
+                <w:rStyle w:val="Hyperlink"/>
+                <w:rFonts w:ascii="Times New Roman" w:hAnsi="Times New Roman" w:cs="Times New Roman"/>
+                <w:b/>
+                <w:bCs/>
+                <w:noProof/>
+              </w:rPr>
+              <w:t>Introduction</w:t>
+            </w:r>
+            <w:r>
+              <w:rPr>
+                <w:rFonts w:ascii="Times New Roman" w:hAnsi="Times New Roman" w:cs="Times New Roman"/>
+                <w:noProof/>
+                <w:webHidden/>
+              </w:rPr>
+              <w:tab/>
+            </w:r>
+            <w:r>
+              <w:rPr>
+                <w:rFonts w:ascii="Times New Roman" w:hAnsi="Times New Roman" w:cs="Times New Roman"/>
+                <w:noProof/>
+                <w:webHidden/>
+              </w:rPr>
+              <w:fldChar w:fldCharType="begin"/>
+            </w:r>
+            <w:r>
+              <w:rPr>
+                <w:rFonts w:ascii="Times New Roman" w:hAnsi="Times New Roman" w:cs="Times New Roman"/>
+                <w:noProof/>
+                <w:webHidden/>
+              </w:rPr>
+              <w:instrText xml:space="preserve"> PAGEREF _Toc226556362 \h </w:instrText>
+            </w:r>
+            <w:r>
+              <w:rPr>
+                <w:rFonts w:ascii="Times New Roman" w:hAnsi="Times New Roman" w:cs="Times New Roman"/>
+                <w:noProof/>
+                <w:webHidden/>
+              </w:rPr>
+            </w:r>
+            <w:r>
+              <w:rPr>
+                <w:rFonts w:ascii="Times New Roman" w:hAnsi="Times New Roman" w:cs="Times New Roman"/>
+                <w:noProof/>
+                <w:webHidden/>
+              </w:rPr>
+              <w:fldChar w:fldCharType="separate"/>
+            </w:r>
+            <w:r>
+              <w:rPr>
+                <w:rFonts w:ascii="Times New Roman" w:hAnsi="Times New Roman" w:cs="Times New Roman"/>
+                <w:noProof/>
+                <w:webHidden/>
+              </w:rPr>
+              <w:t>3</w:t>
+            </w:r>
+            <w:r>
+              <w:rPr>
+                <w:rFonts w:ascii="Times New Roman" w:hAnsi="Times New Roman" w:cs="Times New Roman"/>
+                <w:noProof/>
+                <w:webHidden/>
+              </w:rPr>
+              <w:fldChar w:fldCharType="end"/>
+            </w:r>
+          </w:hyperlink>
+        </w:p>
+        <w:p>
+          <w:pPr>
+            <w:pStyle w:val="TOC1"/>
+            <w:tabs>
+              <w:tab w:val="left" w:pos="480"/>
+              <w:tab w:val="right" w:leader="dot" w:pos="9350"/>
+            </w:tabs>
+            <w:rPr>
+              <w:rFonts w:ascii="Times New Roman" w:hAnsi="Times New Roman" w:cs="Times New Roman"/>
+              <w:noProof/>
+            </w:rPr>
+          </w:pPr>
+          <w:hyperlink w:anchor="_Toc226556363" w:history="1">
+            <w:r>
+              <w:rPr>
+                <w:rStyle w:val="Hyperlink"/>
+                <w:rFonts w:ascii="Times New Roman" w:hAnsi="Times New Roman" w:cs="Times New Roman"/>
+                <w:b/>
+                <w:bCs/>
+                <w:noProof/>
+              </w:rPr>
+              <w:t>2</w:t>
+            </w:r>
+            <w:r>
+              <w:rPr>
+                <w:rFonts w:ascii="Times New Roman" w:hAnsi="Times New Roman" w:cs="Times New Roman"/>
+                <w:noProof/>
+              </w:rPr>
+              <w:tab/>
+            </w:r>
+            <w:r>
+              <w:rPr>
+                <w:rStyle w:val="Hyperlink"/>
+                <w:rFonts w:ascii="Times New Roman" w:hAnsi="Times New Roman" w:cs="Times New Roman"/>
+                <w:b/>
+                <w:bCs/>
+                <w:noProof/>
+              </w:rPr>
+              <w:t>Problem/Impact/Successful Outcome</w:t>
+            </w:r>
+            <w:r>
+              <w:rPr>
+                <w:rFonts w:ascii="Times New Roman" w:hAnsi="Times New Roman" w:cs="Times New Roman"/>
+                <w:noProof/>
+                <w:webHidden/>
+              </w:rPr>
+              <w:tab/>
+            </w:r>
+            <w:r>
+              <w:rPr>
+                <w:rFonts w:ascii="Times New Roman" w:hAnsi="Times New Roman" w:cs="Times New Roman"/>
+                <w:noProof/>
+                <w:webHidden/>
+              </w:rPr>
+              <w:fldChar w:fldCharType="begin"/>
+            </w:r>
+            <w:r>
+              <w:rPr>
+                <w:rFonts w:ascii="Times New Roman" w:hAnsi="Times New Roman" w:cs="Times New Roman"/>
+                <w:noProof/>
+                <w:webHidden/>
+              </w:rPr>
+              <w:instrText xml:space="preserve"> PAGEREF _Toc226556363 \h </w:instrText>
+            </w:r>
+            <w:r>
+              <w:rPr>
+                <w:rFonts w:ascii="Times New Roman" w:hAnsi="Times New Roman" w:cs="Times New Roman"/>
+                <w:noProof/>
+                <w:webHidden/>
+              </w:rPr>
+            </w:r>
+            <w:r>
+              <w:rPr>
+                <w:rFonts w:ascii="Times New Roman" w:hAnsi="Times New Roman" w:cs="Times New Roman"/>
+                <w:noProof/>
+                <w:webHidden/>
+              </w:rPr>
+              <w:fldChar w:fldCharType="separate"/>
+            </w:r>
+            <w:r>
+              <w:rPr>
+                <w:rFonts w:ascii="Times New Roman" w:hAnsi="Times New Roman" w:cs="Times New Roman"/>
+                <w:noProof/>
+                <w:webHidden/>
+              </w:rPr>
+              <w:t>3</w:t>
+            </w:r>
+            <w:r>
+              <w:rPr>
+                <w:rFonts w:ascii="Times New Roman" w:hAnsi="Times New Roman" w:cs="Times New Roman"/>
+                <w:noProof/>
+                <w:webHidden/>
+              </w:rPr>
+              <w:fldChar w:fldCharType="end"/>
+            </w:r>
+          </w:hyperlink>
+        </w:p>
+        <w:p>
+          <w:r>
+            <w:rPr>
+              <w:rFonts w:ascii="Times New Roman" w:hAnsi="Times New Roman" w:cs="Times New Roman"/>
+              <w:b/>
+              <w:bCs/>
+              <w:noProof/>
+            </w:rPr>
+            <w:fldChar w:fldCharType="end"/>
+          </w:r>
+        </w:p>
+      </w:sdtContent>
+    </w:sdt>
+    <w:p>
+      <w:pPr>
+        <w:jc w:val="both"/>
+        <w:rPr>
+          <w:rFonts w:ascii="Times New Roman" w:hAnsi="Times New Roman" w:cs="Times New Roman"/>
+          <w:b/>
+          <w:bCs/>
+          <w:sz w:val="32"/>
+          <w:szCs w:val="32"/>
+        </w:rPr>
+      </w:pPr>
+    </w:p>
+    <w:p>
+      <w:pPr>
+        <w:jc w:val="both"/>
+        <w:rPr>
+          <w:rFonts w:ascii="Times New Roman" w:hAnsi="Times New Roman" w:cs="Times New Roman"/>
+          <w:b/>
+          <w:bCs/>
+          <w:sz w:val="32"/>
+          <w:szCs w:val="32"/>
+        </w:rPr>
+      </w:pPr>
+    </w:p>
+    <w:p>
+      <w:pPr>
+        <w:jc w:val="both"/>
+        <w:rPr>
+          <w:rFonts w:ascii="Times New Roman" w:hAnsi="Times New Roman" w:cs="Times New Roman"/>
+        </w:rPr>
+      </w:pPr>
+    </w:p>
+    <w:p>
+      <w:pPr>
+        <w:jc w:val="both"/>
+        <w:rPr>
+          <w:rFonts w:ascii="Times New Roman" w:hAnsi="Times New Roman" w:cs="Times New Roman"/>
+        </w:rPr>
+      </w:pPr>
+    </w:p>
+    <w:p>
+      <w:pPr>
+        <w:jc w:val="both"/>
+        <w:rPr>
+          <w:rFonts w:ascii="Times New Roman" w:hAnsi="Times New Roman" w:cs="Times New Roman"/>
+        </w:rPr>
+      </w:pPr>
+    </w:p>
+    <w:p>
+      <w:pPr>
+        <w:jc w:val="both"/>
+        <w:rPr>
+          <w:rFonts w:ascii="Times New Roman" w:hAnsi="Times New Roman" w:cs="Times New Roman"/>
+        </w:rPr>
+      </w:pPr>
+    </w:p>
+    <w:p>
+      <w:pPr>
+        <w:jc w:val="both"/>
+        <w:rPr>
+          <w:rFonts w:ascii="Times New Roman" w:hAnsi="Times New Roman" w:cs="Times New Roman"/>
+        </w:rPr>
+      </w:pPr>
+    </w:p>
+    <w:p>
+      <w:pPr>
+        <w:jc w:val="both"/>
+        <w:rPr>
+          <w:rFonts w:ascii="Times New Roman" w:hAnsi="Times New Roman" w:cs="Times New Roman"/>
+        </w:rPr>
+      </w:pPr>
+    </w:p>
+    <w:p>
+      <w:pPr>
+        <w:jc w:val="both"/>
+        <w:rPr>
+          <w:rFonts w:ascii="Times New Roman" w:hAnsi="Times New Roman" w:cs="Times New Roman"/>
+        </w:rPr>
+      </w:pPr>
+    </w:p>
+    <w:p>
+      <w:pPr>
+        <w:jc w:val="both"/>
+        <w:rPr>
+          <w:rFonts w:ascii="Times New Roman" w:hAnsi="Times New Roman" w:cs="Times New Roman"/>
+        </w:rPr>
+      </w:pPr>
+    </w:p>
+    <w:p>
+      <w:pPr>
+        <w:jc w:val="both"/>
+        <w:rPr>
+          <w:rFonts w:ascii="Times New Roman" w:hAnsi="Times New Roman" w:cs="Times New Roman"/>
+        </w:rPr>
+      </w:pPr>
+    </w:p>
+    <w:p>
+      <w:pPr>
+        <w:jc w:val="both"/>
+        <w:rPr>
+          <w:rFonts w:ascii="Times New Roman" w:hAnsi="Times New Roman" w:cs="Times New Roman"/>
+        </w:rPr>
+      </w:pPr>
+    </w:p>
+    <w:p>
+      <w:pPr>
+        <w:jc w:val="both"/>
+        <w:rPr>
+          <w:rFonts w:ascii="Times New Roman" w:hAnsi="Times New Roman" w:cs="Times New Roman"/>
+        </w:rPr>
+      </w:pPr>
+    </w:p>
+    <w:p>
+      <w:pPr>
+        <w:jc w:val="both"/>
+        <w:rPr>
+          <w:rFonts w:ascii="Times New Roman" w:hAnsi="Times New Roman" w:cs="Times New Roman"/>
+        </w:rPr>
+      </w:pPr>
+    </w:p>
+    <w:p>
+      <w:pPr>
+        <w:jc w:val="both"/>
+        <w:rPr>
+          <w:rFonts w:ascii="Times New Roman" w:hAnsi="Times New Roman" w:cs="Times New Roman"/>
+        </w:rPr>
+      </w:pPr>
+    </w:p>
+    <w:p>
+      <w:pPr>
+        <w:jc w:val="both"/>
+        <w:rPr>
+          <w:rFonts w:ascii="Times New Roman" w:hAnsi="Times New Roman" w:cs="Times New Roman"/>
+        </w:rPr>
+      </w:pPr>
+    </w:p>
+    <w:p>
+      <w:pPr>
+        <w:jc w:val="both"/>
+        <w:rPr>
+          <w:rFonts w:ascii="Times New Roman" w:hAnsi="Times New Roman" w:cs="Times New Roman"/>
+        </w:rPr>
+      </w:pPr>
+    </w:p>
+    <w:p>
+      <w:pPr>
+        <w:jc w:val="both"/>
+        <w:rPr>
+          <w:rFonts w:ascii="Times New Roman" w:hAnsi="Times New Roman" w:cs="Times New Roman"/>
+        </w:rPr>
+      </w:pPr>
+    </w:p>
+    <w:p>
+      <w:pPr>
+        <w:jc w:val="both"/>
+        <w:rPr>
+          <w:rFonts w:ascii="Times New Roman" w:hAnsi="Times New Roman" w:cs="Times New Roman"/>
+        </w:rPr>
+      </w:pPr>
+    </w:p>
+    <w:p>
+      <w:pPr>
+        <w:pStyle w:val="Heading1"/>
+        <w:rPr>
+          <w:rFonts w:ascii="Times New Roman" w:hAnsi="Times New Roman" w:cs="Times New Roman"/>
+          <w:b/>
+          <w:bCs/>
+          <w:color w:val="000000" w:themeColor="text1"/>
+          <w:sz w:val="28"/>
+          <w:szCs w:val="28"/>
+        </w:rPr>
+      </w:pPr>
+      <w:bookmarkStart w:id="0" w:name="_Toc226556362"/>
+      <w:r>
+        <w:rPr>
+          <w:rFonts w:ascii="Times New Roman" w:hAnsi="Times New Roman" w:cs="Times New Roman"/>
+          <w:b/>
+          <w:bCs/>
+          <w:color w:val="000000" w:themeColor="text1"/>
+          <w:sz w:val="28"/>
+          <w:szCs w:val="28"/>
+        </w:rPr>
+        <w:t>1</w:t>
+      </w:r>
+      <w:r>
+        <w:rPr>
+          <w:rFonts w:ascii="Times New Roman" w:hAnsi="Times New Roman" w:cs="Times New Roman"/>
+          <w:b/>
+          <w:bCs/>
+          <w:color w:val="000000" w:themeColor="text1"/>
+          <w:sz w:val="28"/>
+          <w:szCs w:val="28"/>
+        </w:rPr>
+        <w:tab/>
+        <w:t>Introduction</w:t>
+      </w:r>
+      <w:bookmarkEnd w:id="0"/>
+    </w:p>
+    <w:p>
+      <w:pPr>
+        <w:pStyle w:val="BodyText"/>
+      </w:pPr>
+      <w:r>
+        <w:t xml:space="preserve">The “Work </w:t>
+      </w:r>
+      <w:r>
+        <w:t xml:space="preserve">Calendar </w:t>
+      </w:r>
+      <w:r>
+        <w:t>Management</w:t>
+      </w:r>
+      <w:r>
+        <w:t xml:space="preserve"> by Department in ERP Systems</w:t>
+      </w:r>
+      <w:r>
+        <w:t xml:space="preserve">” project was established to address the specific needs of time management in companies using the SAP system. </w:t>
+      </w:r>
+    </w:p>
+    <w:p>
+      <w:pPr>
+        <w:jc w:val="both"/>
+        <w:rPr>
+          <w:rFonts w:ascii="Times New Roman" w:hAnsi="Times New Roman" w:cs="Times New Roman"/>
+        </w:rPr>
+      </w:pPr>
+      <w:r>
+        <w:rPr>
+          <w:rFonts w:ascii="Times New Roman" w:hAnsi="Times New Roman" w:cs="Times New Roman"/>
+        </w:rPr>
+        <w:t xml:space="preserve">Within the HCM (Human Capital Management) module, maintaining an accurate and flexible work schedule tailored to each organizational unit is the foundation for payroll processing, absence management, and resource optimization. </w:t>
+      </w:r>
+    </w:p>
+    <w:p>
+      <w:pPr>
+        <w:jc w:val="both"/>
+        <w:rPr>
+          <w:rFonts w:ascii="Times New Roman" w:hAnsi="Times New Roman" w:cs="Times New Roman"/>
+        </w:rPr>
+      </w:pPr>
+      <w:r>
+        <w:rPr>
+          <w:rFonts w:ascii="Times New Roman" w:hAnsi="Times New Roman" w:cs="Times New Roman"/>
+        </w:rPr>
+        <w:t xml:space="preserve">This project focuses on developing a custom tool on the ABAP platform, utilizing hybrid interface technology (SMW0 &amp; SM30) to provide a user-friendly experience while ensuring the stability and security of the core ERP system. </w:t>
+      </w:r>
+    </w:p>
+    <w:p>
+      <w:pPr>
+        <w:jc w:val="both"/>
+        <w:rPr>
+          <w:rFonts w:ascii="Times New Roman" w:hAnsi="Times New Roman" w:cs="Times New Roman"/>
+          <w:b/>
+          <w:bCs/>
+          <w:sz w:val="28"/>
+          <w:szCs w:val="28"/>
+        </w:rPr>
+      </w:pPr>
+    </w:p>
+    <w:p>
+      <w:pPr>
+        <w:pStyle w:val="Heading1"/>
+        <w:rPr>
+          <w:rFonts w:ascii="Times New Roman" w:hAnsi="Times New Roman" w:cs="Times New Roman"/>
+          <w:b/>
+          <w:bCs/>
+          <w:color w:val="000000" w:themeColor="text1"/>
+          <w:sz w:val="28"/>
+          <w:szCs w:val="28"/>
+        </w:rPr>
+      </w:pPr>
+      <w:bookmarkStart w:id="1" w:name="_Toc226556363"/>
+      <w:r>
+        <w:rPr>
+          <w:rFonts w:ascii="Times New Roman" w:hAnsi="Times New Roman" w:cs="Times New Roman"/>
+          <w:b/>
+          <w:bCs/>
+          <w:color w:val="000000" w:themeColor="text1"/>
+          <w:sz w:val="28"/>
+          <w:szCs w:val="28"/>
+        </w:rPr>
+        <w:t>2</w:t>
+      </w:r>
+      <w:r>
+        <w:rPr>
+          <w:rFonts w:ascii="Times New Roman" w:hAnsi="Times New Roman" w:cs="Times New Roman"/>
+          <w:b/>
+          <w:bCs/>
+          <w:color w:val="000000" w:themeColor="text1"/>
+          <w:sz w:val="28"/>
+          <w:szCs w:val="28"/>
+        </w:rPr>
+        <w:tab/>
+        <w:t>Problem/Impact/Successful Outcome</w:t>
+      </w:r>
+      <w:bookmarkEnd w:id="1"/>
     </w:p>
     <w:sectPr>
+      <w:headerReference w:type="first" r:id="rId13"/>
+      <w:footerReference w:type="first" r:id="rId14"/>
       <w:pgSz w:w="12240" w:h="15840"/>
-      <w:pgMar w:top="1440" w:right="1440" w:bottom="1440" w:left="1440" w:header="708" w:footer="708" w:gutter="0"/>
+      <w:pgMar w:top="1440" w:right="1440" w:bottom="1440" w:left="1440" w:header="709" w:footer="709" w:gutter="0"/>
+      <w:pgNumType w:start="1"/>
       <w:cols w:space="708"/>
+      <w:titlePg/>
       <w:docGrid w:linePitch="360"/>
     </w:sectPr>
   </w:body>
 </w:document>
+</file>
+
+<file path=word/endnotes.xml><?xml version="1.0" encoding="utf-8"?>
+<w:endnotes xmlns:wpc="http://schemas.microsoft.com/office/word/2010/wordprocessingCanvas" xmlns:cx="http://schemas.microsoft.com/office/drawing/2014/chartex" xmlns:cx1="http://schemas.microsoft.com/office/drawing/2015/9/8/chartex" xmlns:cx2="http://schemas.microsoft.com/office/drawing/2015/10/21/chartex" xmlns:cx3="http://schemas.microsoft.com/office/drawing/2016/5/9/chartex" xmlns:cx4="http://schemas.microsoft.com/office/drawing/2016/5/10/chartex" xmlns:cx5="http://schemas.microsoft.com/office/drawing/2016/5/11/chartex" xmlns:cx6="http://schemas.microsoft.com/office/drawing/2016/5/12/chartex" xmlns:cx7="http://schemas.microsoft.com/office/drawing/2016/5/13/chartex" xmlns:cx8="http://schemas.microsoft.com/office/drawing/2016/5/14/chartex" xmlns:mc="http://schemas.openxmlformats.org/markup-compatibility/2006" xmlns:aink="http://schemas.microsoft.com/office/drawing/2016/ink" xmlns:am3d="http://schemas.microsoft.com/office/drawing/2017/model3d" xmlns:o="urn:schemas-microsoft-com:office:office" xmlns:oel="http://schemas.microsoft.com/office/2019/extlst" xmlns:r="http://schemas.openxmlformats.org/officeDocument/2006/relationships" xmlns:m="http://schemas.openxmlformats.org/officeDocument/2006/math" xmlns:v="urn:schemas-microsoft-com:vml" xmlns:wp14="http://schemas.microsoft.com/office/word/2010/wordprocessingDrawing" xmlns:wp="http://schemas.openxmlformats.org/drawingml/2006/wordprocessingDrawing" xmlns:w10="urn:schemas-microsoft-com:office:word" xmlns:w="http://schemas.openxmlformats.org/wordprocessingml/2006/main" xmlns:w14="http://schemas.microsoft.com/office/word/2010/wordml" xmlns:w15="http://schemas.microsoft.com/office/word/2012/wordml" xmlns:w16cex="http://schemas.microsoft.com/office/word/2018/wordml/cex" xmlns:w16cid="http://schemas.microsoft.com/office/word/2016/wordml/cid" xmlns:w16="http://schemas.microsoft.com/office/word/2018/wordml" xmlns:w16du="http://schemas.microsoft.com/office/word/2023/wordml/word16du" xmlns:w16sdtdh="http://schemas.microsoft.com/office/word/2020/wordml/sdtdatahash" xmlns:w16sdtfl="http://schemas.microsoft.com/office/word/2024/wordml/sdtformatlock" xmlns:w16se="http://schemas.microsoft.com/office/word/2015/wordml/symex" xmlns:wpg="http://schemas.microsoft.com/office/word/2010/wordprocessingGroup" xmlns:wpi="http://schemas.microsoft.com/office/word/2010/wordprocessingInk" xmlns:wne="http://schemas.microsoft.com/office/word/2006/wordml" xmlns:wps="http://schemas.microsoft.com/office/word/2010/wordprocessingShape" mc:Ignorable="w14 w15 w16se w16cid w16 w16cex w16sdtdh w16sdtfl w16du wp14">
+  <w:endnote w:type="separator" w:id="-1">
+    <w:p>
+      <w:pPr>
+        <w:spacing w:after="0" w:line="240" w:lineRule="auto"/>
+      </w:pPr>
+      <w:r>
+        <w:separator/>
+      </w:r>
+    </w:p>
+  </w:endnote>
+  <w:endnote w:type="continuationSeparator" w:id="0">
+    <w:p>
+      <w:pPr>
+        <w:spacing w:after="0" w:line="240" w:lineRule="auto"/>
+      </w:pPr>
+      <w:r>
+        <w:continuationSeparator/>
+      </w:r>
+    </w:p>
+  </w:endnote>
+</w:endnotes>
+</file>
+
+<file path=word/footer1.xml><?xml version="1.0" encoding="utf-8"?>
+<w:ftr xmlns:wpc="http://schemas.microsoft.com/office/word/2010/wordprocessingCanvas" xmlns:cx="http://schemas.microsoft.com/office/drawing/2014/chartex" xmlns:cx1="http://schemas.microsoft.com/office/drawing/2015/9/8/chartex" xmlns:cx2="http://schemas.microsoft.com/office/drawing/2015/10/21/chartex" xmlns:cx3="http://schemas.microsoft.com/office/drawing/2016/5/9/chartex" xmlns:cx4="http://schemas.microsoft.com/office/drawing/2016/5/10/chartex" xmlns:cx5="http://schemas.microsoft.com/office/drawing/2016/5/11/chartex" xmlns:cx6="http://schemas.microsoft.com/office/drawing/2016/5/12/chartex" xmlns:cx7="http://schemas.microsoft.com/office/drawing/2016/5/13/chartex" xmlns:cx8="http://schemas.microsoft.com/office/drawing/2016/5/14/chartex" xmlns:mc="http://schemas.openxmlformats.org/markup-compatibility/2006" xmlns:aink="http://schemas.microsoft.com/office/drawing/2016/ink" xmlns:am3d="http://schemas.microsoft.com/office/drawing/2017/model3d" xmlns:o="urn:schemas-microsoft-com:office:office" xmlns:oel="http://schemas.microsoft.com/office/2019/extlst" xmlns:r="http://schemas.openxmlformats.org/officeDocument/2006/relationships" xmlns:m="http://schemas.openxmlformats.org/officeDocument/2006/math" xmlns:v="urn:schemas-microsoft-com:vml" xmlns:wp14="http://schemas.microsoft.com/office/word/2010/wordprocessingDrawing" xmlns:wp="http://schemas.openxmlformats.org/drawingml/2006/wordprocessingDrawing" xmlns:w10="urn:schemas-microsoft-com:office:word" xmlns:w="http://schemas.openxmlformats.org/wordprocessingml/2006/main" xmlns:w14="http://schemas.microsoft.com/office/word/2010/wordml" xmlns:w15="http://schemas.microsoft.com/office/word/2012/wordml" xmlns:w16cex="http://schemas.microsoft.com/office/word/2018/wordml/cex" xmlns:w16cid="http://schemas.microsoft.com/office/word/2016/wordml/cid" xmlns:w16="http://schemas.microsoft.com/office/word/2018/wordml" xmlns:w16du="http://schemas.microsoft.com/office/word/2023/wordml/word16du" xmlns:w16sdtdh="http://schemas.microsoft.com/office/word/2020/wordml/sdtdatahash" xmlns:w16sdtfl="http://schemas.microsoft.com/office/word/2024/wordml/sdtformatlock" xmlns:w16se="http://schemas.microsoft.com/office/word/2015/wordml/symex" xmlns:wpg="http://schemas.microsoft.com/office/word/2010/wordprocessingGroup" xmlns:wpi="http://schemas.microsoft.com/office/word/2010/wordprocessingInk" xmlns:wne="http://schemas.microsoft.com/office/word/2006/wordml" xmlns:wps="http://schemas.microsoft.com/office/word/2010/wordprocessingShape" mc:Ignorable="w14 w15 w16se w16cid w16 w16cex w16sdtdh w16sdtfl w16du wp14">
+  <w:p>
+    <w:pPr>
+      <w:pStyle w:val="Footer"/>
+      <w:rPr>
+        <w:rFonts w:ascii="Times New Roman" w:hAnsi="Times New Roman" w:cs="Times New Roman"/>
+        <w:sz w:val="22"/>
+        <w:szCs w:val="22"/>
+      </w:rPr>
+    </w:pPr>
+    <w:r>
+      <w:rPr>
+        <w:rFonts w:ascii="Times New Roman" w:hAnsi="Times New Roman" w:cs="Times New Roman"/>
+        <w:sz w:val="22"/>
+        <w:szCs w:val="22"/>
+      </w:rPr>
+      <w:t>Status: Draft For Approval</w:t>
+    </w:r>
+  </w:p>
+  <w:p>
+    <w:pPr>
+      <w:pStyle w:val="Footer"/>
+      <w:rPr>
+        <w:rFonts w:ascii="Times New Roman" w:hAnsi="Times New Roman" w:cs="Times New Roman"/>
+        <w:sz w:val="22"/>
+        <w:szCs w:val="22"/>
+      </w:rPr>
+    </w:pPr>
+    <w:r>
+      <w:rPr>
+        <w:rFonts w:ascii="Times New Roman" w:hAnsi="Times New Roman" w:cs="Times New Roman"/>
+        <w:sz w:val="22"/>
+        <w:szCs w:val="22"/>
+      </w:rPr>
+      <w:tab/>
+    </w:r>
+  </w:p>
+  <w:p>
+    <w:pPr>
+      <w:pStyle w:val="Footer"/>
+      <w:rPr>
+        <w:rFonts w:ascii="Times New Roman" w:hAnsi="Times New Roman" w:cs="Times New Roman"/>
+        <w:sz w:val="22"/>
+        <w:szCs w:val="22"/>
+      </w:rPr>
+    </w:pPr>
+    <w:r>
+      <w:rPr>
+        <w:rFonts w:ascii="Times New Roman" w:hAnsi="Times New Roman" w:cs="Times New Roman"/>
+        <w:sz w:val="22"/>
+        <w:szCs w:val="22"/>
+      </w:rPr>
+      <w:tab/>
+    </w:r>
+    <w:r>
+      <w:rPr>
+        <w:rFonts w:ascii="Times New Roman" w:hAnsi="Times New Roman" w:cs="Times New Roman"/>
+        <w:sz w:val="22"/>
+        <w:szCs w:val="22"/>
+      </w:rPr>
+      <w:fldChar w:fldCharType="begin"/>
+    </w:r>
+    <w:r>
+      <w:rPr>
+        <w:rFonts w:ascii="Times New Roman" w:hAnsi="Times New Roman" w:cs="Times New Roman"/>
+        <w:sz w:val="22"/>
+        <w:szCs w:val="22"/>
+      </w:rPr>
+      <w:instrText xml:space="preserve"> PAGE   \* MERGEFORMAT </w:instrText>
+    </w:r>
+    <w:r>
+      <w:rPr>
+        <w:rFonts w:ascii="Times New Roman" w:hAnsi="Times New Roman" w:cs="Times New Roman"/>
+        <w:sz w:val="22"/>
+        <w:szCs w:val="22"/>
+      </w:rPr>
+      <w:fldChar w:fldCharType="separate"/>
+    </w:r>
+    <w:r>
+      <w:rPr>
+        <w:rFonts w:ascii="Times New Roman" w:hAnsi="Times New Roman" w:cs="Times New Roman"/>
+        <w:noProof/>
+        <w:sz w:val="22"/>
+        <w:szCs w:val="22"/>
+      </w:rPr>
+      <w:t>1</w:t>
+    </w:r>
+    <w:r>
+      <w:rPr>
+        <w:rFonts w:ascii="Times New Roman" w:hAnsi="Times New Roman" w:cs="Times New Roman"/>
+        <w:noProof/>
+        <w:sz w:val="22"/>
+        <w:szCs w:val="22"/>
+      </w:rPr>
+      <w:fldChar w:fldCharType="end"/>
+    </w:r>
+  </w:p>
+</w:ftr>
+</file>
+
+<file path=word/footer2.xml><?xml version="1.0" encoding="utf-8"?>
+<w:ftr xmlns:wpc="http://schemas.microsoft.com/office/word/2010/wordprocessingCanvas" xmlns:cx="http://schemas.microsoft.com/office/drawing/2014/chartex" xmlns:cx1="http://schemas.microsoft.com/office/drawing/2015/9/8/chartex" xmlns:cx2="http://schemas.microsoft.com/office/drawing/2015/10/21/chartex" xmlns:cx3="http://schemas.microsoft.com/office/drawing/2016/5/9/chartex" xmlns:cx4="http://schemas.microsoft.com/office/drawing/2016/5/10/chartex" xmlns:cx5="http://schemas.microsoft.com/office/drawing/2016/5/11/chartex" xmlns:cx6="http://schemas.microsoft.com/office/drawing/2016/5/12/chartex" xmlns:cx7="http://schemas.microsoft.com/office/drawing/2016/5/13/chartex" xmlns:cx8="http://schemas.microsoft.com/office/drawing/2016/5/14/chartex" xmlns:mc="http://schemas.openxmlformats.org/markup-compatibility/2006" xmlns:aink="http://schemas.microsoft.com/office/drawing/2016/ink" xmlns:am3d="http://schemas.microsoft.com/office/drawing/2017/model3d" xmlns:o="urn:schemas-microsoft-com:office:office" xmlns:oel="http://schemas.microsoft.com/office/2019/extlst" xmlns:r="http://schemas.openxmlformats.org/officeDocument/2006/relationships" xmlns:m="http://schemas.openxmlformats.org/officeDocument/2006/math" xmlns:v="urn:schemas-microsoft-com:vml" xmlns:wp14="http://schemas.microsoft.com/office/word/2010/wordprocessingDrawing" xmlns:wp="http://schemas.openxmlformats.org/drawingml/2006/wordprocessingDrawing" xmlns:w10="urn:schemas-microsoft-com:office:word" xmlns:w="http://schemas.openxmlformats.org/wordprocessingml/2006/main" xmlns:w14="http://schemas.microsoft.com/office/word/2010/wordml" xmlns:w15="http://schemas.microsoft.com/office/word/2012/wordml" xmlns:w16cex="http://schemas.microsoft.com/office/word/2018/wordml/cex" xmlns:w16cid="http://schemas.microsoft.com/office/word/2016/wordml/cid" xmlns:w16="http://schemas.microsoft.com/office/word/2018/wordml" xmlns:w16du="http://schemas.microsoft.com/office/word/2023/wordml/word16du" xmlns:w16sdtdh="http://schemas.microsoft.com/office/word/2020/wordml/sdtdatahash" xmlns:w16sdtfl="http://schemas.microsoft.com/office/word/2024/wordml/sdtformatlock" xmlns:w16se="http://schemas.microsoft.com/office/word/2015/wordml/symex" xmlns:wpg="http://schemas.microsoft.com/office/word/2010/wordprocessingGroup" xmlns:wpi="http://schemas.microsoft.com/office/word/2010/wordprocessingInk" xmlns:wne="http://schemas.microsoft.com/office/word/2006/wordml" xmlns:wps="http://schemas.microsoft.com/office/word/2010/wordprocessingShape" mc:Ignorable="w14 w15 w16se w16cid w16 w16cex w16sdtdh w16sdtfl w16du wp14">
+  <w:p>
+    <w:pPr>
+      <w:pStyle w:val="Footer"/>
+      <w:rPr>
+        <w:rFonts w:ascii="Times New Roman" w:hAnsi="Times New Roman" w:cs="Times New Roman"/>
+        <w:sz w:val="22"/>
+        <w:szCs w:val="22"/>
+      </w:rPr>
+    </w:pPr>
+    <w:r>
+      <w:rPr>
+        <w:rFonts w:ascii="Times New Roman" w:hAnsi="Times New Roman" w:cs="Times New Roman"/>
+        <w:sz w:val="22"/>
+        <w:szCs w:val="22"/>
+      </w:rPr>
+      <w:t>Status: Draft For Approval</w:t>
+    </w:r>
+  </w:p>
+  <w:p>
+    <w:pPr>
+      <w:pStyle w:val="Footer"/>
+      <w:rPr>
+        <w:rFonts w:ascii="Times New Roman" w:hAnsi="Times New Roman" w:cs="Times New Roman"/>
+        <w:sz w:val="22"/>
+        <w:szCs w:val="22"/>
+      </w:rPr>
+    </w:pPr>
+    <w:r>
+      <w:rPr>
+        <w:rFonts w:ascii="Times New Roman" w:hAnsi="Times New Roman" w:cs="Times New Roman"/>
+        <w:sz w:val="22"/>
+        <w:szCs w:val="22"/>
+      </w:rPr>
+      <w:tab/>
+    </w:r>
+    <w:r>
+      <w:rPr>
+        <w:rFonts w:ascii="Times New Roman" w:hAnsi="Times New Roman" w:cs="Times New Roman"/>
+        <w:sz w:val="22"/>
+        <w:szCs w:val="22"/>
+      </w:rPr>
+      <w:fldChar w:fldCharType="begin"/>
+    </w:r>
+    <w:r>
+      <w:rPr>
+        <w:rFonts w:ascii="Times New Roman" w:hAnsi="Times New Roman" w:cs="Times New Roman"/>
+        <w:sz w:val="22"/>
+        <w:szCs w:val="22"/>
+      </w:rPr>
+      <w:instrText xml:space="preserve"> PAGE   \* MERGEFORMAT </w:instrText>
+    </w:r>
+    <w:r>
+      <w:rPr>
+        <w:rFonts w:ascii="Times New Roman" w:hAnsi="Times New Roman" w:cs="Times New Roman"/>
+        <w:sz w:val="22"/>
+        <w:szCs w:val="22"/>
+      </w:rPr>
+      <w:fldChar w:fldCharType="separate"/>
+    </w:r>
+    <w:r>
+      <w:rPr>
+        <w:rFonts w:ascii="Times New Roman" w:hAnsi="Times New Roman" w:cs="Times New Roman"/>
+        <w:noProof/>
+        <w:sz w:val="22"/>
+        <w:szCs w:val="22"/>
+      </w:rPr>
+      <w:t>1</w:t>
+    </w:r>
+    <w:r>
+      <w:rPr>
+        <w:rFonts w:ascii="Times New Roman" w:hAnsi="Times New Roman" w:cs="Times New Roman"/>
+        <w:noProof/>
+        <w:sz w:val="22"/>
+        <w:szCs w:val="22"/>
+      </w:rPr>
+      <w:fldChar w:fldCharType="end"/>
+    </w:r>
+  </w:p>
+  <w:p>
+    <w:pPr>
+      <w:pStyle w:val="Footer"/>
+      <w:rPr>
+        <w:rFonts w:ascii="Times New Roman" w:hAnsi="Times New Roman" w:cs="Times New Roman"/>
+        <w:sz w:val="22"/>
+        <w:szCs w:val="22"/>
+      </w:rPr>
+    </w:pPr>
+  </w:p>
+</w:ftr>
+</file>
+
+<file path=word/footnotes.xml><?xml version="1.0" encoding="utf-8"?>
+<w:footnotes xmlns:wpc="http://schemas.microsoft.com/office/word/2010/wordprocessingCanvas" xmlns:cx="http://schemas.microsoft.com/office/drawing/2014/chartex" xmlns:cx1="http://schemas.microsoft.com/office/drawing/2015/9/8/chartex" xmlns:cx2="http://schemas.microsoft.com/office/drawing/2015/10/21/chartex" xmlns:cx3="http://schemas.microsoft.com/office/drawing/2016/5/9/chartex" xmlns:cx4="http://schemas.microsoft.com/office/drawing/2016/5/10/chartex" xmlns:cx5="http://schemas.microsoft.com/office/drawing/2016/5/11/chartex" xmlns:cx6="http://schemas.microsoft.com/office/drawing/2016/5/12/chartex" xmlns:cx7="http://schemas.microsoft.com/office/drawing/2016/5/13/chartex" xmlns:cx8="http://schemas.microsoft.com/office/drawing/2016/5/14/chartex" xmlns:mc="http://schemas.openxmlformats.org/markup-compatibility/2006" xmlns:aink="http://schemas.microsoft.com/office/drawing/2016/ink" xmlns:am3d="http://schemas.microsoft.com/office/drawing/2017/model3d" xmlns:o="urn:schemas-microsoft-com:office:office" xmlns:oel="http://schemas.microsoft.com/office/2019/extlst" xmlns:r="http://schemas.openxmlformats.org/officeDocument/2006/relationships" xmlns:m="http://schemas.openxmlformats.org/officeDocument/2006/math" xmlns:v="urn:schemas-microsoft-com:vml" xmlns:wp14="http://schemas.microsoft.com/office/word/2010/wordprocessingDrawing" xmlns:wp="http://schemas.openxmlformats.org/drawingml/2006/wordprocessingDrawing" xmlns:w10="urn:schemas-microsoft-com:office:word" xmlns:w="http://schemas.openxmlformats.org/wordprocessingml/2006/main" xmlns:w14="http://schemas.microsoft.com/office/word/2010/wordml" xmlns:w15="http://schemas.microsoft.com/office/word/2012/wordml" xmlns:w16cex="http://schemas.microsoft.com/office/word/2018/wordml/cex" xmlns:w16cid="http://schemas.microsoft.com/office/word/2016/wordml/cid" xmlns:w16="http://schemas.microsoft.com/office/word/2018/wordml" xmlns:w16du="http://schemas.microsoft.com/office/word/2023/wordml/word16du" xmlns:w16sdtdh="http://schemas.microsoft.com/office/word/2020/wordml/sdtdatahash" xmlns:w16sdtfl="http://schemas.microsoft.com/office/word/2024/wordml/sdtformatlock" xmlns:w16se="http://schemas.microsoft.com/office/word/2015/wordml/symex" xmlns:wpg="http://schemas.microsoft.com/office/word/2010/wordprocessingGroup" xmlns:wpi="http://schemas.microsoft.com/office/word/2010/wordprocessingInk" xmlns:wne="http://schemas.microsoft.com/office/word/2006/wordml" xmlns:wps="http://schemas.microsoft.com/office/word/2010/wordprocessingShape" mc:Ignorable="w14 w15 w16se w16cid w16 w16cex w16sdtdh w16sdtfl w16du wp14">
+  <w:footnote w:type="separator" w:id="-1">
+    <w:p>
+      <w:pPr>
+        <w:spacing w:after="0" w:line="240" w:lineRule="auto"/>
+      </w:pPr>
+      <w:r>
+        <w:separator/>
+      </w:r>
+    </w:p>
+  </w:footnote>
+  <w:footnote w:type="continuationSeparator" w:id="0">
+    <w:p>
+      <w:pPr>
+        <w:spacing w:after="0" w:line="240" w:lineRule="auto"/>
+      </w:pPr>
+      <w:r>
+        <w:continuationSeparator/>
+      </w:r>
+    </w:p>
+  </w:footnote>
+</w:footnotes>
+</file>
+
+<file path=word/header1.xml><?xml version="1.0" encoding="utf-8"?>
+<w:hdr xmlns:wpc="http://schemas.microsoft.com/office/word/2010/wordprocessingCanvas" xmlns:cx="http://schemas.microsoft.com/office/drawing/2014/chartex" xmlns:cx1="http://schemas.microsoft.com/office/drawing/2015/9/8/chartex" xmlns:cx2="http://schemas.microsoft.com/office/drawing/2015/10/21/chartex" xmlns:cx3="http://schemas.microsoft.com/office/drawing/2016/5/9/chartex" xmlns:cx4="http://schemas.microsoft.com/office/drawing/2016/5/10/chartex" xmlns:cx5="http://schemas.microsoft.com/office/drawing/2016/5/11/chartex" xmlns:cx6="http://schemas.microsoft.com/office/drawing/2016/5/12/chartex" xmlns:cx7="http://schemas.microsoft.com/office/drawing/2016/5/13/chartex" xmlns:cx8="http://schemas.microsoft.com/office/drawing/2016/5/14/chartex" xmlns:mc="http://schemas.openxmlformats.org/markup-compatibility/2006" xmlns:aink="http://schemas.microsoft.com/office/drawing/2016/ink" xmlns:am3d="http://schemas.microsoft.com/office/drawing/2017/model3d" xmlns:o="urn:schemas-microsoft-com:office:office" xmlns:oel="http://schemas.microsoft.com/office/2019/extlst" xmlns:r="http://schemas.openxmlformats.org/officeDocument/2006/relationships" xmlns:m="http://schemas.openxmlformats.org/officeDocument/2006/math" xmlns:v="urn:schemas-microsoft-com:vml" xmlns:wp14="http://schemas.microsoft.com/office/word/2010/wordprocessingDrawing" xmlns:wp="http://schemas.openxmlformats.org/drawingml/2006/wordprocessingDrawing" xmlns:w10="urn:schemas-microsoft-com:office:word" xmlns:w="http://schemas.openxmlformats.org/wordprocessingml/2006/main" xmlns:w14="http://schemas.microsoft.com/office/word/2010/wordml" xmlns:w15="http://schemas.microsoft.com/office/word/2012/wordml" xmlns:w16cex="http://schemas.microsoft.com/office/word/2018/wordml/cex" xmlns:w16cid="http://schemas.microsoft.com/office/word/2016/wordml/cid" xmlns:w16="http://schemas.microsoft.com/office/word/2018/wordml" xmlns:w16du="http://schemas.microsoft.com/office/word/2023/wordml/word16du" xmlns:w16sdtdh="http://schemas.microsoft.com/office/word/2020/wordml/sdtdatahash" xmlns:w16sdtfl="http://schemas.microsoft.com/office/word/2024/wordml/sdtformatlock" xmlns:w16se="http://schemas.microsoft.com/office/word/2015/wordml/symex" xmlns:wpg="http://schemas.microsoft.com/office/word/2010/wordprocessingGroup" xmlns:wpi="http://schemas.microsoft.com/office/word/2010/wordprocessingInk" xmlns:wne="http://schemas.microsoft.com/office/word/2006/wordml" xmlns:wps="http://schemas.microsoft.com/office/word/2010/wordprocessingShape" mc:Ignorable="w14 w15 w16se w16cid w16 w16cex w16sdtdh w16sdtfl w16du wp14">
+  <w:p>
+    <w:pPr>
+      <w:pStyle w:val="Header"/>
+      <w:rPr>
+        <w:rFonts w:ascii="Times New Roman" w:hAnsi="Times New Roman" w:cs="Times New Roman"/>
+        <w:sz w:val="22"/>
+        <w:szCs w:val="22"/>
+      </w:rPr>
+    </w:pPr>
+    <w:r>
+      <w:rPr>
+        <w:rFonts w:ascii="Times New Roman" w:hAnsi="Times New Roman" w:cs="Times New Roman"/>
+        <w:sz w:val="22"/>
+        <w:szCs w:val="22"/>
+      </w:rPr>
+      <w:t>Work Calendar Management by Department in ERP Systems</w:t>
+    </w:r>
+  </w:p>
+</w:hdr>
+</file>
+
+<file path=word/header2.xml><?xml version="1.0" encoding="utf-8"?>
+<w:hdr xmlns:wpc="http://schemas.microsoft.com/office/word/2010/wordprocessingCanvas" xmlns:cx="http://schemas.microsoft.com/office/drawing/2014/chartex" xmlns:cx1="http://schemas.microsoft.com/office/drawing/2015/9/8/chartex" xmlns:cx2="http://schemas.microsoft.com/office/drawing/2015/10/21/chartex" xmlns:cx3="http://schemas.microsoft.com/office/drawing/2016/5/9/chartex" xmlns:cx4="http://schemas.microsoft.com/office/drawing/2016/5/10/chartex" xmlns:cx5="http://schemas.microsoft.com/office/drawing/2016/5/11/chartex" xmlns:cx6="http://schemas.microsoft.com/office/drawing/2016/5/12/chartex" xmlns:cx7="http://schemas.microsoft.com/office/drawing/2016/5/13/chartex" xmlns:cx8="http://schemas.microsoft.com/office/drawing/2016/5/14/chartex" xmlns:mc="http://schemas.openxmlformats.org/markup-compatibility/2006" xmlns:aink="http://schemas.microsoft.com/office/drawing/2016/ink" xmlns:am3d="http://schemas.microsoft.com/office/drawing/2017/model3d" xmlns:o="urn:schemas-microsoft-com:office:office" xmlns:oel="http://schemas.microsoft.com/office/2019/extlst" xmlns:r="http://schemas.openxmlformats.org/officeDocument/2006/relationships" xmlns:m="http://schemas.openxmlformats.org/officeDocument/2006/math" xmlns:v="urn:schemas-microsoft-com:vml" xmlns:wp14="http://schemas.microsoft.com/office/word/2010/wordprocessingDrawing" xmlns:wp="http://schemas.openxmlformats.org/drawingml/2006/wordprocessingDrawing" xmlns:w10="urn:schemas-microsoft-com:office:word" xmlns:w="http://schemas.openxmlformats.org/wordprocessingml/2006/main" xmlns:w14="http://schemas.microsoft.com/office/word/2010/wordml" xmlns:w15="http://schemas.microsoft.com/office/word/2012/wordml" xmlns:w16cex="http://schemas.microsoft.com/office/word/2018/wordml/cex" xmlns:w16cid="http://schemas.microsoft.com/office/word/2016/wordml/cid" xmlns:w16="http://schemas.microsoft.com/office/word/2018/wordml" xmlns:w16du="http://schemas.microsoft.com/office/word/2023/wordml/word16du" xmlns:w16sdtdh="http://schemas.microsoft.com/office/word/2020/wordml/sdtdatahash" xmlns:w16sdtfl="http://schemas.microsoft.com/office/word/2024/wordml/sdtformatlock" xmlns:w16se="http://schemas.microsoft.com/office/word/2015/wordml/symex" xmlns:wpg="http://schemas.microsoft.com/office/word/2010/wordprocessingGroup" xmlns:wpi="http://schemas.microsoft.com/office/word/2010/wordprocessingInk" xmlns:wne="http://schemas.microsoft.com/office/word/2006/wordml" xmlns:wps="http://schemas.microsoft.com/office/word/2010/wordprocessingShape" mc:Ignorable="w14 w15 w16se w16cid w16 w16cex w16sdtdh w16sdtfl w16du wp14">
+  <w:p>
+    <w:pPr>
+      <w:pStyle w:val="Header"/>
+    </w:pPr>
+  </w:p>
+  <w:p>
+    <w:pPr>
+      <w:pStyle w:val="Header"/>
+    </w:pPr>
+  </w:p>
+</w:hdr>
+</file>
+
+<file path=word/header3.xml><?xml version="1.0" encoding="utf-8"?>
+<w:hdr xmlns:wpc="http://schemas.microsoft.com/office/word/2010/wordprocessingCanvas" xmlns:cx="http://schemas.microsoft.com/office/drawing/2014/chartex" xmlns:cx1="http://schemas.microsoft.com/office/drawing/2015/9/8/chartex" xmlns:cx2="http://schemas.microsoft.com/office/drawing/2015/10/21/chartex" xmlns:cx3="http://schemas.microsoft.com/office/drawing/2016/5/9/chartex" xmlns:cx4="http://schemas.microsoft.com/office/drawing/2016/5/10/chartex" xmlns:cx5="http://schemas.microsoft.com/office/drawing/2016/5/11/chartex" xmlns:cx6="http://schemas.microsoft.com/office/drawing/2016/5/12/chartex" xmlns:cx7="http://schemas.microsoft.com/office/drawing/2016/5/13/chartex" xmlns:cx8="http://schemas.microsoft.com/office/drawing/2016/5/14/chartex" xmlns:mc="http://schemas.openxmlformats.org/markup-compatibility/2006" xmlns:aink="http://schemas.microsoft.com/office/drawing/2016/ink" xmlns:am3d="http://schemas.microsoft.com/office/drawing/2017/model3d" xmlns:o="urn:schemas-microsoft-com:office:office" xmlns:oel="http://schemas.microsoft.com/office/2019/extlst" xmlns:r="http://schemas.openxmlformats.org/officeDocument/2006/relationships" xmlns:m="http://schemas.openxmlformats.org/officeDocument/2006/math" xmlns:v="urn:schemas-microsoft-com:vml" xmlns:wp14="http://schemas.microsoft.com/office/word/2010/wordprocessingDrawing" xmlns:wp="http://schemas.openxmlformats.org/drawingml/2006/wordprocessingDrawing" xmlns:w10="urn:schemas-microsoft-com:office:word" xmlns:w="http://schemas.openxmlformats.org/wordprocessingml/2006/main" xmlns:w14="http://schemas.microsoft.com/office/word/2010/wordml" xmlns:w15="http://schemas.microsoft.com/office/word/2012/wordml" xmlns:w16cex="http://schemas.microsoft.com/office/word/2018/wordml/cex" xmlns:w16cid="http://schemas.microsoft.com/office/word/2016/wordml/cid" xmlns:w16="http://schemas.microsoft.com/office/word/2018/wordml" xmlns:w16du="http://schemas.microsoft.com/office/word/2023/wordml/word16du" xmlns:w16sdtdh="http://schemas.microsoft.com/office/word/2020/wordml/sdtdatahash" xmlns:w16sdtfl="http://schemas.microsoft.com/office/word/2024/wordml/sdtformatlock" xmlns:w16se="http://schemas.microsoft.com/office/word/2015/wordml/symex" xmlns:wpg="http://schemas.microsoft.com/office/word/2010/wordprocessingGroup" xmlns:wpi="http://schemas.microsoft.com/office/word/2010/wordprocessingInk" xmlns:wne="http://schemas.microsoft.com/office/word/2006/wordml" xmlns:wps="http://schemas.microsoft.com/office/word/2010/wordprocessingShape" mc:Ignorable="w14 w15 w16se w16cid w16 w16cex w16sdtdh w16sdtfl w16du wp14">
+  <w:p>
+    <w:pPr>
+      <w:pStyle w:val="Header"/>
+      <w:rPr>
+        <w:rFonts w:ascii="Times New Roman" w:hAnsi="Times New Roman" w:cs="Times New Roman"/>
+        <w:sz w:val="22"/>
+        <w:szCs w:val="22"/>
+      </w:rPr>
+    </w:pPr>
+    <w:r>
+      <w:rPr>
+        <w:rFonts w:ascii="Times New Roman" w:hAnsi="Times New Roman" w:cs="Times New Roman"/>
+        <w:sz w:val="22"/>
+        <w:szCs w:val="22"/>
+      </w:rPr>
+      <w:t>Work Calendar Management by Department in ERP Systems</w:t>
+    </w:r>
+  </w:p>
+</w:hdr>
+</file>
+
+<file path=word/numbering.xml><?xml version="1.0" encoding="utf-8"?>
+<w:numbering xmlns:wpc="http://schemas.microsoft.com/office/word/2010/wordprocessingCanvas" xmlns:cx="http://schemas.microsoft.com/office/drawing/2014/chartex" xmlns:cx1="http://schemas.microsoft.com/office/drawing/2015/9/8/chartex" xmlns:cx2="http://schemas.microsoft.com/office/drawing/2015/10/21/chartex" xmlns:cx3="http://schemas.microsoft.com/office/drawing/2016/5/9/chartex" xmlns:cx4="http://schemas.microsoft.com/office/drawing/2016/5/10/chartex" xmlns:cx5="http://schemas.microsoft.com/office/drawing/2016/5/11/chartex" xmlns:cx6="http://schemas.microsoft.com/office/drawing/2016/5/12/chartex" xmlns:cx7="http://schemas.microsoft.com/office/drawing/2016/5/13/chartex" xmlns:cx8="http://schemas.microsoft.com/office/drawing/2016/5/14/chartex" xmlns:mc="http://schemas.openxmlformats.org/markup-compatibility/2006" xmlns:aink="http://schemas.microsoft.com/office/drawing/2016/ink" xmlns:am3d="http://schemas.microsoft.com/office/drawing/2017/model3d" xmlns:o="urn:schemas-microsoft-com:office:office" xmlns:oel="http://schemas.microsoft.com/office/2019/extlst" xmlns:r="http://schemas.openxmlformats.org/officeDocument/2006/relationships" xmlns:m="http://schemas.openxmlformats.org/officeDocument/2006/math" xmlns:v="urn:schemas-microsoft-com:vml" xmlns:wp14="http://schemas.microsoft.com/office/word/2010/wordprocessingDrawing" xmlns:wp="http://schemas.openxmlformats.org/drawingml/2006/wordprocessingDrawing" xmlns:w10="urn:schemas-microsoft-com:office:word" xmlns:w="http://schemas.openxmlformats.org/wordprocessingml/2006/main" xmlns:w14="http://schemas.microsoft.com/office/word/2010/wordml" xmlns:w15="http://schemas.microsoft.com/office/word/2012/wordml" xmlns:w16cex="http://schemas.microsoft.com/office/word/2018/wordml/cex" xmlns:w16cid="http://schemas.microsoft.com/office/word/2016/wordml/cid" xmlns:w16="http://schemas.microsoft.com/office/word/2018/wordml" xmlns:w16du="http://schemas.microsoft.com/office/word/2023/wordml/word16du" xmlns:w16sdtdh="http://schemas.microsoft.com/office/word/2020/wordml/sdtdatahash" xmlns:w16sdtfl="http://schemas.microsoft.com/office/word/2024/wordml/sdtformatlock" xmlns:w16se="http://schemas.microsoft.com/office/word/2015/wordml/symex" xmlns:wpg="http://schemas.microsoft.com/office/word/2010/wordprocessingGroup" xmlns:wpi="http://schemas.microsoft.com/office/word/2010/wordprocessingInk" xmlns:wne="http://schemas.microsoft.com/office/word/2006/wordml" xmlns:wps="http://schemas.microsoft.com/office/word/2010/wordprocessingShape" mc:Ignorable="w14 w15 w16se w16cid w16 w16cex w16sdtdh w16sdtfl w16du wp14">
+  <w:abstractNum w:abstractNumId="0" w15:restartNumberingAfterBreak="0">
+    <w:nsid w:val="15225B89"/>
+    <w:multiLevelType w:val="hybridMultilevel"/>
+    <w:tmpl w:val="18CA4D1E"/>
+    <w:lvl w:ilvl="0" w:tplc="0409000F">
+      <w:start w:val="1"/>
+      <w:numFmt w:val="decimal"/>
+      <w:lvlText w:val="%1."/>
+      <w:lvlJc w:val="left"/>
+      <w:pPr>
+        <w:ind w:left="720" w:hanging="360"/>
+      </w:pPr>
+      <w:rPr>
+        <w:rFonts w:hint="default"/>
+      </w:rPr>
+    </w:lvl>
+    <w:lvl w:ilvl="1" w:tplc="04090019" w:tentative="1">
+      <w:start w:val="1"/>
+      <w:numFmt w:val="lowerLetter"/>
+      <w:lvlText w:val="%2."/>
+      <w:lvlJc w:val="left"/>
+      <w:pPr>
+        <w:ind w:left="1440" w:hanging="360"/>
+      </w:pPr>
+    </w:lvl>
+    <w:lvl w:ilvl="2" w:tplc="0409001B" w:tentative="1">
+      <w:start w:val="1"/>
+      <w:numFmt w:val="lowerRoman"/>
+      <w:lvlText w:val="%3."/>
+      <w:lvlJc w:val="right"/>
+      <w:pPr>
+        <w:ind w:left="2160" w:hanging="180"/>
+      </w:pPr>
+    </w:lvl>
+    <w:lvl w:ilvl="3" w:tplc="0409000F" w:tentative="1">
+      <w:start w:val="1"/>
+      <w:numFmt w:val="decimal"/>
+      <w:lvlText w:val="%4."/>
+      <w:lvlJc w:val="left"/>
+      <w:pPr>
+        <w:ind w:left="2880" w:hanging="360"/>
+      </w:pPr>
+    </w:lvl>
+    <w:lvl w:ilvl="4" w:tplc="04090019" w:tentative="1">
+      <w:start w:val="1"/>
+      <w:numFmt w:val="lowerLetter"/>
+      <w:lvlText w:val="%5."/>
+      <w:lvlJc w:val="left"/>
+      <w:pPr>
+        <w:ind w:left="3600" w:hanging="360"/>
+      </w:pPr>
+    </w:lvl>
+    <w:lvl w:ilvl="5" w:tplc="0409001B" w:tentative="1">
+      <w:start w:val="1"/>
+      <w:numFmt w:val="lowerRoman"/>
+      <w:lvlText w:val="%6."/>
+      <w:lvlJc w:val="right"/>
+      <w:pPr>
+        <w:ind w:left="4320" w:hanging="180"/>
+      </w:pPr>
+    </w:lvl>
+    <w:lvl w:ilvl="6" w:tplc="0409000F" w:tentative="1">
+      <w:start w:val="1"/>
+      <w:numFmt w:val="decimal"/>
+      <w:lvlText w:val="%7."/>
+      <w:lvlJc w:val="left"/>
+      <w:pPr>
+        <w:ind w:left="5040" w:hanging="360"/>
+      </w:pPr>
+    </w:lvl>
+    <w:lvl w:ilvl="7" w:tplc="04090019" w:tentative="1">
+      <w:start w:val="1"/>
+      <w:numFmt w:val="lowerLetter"/>
+      <w:lvlText w:val="%8."/>
+      <w:lvlJc w:val="left"/>
+      <w:pPr>
+        <w:ind w:left="5760" w:hanging="360"/>
+      </w:pPr>
+    </w:lvl>
+    <w:lvl w:ilvl="8" w:tplc="0409001B" w:tentative="1">
+      <w:start w:val="1"/>
+      <w:numFmt w:val="lowerRoman"/>
+      <w:lvlText w:val="%9."/>
+      <w:lvlJc w:val="right"/>
+      <w:pPr>
+        <w:ind w:left="6480" w:hanging="180"/>
+      </w:pPr>
+    </w:lvl>
+  </w:abstractNum>
+  <w:num w:numId="1" w16cid:durableId="461465089">
+    <w:abstractNumId w:val="0"/>
+  </w:num>
+</w:numbering>
 </file>
 
 <file path=word/styles.xml><?xml version="1.0" encoding="utf-8"?>
@@ -419,6 +4437,7 @@
   <w:style w:type="paragraph" w:default="1" w:styleId="Normal">
     <w:name w:val="Normal"/>
     <w:qFormat/>
+    <w:rsid w:val="00320411"/>
   </w:style>
   <w:style w:type="paragraph" w:styleId="Heading1">
     <w:name w:val="heading 1"/>
@@ -622,7 +4641,6 @@
   <w:style w:type="character" w:default="1" w:styleId="DefaultParagraphFont">
     <w:name w:val="Default Paragraph Font"/>
     <w:uiPriority w:val="1"/>
-    <w:semiHidden/>
     <w:unhideWhenUsed/>
   </w:style>
   <w:style w:type="table" w:default="1" w:styleId="TableNormal">
@@ -936,6 +4954,136 @@
       <w:spacing w:val="5"/>
     </w:rPr>
   </w:style>
+  <w:style w:type="table" w:styleId="TableGrid">
+    <w:name w:val="Table Grid"/>
+    <w:basedOn w:val="TableNormal"/>
+    <w:uiPriority w:val="39"/>
+    <w:rsid w:val="006A0E37"/>
+    <w:pPr>
+      <w:spacing w:after="0" w:line="240" w:lineRule="auto"/>
+    </w:pPr>
+    <w:tblPr>
+      <w:tblBorders>
+        <w:top w:val="single" w:sz="4" w:space="0" w:color="auto"/>
+        <w:left w:val="single" w:sz="4" w:space="0" w:color="auto"/>
+        <w:bottom w:val="single" w:sz="4" w:space="0" w:color="auto"/>
+        <w:right w:val="single" w:sz="4" w:space="0" w:color="auto"/>
+        <w:insideH w:val="single" w:sz="4" w:space="0" w:color="auto"/>
+        <w:insideV w:val="single" w:sz="4" w:space="0" w:color="auto"/>
+      </w:tblBorders>
+    </w:tblPr>
+  </w:style>
+  <w:style w:type="paragraph" w:styleId="Header">
+    <w:name w:val="header"/>
+    <w:basedOn w:val="Normal"/>
+    <w:link w:val="HeaderChar"/>
+    <w:uiPriority w:val="99"/>
+    <w:unhideWhenUsed/>
+    <w:rsid w:val="009D19D0"/>
+    <w:pPr>
+      <w:tabs>
+        <w:tab w:val="center" w:pos="4680"/>
+        <w:tab w:val="right" w:pos="9360"/>
+      </w:tabs>
+      <w:spacing w:after="0" w:line="240" w:lineRule="auto"/>
+    </w:pPr>
+  </w:style>
+  <w:style w:type="character" w:customStyle="1" w:styleId="HeaderChar">
+    <w:name w:val="Header Char"/>
+    <w:basedOn w:val="DefaultParagraphFont"/>
+    <w:link w:val="Header"/>
+    <w:uiPriority w:val="99"/>
+    <w:rsid w:val="009D19D0"/>
+  </w:style>
+  <w:style w:type="paragraph" w:styleId="Footer">
+    <w:name w:val="footer"/>
+    <w:basedOn w:val="Normal"/>
+    <w:link w:val="FooterChar"/>
+    <w:uiPriority w:val="99"/>
+    <w:unhideWhenUsed/>
+    <w:rsid w:val="009D19D0"/>
+    <w:pPr>
+      <w:tabs>
+        <w:tab w:val="center" w:pos="4680"/>
+        <w:tab w:val="right" w:pos="9360"/>
+      </w:tabs>
+      <w:spacing w:after="0" w:line="240" w:lineRule="auto"/>
+    </w:pPr>
+  </w:style>
+  <w:style w:type="character" w:customStyle="1" w:styleId="FooterChar">
+    <w:name w:val="Footer Char"/>
+    <w:basedOn w:val="DefaultParagraphFont"/>
+    <w:link w:val="Footer"/>
+    <w:uiPriority w:val="99"/>
+    <w:rsid w:val="009D19D0"/>
+  </w:style>
+  <w:style w:type="paragraph" w:styleId="TOCHeading">
+    <w:name w:val="TOC Heading"/>
+    <w:basedOn w:val="Heading1"/>
+    <w:next w:val="Normal"/>
+    <w:uiPriority w:val="39"/>
+    <w:unhideWhenUsed/>
+    <w:qFormat/>
+    <w:rsid w:val="0064339B"/>
+    <w:pPr>
+      <w:spacing w:before="240" w:after="0" w:line="259" w:lineRule="auto"/>
+      <w:outlineLvl w:val="9"/>
+    </w:pPr>
+    <w:rPr>
+      <w:kern w:val="0"/>
+      <w:sz w:val="32"/>
+      <w:szCs w:val="32"/>
+      <w:lang w:eastAsia="en-US"/>
+      <w14:ligatures w14:val="none"/>
+    </w:rPr>
+  </w:style>
+  <w:style w:type="paragraph" w:styleId="BodyText">
+    <w:name w:val="Body Text"/>
+    <w:basedOn w:val="Normal"/>
+    <w:link w:val="BodyTextChar"/>
+    <w:uiPriority w:val="99"/>
+    <w:unhideWhenUsed/>
+    <w:rsid w:val="00D64647"/>
+    <w:pPr>
+      <w:jc w:val="both"/>
+    </w:pPr>
+    <w:rPr>
+      <w:rFonts w:ascii="Times New Roman" w:hAnsi="Times New Roman" w:cs="Times New Roman"/>
+    </w:rPr>
+  </w:style>
+  <w:style w:type="character" w:customStyle="1" w:styleId="BodyTextChar">
+    <w:name w:val="Body Text Char"/>
+    <w:basedOn w:val="DefaultParagraphFont"/>
+    <w:link w:val="BodyText"/>
+    <w:uiPriority w:val="99"/>
+    <w:rsid w:val="00D64647"/>
+    <w:rPr>
+      <w:rFonts w:ascii="Times New Roman" w:hAnsi="Times New Roman" w:cs="Times New Roman"/>
+    </w:rPr>
+  </w:style>
+  <w:style w:type="paragraph" w:styleId="TOC1">
+    <w:name w:val="toc 1"/>
+    <w:basedOn w:val="Normal"/>
+    <w:next w:val="Normal"/>
+    <w:autoRedefine/>
+    <w:uiPriority w:val="39"/>
+    <w:unhideWhenUsed/>
+    <w:rsid w:val="0019423D"/>
+    <w:pPr>
+      <w:spacing w:after="100"/>
+    </w:pPr>
+  </w:style>
+  <w:style w:type="character" w:styleId="Hyperlink">
+    <w:name w:val="Hyperlink"/>
+    <w:basedOn w:val="DefaultParagraphFont"/>
+    <w:uiPriority w:val="99"/>
+    <w:unhideWhenUsed/>
+    <w:rsid w:val="0019423D"/>
+    <w:rPr>
+      <w:color w:val="0563C1" w:themeColor="hyperlink"/>
+      <w:u w:val="single"/>
+    </w:rPr>
+  </w:style>
 </w:styles>
 </file>
 
@@ -1232,4 +5380,16 @@
     </a:ext>
   </a:extLst>
 </a:theme>
+</file>
+
+<file path=customXml/item1.xml><?xml version="1.0" encoding="utf-8"?>
+<b:Sources xmlns:b="http://schemas.openxmlformats.org/officeDocument/2006/bibliography" xmlns="http://schemas.openxmlformats.org/officeDocument/2006/bibliography" SelectedStyle="\GostName.XSL" StyleName="GOST - Name Sort" Version="2003"/>
+</file>
+
+<file path=customXml/itemProps1.xml><?xml version="1.0" encoding="utf-8"?>
+<ds:datastoreItem xmlns:ds="http://schemas.openxmlformats.org/officeDocument/2006/customXml" ds:itemID="{24BF202A-5020-40B1-8E01-9852DC771F44}">
+  <ds:schemaRefs>
+    <ds:schemaRef ds:uri="http://schemas.openxmlformats.org/officeDocument/2006/bibliography"/>
+  </ds:schemaRefs>
+</ds:datastoreItem>
 </file>
</xml_diff>

<commit_message>
bis objectives, impacts & purpose of document
</commit_message>
<xml_diff>
--- a/Business Requirements Document/Business Requirements Document.docx
+++ b/Business Requirements Document/Business Requirements Document.docx
@@ -77,7 +77,7 @@
           <w:noProof/>
         </w:rPr>
         <w:drawing>
-          <wp:inline distT="0" distB="0" distL="0" distR="0" wp14:anchorId="3C37E38B" wp14:editId="5EE05669">
+          <wp:inline distT="0" distB="0" distL="0" distR="0" wp14:anchorId="3C37E38B" wp14:editId="706B541E">
             <wp:extent cx="1586865" cy="785125"/>
             <wp:effectExtent l="0" t="0" r="0" b="0"/>
             <wp:docPr id="663822568" name="Picture 2"/>
@@ -109,7 +109,7 @@
                   <pic:spPr bwMode="auto">
                     <a:xfrm>
                       <a:off x="0" y="0"/>
-                      <a:ext cx="1605565" cy="794377"/>
+                      <a:ext cx="1586865" cy="785125"/>
                     </a:xfrm>
                     <a:prstGeom prst="rect">
                       <a:avLst/>
@@ -333,34 +333,7 @@
           <w:sz w:val="28"/>
           <w:szCs w:val="28"/>
         </w:rPr>
-        <w:t xml:space="preserve">   - Ho Chi Minh, </w:t>
-      </w:r>
-      <w:r>
-        <w:rPr>
-          <w:rFonts w:ascii="Times New Roman" w:hAnsi="Times New Roman" w:cs="Times New Roman"/>
-          <w:color w:val="000000" w:themeColor="text1"/>
-          <w:sz w:val="28"/>
-          <w:szCs w:val="28"/>
-        </w:rPr>
-        <w:t>April</w:t>
-      </w:r>
-      <w:r>
-        <w:rPr>
-          <w:rFonts w:ascii="Times New Roman" w:hAnsi="Times New Roman" w:cs="Times New Roman"/>
-          <w:color w:val="000000" w:themeColor="text1"/>
-          <w:sz w:val="28"/>
-          <w:szCs w:val="28"/>
-        </w:rPr>
-        <w:t xml:space="preserve"> </w:t>
-      </w:r>
-      <w:r>
-        <w:rPr>
-          <w:rFonts w:ascii="Times New Roman" w:hAnsi="Times New Roman" w:cs="Times New Roman"/>
-          <w:color w:val="000000" w:themeColor="text1"/>
-          <w:sz w:val="28"/>
-          <w:szCs w:val="28"/>
-        </w:rPr>
-        <w:t>08</w:t>
+        <w:t xml:space="preserve">   - Ho Chi Minh, April 08</w:t>
       </w:r>
       <w:r>
         <w:rPr>
@@ -379,25 +352,7 @@
           <w:sz w:val="28"/>
           <w:szCs w:val="28"/>
         </w:rPr>
-        <w:t>, 202</w:t>
-      </w:r>
-      <w:r>
-        <w:rPr>
-          <w:rFonts w:ascii="Times New Roman" w:hAnsi="Times New Roman" w:cs="Times New Roman"/>
-          <w:color w:val="000000" w:themeColor="text1"/>
-          <w:sz w:val="28"/>
-          <w:szCs w:val="28"/>
-        </w:rPr>
-        <w:t>6</w:t>
-      </w:r>
-      <w:r>
-        <w:rPr>
-          <w:rFonts w:ascii="Times New Roman" w:hAnsi="Times New Roman" w:cs="Times New Roman"/>
-          <w:color w:val="000000" w:themeColor="text1"/>
-          <w:sz w:val="28"/>
-          <w:szCs w:val="28"/>
-        </w:rPr>
-        <w:t xml:space="preserve"> </w:t>
+        <w:t xml:space="preserve">, 2026 </w:t>
       </w:r>
       <w:r>
         <w:rPr>
@@ -919,7 +874,7 @@
               <w:rPr>
                 <w:rFonts w:ascii="Times New Roman" w:hAnsi="Times New Roman" w:cs="Times New Roman"/>
               </w:rPr>
-              <w:t>Anh Tran Tuan</w:t>
+              <w:t>FPT University HCM</w:t>
             </w:r>
           </w:p>
         </w:tc>
@@ -966,7 +921,7 @@
               <w:rPr>
                 <w:rFonts w:ascii="Times New Roman" w:hAnsi="Times New Roman" w:cs="Times New Roman"/>
               </w:rPr>
-              <w:t>Business Analyst</w:t>
+              <w:t>Mentor | Supervisor</w:t>
             </w:r>
           </w:p>
         </w:tc>
@@ -1060,7 +1015,13 @@
               <w:rPr>
                 <w:rFonts w:ascii="Times New Roman" w:hAnsi="Times New Roman" w:cs="Times New Roman"/>
               </w:rPr>
-              <w:t>(+84) 901498220</w:t>
+              <w:t>(+84)</w:t>
+            </w:r>
+            <w:r>
+              <w:rPr>
+                <w:rFonts w:ascii="Times New Roman" w:hAnsi="Times New Roman" w:cs="Times New Roman"/>
+              </w:rPr>
+              <w:t xml:space="preserve"> xxxxx</w:t>
             </w:r>
           </w:p>
         </w:tc>
@@ -1107,7 +1068,7 @@
               <w:rPr>
                 <w:rFonts w:ascii="Times New Roman" w:hAnsi="Times New Roman" w:cs="Times New Roman"/>
               </w:rPr>
-              <w:t>trantuananhhh8088@gmail.com</w:t>
+              <w:t>abc@fpt.com</w:t>
             </w:r>
           </w:p>
         </w:tc>
@@ -1119,8 +1080,8 @@
           <w:rFonts w:ascii="Times New Roman" w:hAnsi="Times New Roman" w:cs="Times New Roman"/>
           <w:b/>
           <w:bCs/>
-          <w:sz w:val="26"/>
-          <w:szCs w:val="26"/>
+          <w:sz w:val="28"/>
+          <w:szCs w:val="28"/>
         </w:rPr>
       </w:pPr>
     </w:p>
@@ -1176,7 +1137,7 @@
               <w:rPr>
                 <w:rFonts w:ascii="Times New Roman" w:hAnsi="Times New Roman" w:cs="Times New Roman"/>
               </w:rPr>
-              <w:t>FPT University HCM</w:t>
+              <w:t>Anh Tran Tuan</w:t>
             </w:r>
           </w:p>
         </w:tc>
@@ -1223,7 +1184,7 @@
               <w:rPr>
                 <w:rFonts w:ascii="Times New Roman" w:hAnsi="Times New Roman" w:cs="Times New Roman"/>
               </w:rPr>
-              <w:t>Mentor | Supervisor</w:t>
+              <w:t>Business Analyst</w:t>
             </w:r>
           </w:p>
         </w:tc>
@@ -1317,13 +1278,7 @@
               <w:rPr>
                 <w:rFonts w:ascii="Times New Roman" w:hAnsi="Times New Roman" w:cs="Times New Roman"/>
               </w:rPr>
-              <w:t>(+84)</w:t>
-            </w:r>
-            <w:r>
-              <w:rPr>
-                <w:rFonts w:ascii="Times New Roman" w:hAnsi="Times New Roman" w:cs="Times New Roman"/>
-              </w:rPr>
-              <w:t xml:space="preserve"> xxxxx</w:t>
+              <w:t>(+84) 901498220</w:t>
             </w:r>
           </w:p>
         </w:tc>
@@ -1370,7 +1325,7 @@
               <w:rPr>
                 <w:rFonts w:ascii="Times New Roman" w:hAnsi="Times New Roman" w:cs="Times New Roman"/>
               </w:rPr>
-              <w:t>abc@fpt.com</w:t>
+              <w:t>trantuananhhh8088@gmail.com</w:t>
             </w:r>
           </w:p>
         </w:tc>
@@ -1999,7 +1954,13 @@
               <w:rPr>
                 <w:rFonts w:ascii="Times New Roman" w:hAnsi="Times New Roman" w:cs="Times New Roman"/>
               </w:rPr>
-              <w:t>Documentation Supervisor</w:t>
+              <w:t xml:space="preserve">Documentation </w:t>
+            </w:r>
+            <w:r>
+              <w:rPr>
+                <w:rFonts w:ascii="Times New Roman" w:hAnsi="Times New Roman" w:cs="Times New Roman"/>
+              </w:rPr>
+              <w:t>Advisor</w:t>
             </w:r>
           </w:p>
         </w:tc>
@@ -2018,6 +1979,62 @@
                 <w:rFonts w:ascii="Times New Roman" w:hAnsi="Times New Roman" w:cs="Times New Roman"/>
               </w:rPr>
               <w:t>Project Owner</w:t>
+            </w:r>
+          </w:p>
+        </w:tc>
+      </w:tr>
+      <w:tr>
+        <w:tc>
+          <w:tcPr>
+            <w:tcW w:w="3116" w:type="dxa"/>
+          </w:tcPr>
+          <w:p>
+            <w:pPr>
+              <w:rPr>
+                <w:rFonts w:ascii="Times New Roman" w:hAnsi="Times New Roman" w:cs="Times New Roman"/>
+              </w:rPr>
+            </w:pPr>
+            <w:r>
+              <w:rPr>
+                <w:rFonts w:ascii="Times New Roman" w:hAnsi="Times New Roman" w:cs="Times New Roman"/>
+              </w:rPr>
+              <w:t>FPT Supervisor</w:t>
+            </w:r>
+          </w:p>
+        </w:tc>
+        <w:tc>
+          <w:tcPr>
+            <w:tcW w:w="3117" w:type="dxa"/>
+          </w:tcPr>
+          <w:p>
+            <w:pPr>
+              <w:rPr>
+                <w:rFonts w:ascii="Times New Roman" w:hAnsi="Times New Roman" w:cs="Times New Roman"/>
+              </w:rPr>
+            </w:pPr>
+            <w:r>
+              <w:rPr>
+                <w:rFonts w:ascii="Times New Roman" w:hAnsi="Times New Roman" w:cs="Times New Roman"/>
+              </w:rPr>
+              <w:t>Assessment Lecturers</w:t>
+            </w:r>
+          </w:p>
+        </w:tc>
+        <w:tc>
+          <w:tcPr>
+            <w:tcW w:w="3117" w:type="dxa"/>
+          </w:tcPr>
+          <w:p>
+            <w:pPr>
+              <w:rPr>
+                <w:rFonts w:ascii="Times New Roman" w:hAnsi="Times New Roman" w:cs="Times New Roman"/>
+              </w:rPr>
+            </w:pPr>
+            <w:r>
+              <w:rPr>
+                <w:rFonts w:ascii="Times New Roman" w:hAnsi="Times New Roman" w:cs="Times New Roman"/>
+              </w:rPr>
+              <w:t>Project Sponsor</w:t>
             </w:r>
           </w:p>
         </w:tc>
@@ -2063,10 +2080,10 @@
       </w:tblPr>
       <w:tblGrid>
         <w:gridCol w:w="1296"/>
+        <w:gridCol w:w="1262"/>
         <w:gridCol w:w="1263"/>
-        <w:gridCol w:w="1264"/>
-        <w:gridCol w:w="4133"/>
-        <w:gridCol w:w="1394"/>
+        <w:gridCol w:w="4138"/>
+        <w:gridCol w:w="1391"/>
       </w:tblGrid>
       <w:tr>
         <w:tc>
@@ -2294,6 +2311,12 @@
                 <w:rFonts w:ascii="Times New Roman" w:hAnsi="Times New Roman" w:cs="Times New Roman"/>
               </w:rPr>
             </w:pPr>
+            <w:r>
+              <w:rPr>
+                <w:rFonts w:ascii="Times New Roman" w:hAnsi="Times New Roman" w:cs="Times New Roman"/>
+              </w:rPr>
+              <w:t>09.04.2026</w:t>
+            </w:r>
           </w:p>
         </w:tc>
         <w:tc>
@@ -2307,6 +2330,12 @@
                 <w:rFonts w:ascii="Times New Roman" w:hAnsi="Times New Roman" w:cs="Times New Roman"/>
               </w:rPr>
             </w:pPr>
+            <w:r>
+              <w:rPr>
+                <w:rFonts w:ascii="Times New Roman" w:hAnsi="Times New Roman" w:cs="Times New Roman"/>
+              </w:rPr>
+              <w:t>AnhTT</w:t>
+            </w:r>
           </w:p>
         </w:tc>
         <w:tc>
@@ -2320,6 +2349,12 @@
                 <w:rFonts w:ascii="Times New Roman" w:hAnsi="Times New Roman" w:cs="Times New Roman"/>
               </w:rPr>
             </w:pPr>
+            <w:r>
+              <w:rPr>
+                <w:rFonts w:ascii="Times New Roman" w:hAnsi="Times New Roman" w:cs="Times New Roman"/>
+              </w:rPr>
+              <w:t>0.2</w:t>
+            </w:r>
           </w:p>
         </w:tc>
         <w:tc>
@@ -2333,6 +2368,12 @@
                 <w:rFonts w:ascii="Times New Roman" w:hAnsi="Times New Roman" w:cs="Times New Roman"/>
               </w:rPr>
             </w:pPr>
+            <w:r>
+              <w:rPr>
+                <w:rFonts w:ascii="Times New Roman" w:hAnsi="Times New Roman" w:cs="Times New Roman"/>
+              </w:rPr>
+              <w:t>Generate Purpose of Document, In-scope &amp; Out-of-scope, Problem/Impact &amp; Business Objectives</w:t>
+            </w:r>
           </w:p>
         </w:tc>
         <w:tc>
@@ -2346,6 +2387,12 @@
                 <w:rFonts w:ascii="Times New Roman" w:hAnsi="Times New Roman" w:cs="Times New Roman"/>
               </w:rPr>
             </w:pPr>
+            <w:r>
+              <w:rPr>
+                <w:rFonts w:ascii="Times New Roman" w:hAnsi="Times New Roman" w:cs="Times New Roman"/>
+              </w:rPr>
+              <w:t>Draft</w:t>
+            </w:r>
           </w:p>
         </w:tc>
       </w:tr>
@@ -2539,7 +2586,6 @@
           <w:sz w:val="28"/>
           <w:szCs w:val="28"/>
         </w:rPr>
-        <w:lastRenderedPageBreak/>
         <w:t>Related Documents</w:t>
       </w:r>
     </w:p>
@@ -2550,20 +2596,17 @@
         <w:tblLook w:val="04A0" w:firstRow="1" w:lastRow="0" w:firstColumn="1" w:lastColumn="0" w:noHBand="0" w:noVBand="1"/>
       </w:tblPr>
       <w:tblGrid>
-        <w:gridCol w:w="3823"/>
-        <w:gridCol w:w="1275"/>
-        <w:gridCol w:w="1985"/>
-        <w:gridCol w:w="2267"/>
+        <w:gridCol w:w="5735"/>
+        <w:gridCol w:w="994"/>
+        <w:gridCol w:w="1415"/>
+        <w:gridCol w:w="1206"/>
       </w:tblGrid>
       <w:tr>
         <w:tc>
           <w:tcPr>
-            <w:tcW w:w="3823" w:type="dxa"/>
-          </w:tcPr>
-          <w:p>
-            <w:pPr>
-              <w:jc w:val="both"/>
-            </w:pPr>
+            <w:tcW w:w="0" w:type="auto"/>
+          </w:tcPr>
+          <w:p>
             <w:r>
               <w:rPr>
                 <w:rFonts w:ascii="Times New Roman" w:hAnsi="Times New Roman" w:cs="Times New Roman"/>
@@ -2576,11 +2619,10 @@
         </w:tc>
         <w:tc>
           <w:tcPr>
-            <w:tcW w:w="1275" w:type="dxa"/>
-          </w:tcPr>
-          <w:p>
-            <w:pPr>
-              <w:jc w:val="both"/>
+            <w:tcW w:w="0" w:type="auto"/>
+          </w:tcPr>
+          <w:p>
+            <w:pPr>
               <w:rPr>
                 <w:rFonts w:ascii="Times New Roman" w:hAnsi="Times New Roman" w:cs="Times New Roman"/>
                 <w:b/>
@@ -2599,11 +2641,10 @@
         </w:tc>
         <w:tc>
           <w:tcPr>
-            <w:tcW w:w="1985" w:type="dxa"/>
-          </w:tcPr>
-          <w:p>
-            <w:pPr>
-              <w:jc w:val="both"/>
+            <w:tcW w:w="0" w:type="auto"/>
+          </w:tcPr>
+          <w:p>
+            <w:pPr>
               <w:rPr>
                 <w:rFonts w:ascii="Times New Roman" w:hAnsi="Times New Roman" w:cs="Times New Roman"/>
                 <w:b/>
@@ -2622,11 +2663,10 @@
         </w:tc>
         <w:tc>
           <w:tcPr>
-            <w:tcW w:w="2267" w:type="dxa"/>
-          </w:tcPr>
-          <w:p>
-            <w:pPr>
-              <w:jc w:val="both"/>
+            <w:tcW w:w="0" w:type="auto"/>
+          </w:tcPr>
+          <w:p>
+            <w:pPr>
               <w:rPr>
                 <w:rFonts w:ascii="Times New Roman" w:hAnsi="Times New Roman" w:cs="Times New Roman"/>
                 <w:b/>
@@ -2647,18 +2687,22 @@
       <w:tr>
         <w:tc>
           <w:tcPr>
-            <w:tcW w:w="3823" w:type="dxa"/>
+            <w:tcW w:w="0" w:type="auto"/>
           </w:tcPr>
           <w:p>
             <w:pPr>
               <w:jc w:val="both"/>
               <w:rPr>
                 <w:rFonts w:ascii="Times New Roman" w:hAnsi="Times New Roman" w:cs="Times New Roman"/>
-              </w:rPr>
-            </w:pPr>
-            <w:r>
-              <w:rPr>
-                <w:rFonts w:ascii="Times New Roman" w:hAnsi="Times New Roman" w:cs="Times New Roman"/>
+                <w:sz w:val="22"/>
+                <w:szCs w:val="22"/>
+              </w:rPr>
+            </w:pPr>
+            <w:r>
+              <w:rPr>
+                <w:rFonts w:ascii="Times New Roman" w:hAnsi="Times New Roman" w:cs="Times New Roman"/>
+                <w:sz w:val="22"/>
+                <w:szCs w:val="22"/>
               </w:rPr>
               <w:t>Creating Organizational Structure in HCM</w:t>
             </w:r>
@@ -2666,18 +2710,22 @@
         </w:tc>
         <w:tc>
           <w:tcPr>
-            <w:tcW w:w="1275" w:type="dxa"/>
+            <w:tcW w:w="0" w:type="auto"/>
           </w:tcPr>
           <w:p>
             <w:pPr>
               <w:jc w:val="both"/>
               <w:rPr>
                 <w:rFonts w:ascii="Times New Roman" w:hAnsi="Times New Roman" w:cs="Times New Roman"/>
-              </w:rPr>
-            </w:pPr>
-            <w:r>
-              <w:rPr>
-                <w:rFonts w:ascii="Times New Roman" w:hAnsi="Times New Roman" w:cs="Times New Roman"/>
+                <w:sz w:val="22"/>
+                <w:szCs w:val="22"/>
+              </w:rPr>
+            </w:pPr>
+            <w:r>
+              <w:rPr>
+                <w:rFonts w:ascii="Times New Roman" w:hAnsi="Times New Roman" w:cs="Times New Roman"/>
+                <w:sz w:val="22"/>
+                <w:szCs w:val="22"/>
               </w:rPr>
               <w:t>v6.0</w:t>
             </w:r>
@@ -2685,18 +2733,22 @@
         </w:tc>
         <w:tc>
           <w:tcPr>
-            <w:tcW w:w="1985" w:type="dxa"/>
+            <w:tcW w:w="0" w:type="auto"/>
           </w:tcPr>
           <w:p>
             <w:pPr>
               <w:jc w:val="both"/>
               <w:rPr>
                 <w:rFonts w:ascii="Times New Roman" w:hAnsi="Times New Roman" w:cs="Times New Roman"/>
-              </w:rPr>
-            </w:pPr>
-            <w:r>
-              <w:rPr>
-                <w:rFonts w:ascii="Times New Roman" w:hAnsi="Times New Roman" w:cs="Times New Roman"/>
+                <w:sz w:val="22"/>
+                <w:szCs w:val="22"/>
+              </w:rPr>
+            </w:pPr>
+            <w:r>
+              <w:rPr>
+                <w:rFonts w:ascii="Times New Roman" w:hAnsi="Times New Roman" w:cs="Times New Roman"/>
+                <w:sz w:val="22"/>
+                <w:szCs w:val="22"/>
               </w:rPr>
               <w:t>Sap Help Portal</w:t>
             </w:r>
@@ -2704,18 +2756,22 @@
         </w:tc>
         <w:tc>
           <w:tcPr>
-            <w:tcW w:w="2267" w:type="dxa"/>
+            <w:tcW w:w="0" w:type="auto"/>
           </w:tcPr>
           <w:p>
             <w:pPr>
               <w:jc w:val="both"/>
               <w:rPr>
                 <w:rFonts w:ascii="Times New Roman" w:hAnsi="Times New Roman" w:cs="Times New Roman"/>
-              </w:rPr>
-            </w:pPr>
-            <w:r>
-              <w:rPr>
-                <w:rFonts w:ascii="Times New Roman" w:hAnsi="Times New Roman" w:cs="Times New Roman"/>
+                <w:sz w:val="22"/>
+                <w:szCs w:val="22"/>
+              </w:rPr>
+            </w:pPr>
+            <w:r>
+              <w:rPr>
+                <w:rFonts w:ascii="Times New Roman" w:hAnsi="Times New Roman" w:cs="Times New Roman"/>
+                <w:sz w:val="22"/>
+                <w:szCs w:val="22"/>
               </w:rPr>
               <w:t>15.01.2026</w:t>
             </w:r>
@@ -2725,18 +2781,22 @@
       <w:tr>
         <w:tc>
           <w:tcPr>
-            <w:tcW w:w="3823" w:type="dxa"/>
+            <w:tcW w:w="0" w:type="auto"/>
           </w:tcPr>
           <w:p>
             <w:pPr>
               <w:jc w:val="both"/>
               <w:rPr>
                 <w:rFonts w:ascii="Times New Roman" w:hAnsi="Times New Roman" w:cs="Times New Roman"/>
-              </w:rPr>
-            </w:pPr>
-            <w:r>
-              <w:rPr>
-                <w:rFonts w:ascii="Times New Roman" w:hAnsi="Times New Roman" w:cs="Times New Roman"/>
+                <w:sz w:val="22"/>
+                <w:szCs w:val="22"/>
+              </w:rPr>
+            </w:pPr>
+            <w:r>
+              <w:rPr>
+                <w:rFonts w:ascii="Times New Roman" w:hAnsi="Times New Roman" w:cs="Times New Roman"/>
+                <w:sz w:val="22"/>
+                <w:szCs w:val="22"/>
               </w:rPr>
               <w:t>Analyzing HCM Structures</w:t>
             </w:r>
@@ -2744,18 +2804,22 @@
         </w:tc>
         <w:tc>
           <w:tcPr>
-            <w:tcW w:w="1275" w:type="dxa"/>
+            <w:tcW w:w="0" w:type="auto"/>
           </w:tcPr>
           <w:p>
             <w:pPr>
               <w:jc w:val="both"/>
               <w:rPr>
                 <w:rFonts w:ascii="Times New Roman" w:hAnsi="Times New Roman" w:cs="Times New Roman"/>
-              </w:rPr>
-            </w:pPr>
-            <w:r>
-              <w:rPr>
-                <w:rFonts w:ascii="Times New Roman" w:hAnsi="Times New Roman" w:cs="Times New Roman"/>
+                <w:sz w:val="22"/>
+                <w:szCs w:val="22"/>
+              </w:rPr>
+            </w:pPr>
+            <w:r>
+              <w:rPr>
+                <w:rFonts w:ascii="Times New Roman" w:hAnsi="Times New Roman" w:cs="Times New Roman"/>
+                <w:sz w:val="22"/>
+                <w:szCs w:val="22"/>
               </w:rPr>
               <w:t>-</w:t>
             </w:r>
@@ -2763,18 +2827,22 @@
         </w:tc>
         <w:tc>
           <w:tcPr>
-            <w:tcW w:w="1985" w:type="dxa"/>
+            <w:tcW w:w="0" w:type="auto"/>
           </w:tcPr>
           <w:p>
             <w:pPr>
               <w:jc w:val="both"/>
               <w:rPr>
                 <w:rFonts w:ascii="Times New Roman" w:hAnsi="Times New Roman" w:cs="Times New Roman"/>
-              </w:rPr>
-            </w:pPr>
-            <w:r>
-              <w:rPr>
-                <w:rFonts w:ascii="Times New Roman" w:hAnsi="Times New Roman" w:cs="Times New Roman"/>
+                <w:sz w:val="22"/>
+                <w:szCs w:val="22"/>
+              </w:rPr>
+            </w:pPr>
+            <w:r>
+              <w:rPr>
+                <w:rFonts w:ascii="Times New Roman" w:hAnsi="Times New Roman" w:cs="Times New Roman"/>
+                <w:sz w:val="22"/>
+                <w:szCs w:val="22"/>
               </w:rPr>
               <w:t>Learning SAP</w:t>
             </w:r>
@@ -2782,18 +2850,22 @@
         </w:tc>
         <w:tc>
           <w:tcPr>
-            <w:tcW w:w="2267" w:type="dxa"/>
+            <w:tcW w:w="0" w:type="auto"/>
           </w:tcPr>
           <w:p>
             <w:pPr>
               <w:jc w:val="both"/>
               <w:rPr>
                 <w:rFonts w:ascii="Times New Roman" w:hAnsi="Times New Roman" w:cs="Times New Roman"/>
-              </w:rPr>
-            </w:pPr>
-            <w:r>
-              <w:rPr>
-                <w:rFonts w:ascii="Times New Roman" w:hAnsi="Times New Roman" w:cs="Times New Roman"/>
+                <w:sz w:val="22"/>
+                <w:szCs w:val="22"/>
+              </w:rPr>
+            </w:pPr>
+            <w:r>
+              <w:rPr>
+                <w:rFonts w:ascii="Times New Roman" w:hAnsi="Times New Roman" w:cs="Times New Roman"/>
+                <w:sz w:val="22"/>
+                <w:szCs w:val="22"/>
               </w:rPr>
               <w:t>15.01.2026</w:t>
             </w:r>
@@ -2803,37 +2875,61 @@
       <w:tr>
         <w:tc>
           <w:tcPr>
-            <w:tcW w:w="3823" w:type="dxa"/>
+            <w:tcW w:w="0" w:type="auto"/>
           </w:tcPr>
           <w:p>
             <w:pPr>
               <w:jc w:val="both"/>
               <w:rPr>
                 <w:rFonts w:ascii="Times New Roman" w:hAnsi="Times New Roman" w:cs="Times New Roman"/>
-              </w:rPr>
-            </w:pPr>
-            <w:r>
-              <w:rPr>
-                <w:rFonts w:ascii="Times New Roman" w:hAnsi="Times New Roman" w:cs="Times New Roman"/>
-              </w:rPr>
-              <w:t>Enhancing the Organizational Structure</w:t>
-            </w:r>
-          </w:p>
-        </w:tc>
-        <w:tc>
-          <w:tcPr>
-            <w:tcW w:w="1275" w:type="dxa"/>
+                <w:sz w:val="22"/>
+                <w:szCs w:val="22"/>
+              </w:rPr>
+            </w:pPr>
+            <w:r>
+              <w:rPr>
+                <w:rFonts w:ascii="Times New Roman" w:hAnsi="Times New Roman" w:cs="Times New Roman"/>
+                <w:sz w:val="22"/>
+                <w:szCs w:val="22"/>
+              </w:rPr>
+              <w:t>Enhancing</w:t>
+            </w:r>
+            <w:r>
+              <w:rPr>
+                <w:rFonts w:ascii="Times New Roman" w:hAnsi="Times New Roman" w:cs="Times New Roman"/>
+                <w:sz w:val="22"/>
+                <w:szCs w:val="22"/>
+              </w:rPr>
+              <w:t xml:space="preserve"> T</w:t>
+            </w:r>
+            <w:r>
+              <w:rPr>
+                <w:rFonts w:ascii="Times New Roman" w:hAnsi="Times New Roman" w:cs="Times New Roman"/>
+                <w:sz w:val="22"/>
+                <w:szCs w:val="22"/>
+              </w:rPr>
+              <w:t>he Organizational Structure</w:t>
+            </w:r>
+          </w:p>
+        </w:tc>
+        <w:tc>
+          <w:tcPr>
+            <w:tcW w:w="0" w:type="auto"/>
           </w:tcPr>
           <w:p>
             <w:pPr>
               <w:jc w:val="both"/>
               <w:rPr>
                 <w:rFonts w:ascii="Times New Roman" w:hAnsi="Times New Roman" w:cs="Times New Roman"/>
-              </w:rPr>
-            </w:pPr>
-            <w:r>
-              <w:rPr>
-                <w:rFonts w:ascii="Times New Roman" w:hAnsi="Times New Roman" w:cs="Times New Roman"/>
+                <w:sz w:val="22"/>
+                <w:szCs w:val="22"/>
+              </w:rPr>
+            </w:pPr>
+            <w:r>
+              <w:rPr>
+                <w:rFonts w:ascii="Times New Roman" w:hAnsi="Times New Roman" w:cs="Times New Roman"/>
+                <w:sz w:val="22"/>
+                <w:szCs w:val="22"/>
               </w:rPr>
               <w:t>-</w:t>
             </w:r>
@@ -2841,18 +2937,22 @@
         </w:tc>
         <w:tc>
           <w:tcPr>
-            <w:tcW w:w="1985" w:type="dxa"/>
+            <w:tcW w:w="0" w:type="auto"/>
           </w:tcPr>
           <w:p>
             <w:pPr>
               <w:jc w:val="both"/>
               <w:rPr>
                 <w:rFonts w:ascii="Times New Roman" w:hAnsi="Times New Roman" w:cs="Times New Roman"/>
-              </w:rPr>
-            </w:pPr>
-            <w:r>
-              <w:rPr>
-                <w:rFonts w:ascii="Times New Roman" w:hAnsi="Times New Roman" w:cs="Times New Roman"/>
+                <w:sz w:val="22"/>
+                <w:szCs w:val="22"/>
+              </w:rPr>
+            </w:pPr>
+            <w:r>
+              <w:rPr>
+                <w:rFonts w:ascii="Times New Roman" w:hAnsi="Times New Roman" w:cs="Times New Roman"/>
+                <w:sz w:val="22"/>
+                <w:szCs w:val="22"/>
               </w:rPr>
               <w:t>Learning SAP</w:t>
             </w:r>
@@ -2860,18 +2960,22 @@
         </w:tc>
         <w:tc>
           <w:tcPr>
-            <w:tcW w:w="2267" w:type="dxa"/>
+            <w:tcW w:w="0" w:type="auto"/>
           </w:tcPr>
           <w:p>
             <w:pPr>
               <w:jc w:val="both"/>
               <w:rPr>
                 <w:rFonts w:ascii="Times New Roman" w:hAnsi="Times New Roman" w:cs="Times New Roman"/>
-              </w:rPr>
-            </w:pPr>
-            <w:r>
-              <w:rPr>
-                <w:rFonts w:ascii="Times New Roman" w:hAnsi="Times New Roman" w:cs="Times New Roman"/>
+                <w:sz w:val="22"/>
+                <w:szCs w:val="22"/>
+              </w:rPr>
+            </w:pPr>
+            <w:r>
+              <w:rPr>
+                <w:rFonts w:ascii="Times New Roman" w:hAnsi="Times New Roman" w:cs="Times New Roman"/>
+                <w:sz w:val="22"/>
+                <w:szCs w:val="22"/>
               </w:rPr>
               <w:t>15.01.2026</w:t>
             </w:r>
@@ -2881,18 +2985,22 @@
       <w:tr>
         <w:tc>
           <w:tcPr>
-            <w:tcW w:w="3823" w:type="dxa"/>
+            <w:tcW w:w="0" w:type="auto"/>
           </w:tcPr>
           <w:p>
             <w:pPr>
               <w:jc w:val="both"/>
               <w:rPr>
                 <w:rFonts w:ascii="Times New Roman" w:hAnsi="Times New Roman" w:cs="Times New Roman"/>
-              </w:rPr>
-            </w:pPr>
-            <w:r>
-              <w:rPr>
-                <w:rFonts w:ascii="Times New Roman" w:hAnsi="Times New Roman" w:cs="Times New Roman"/>
+                <w:sz w:val="22"/>
+                <w:szCs w:val="22"/>
+              </w:rPr>
+            </w:pPr>
+            <w:r>
+              <w:rPr>
+                <w:rFonts w:ascii="Times New Roman" w:hAnsi="Times New Roman" w:cs="Times New Roman"/>
+                <w:sz w:val="22"/>
+                <w:szCs w:val="22"/>
               </w:rPr>
               <w:t>Mastering SAP HCM Organizational Management Concepts &amp; Key Transactions PO10, PO30, Plan Versions</w:t>
             </w:r>
@@ -2900,18 +3008,22 @@
         </w:tc>
         <w:tc>
           <w:tcPr>
-            <w:tcW w:w="1275" w:type="dxa"/>
+            <w:tcW w:w="0" w:type="auto"/>
           </w:tcPr>
           <w:p>
             <w:pPr>
               <w:jc w:val="both"/>
               <w:rPr>
                 <w:rFonts w:ascii="Times New Roman" w:hAnsi="Times New Roman" w:cs="Times New Roman"/>
-              </w:rPr>
-            </w:pPr>
-            <w:r>
-              <w:rPr>
-                <w:rFonts w:ascii="Times New Roman" w:hAnsi="Times New Roman" w:cs="Times New Roman"/>
+                <w:sz w:val="22"/>
+                <w:szCs w:val="22"/>
+              </w:rPr>
+            </w:pPr>
+            <w:r>
+              <w:rPr>
+                <w:rFonts w:ascii="Times New Roman" w:hAnsi="Times New Roman" w:cs="Times New Roman"/>
+                <w:sz w:val="22"/>
+                <w:szCs w:val="22"/>
               </w:rPr>
               <w:t>-</w:t>
             </w:r>
@@ -2919,18 +3031,22 @@
         </w:tc>
         <w:tc>
           <w:tcPr>
-            <w:tcW w:w="1985" w:type="dxa"/>
+            <w:tcW w:w="0" w:type="auto"/>
           </w:tcPr>
           <w:p>
             <w:pPr>
               <w:jc w:val="both"/>
               <w:rPr>
                 <w:rFonts w:ascii="Times New Roman" w:hAnsi="Times New Roman" w:cs="Times New Roman"/>
-              </w:rPr>
-            </w:pPr>
-            <w:r>
-              <w:rPr>
-                <w:rFonts w:ascii="Times New Roman" w:hAnsi="Times New Roman" w:cs="Times New Roman"/>
+                <w:sz w:val="22"/>
+                <w:szCs w:val="22"/>
+              </w:rPr>
+            </w:pPr>
+            <w:r>
+              <w:rPr>
+                <w:rFonts w:ascii="Times New Roman" w:hAnsi="Times New Roman" w:cs="Times New Roman"/>
+                <w:sz w:val="22"/>
+                <w:szCs w:val="22"/>
               </w:rPr>
               <w:t>VAUSNET</w:t>
             </w:r>
@@ -2940,11 +3056,15 @@
               <w:jc w:val="both"/>
               <w:rPr>
                 <w:rFonts w:ascii="Times New Roman" w:hAnsi="Times New Roman" w:cs="Times New Roman"/>
-              </w:rPr>
-            </w:pPr>
-            <w:r>
-              <w:rPr>
-                <w:rFonts w:ascii="Times New Roman" w:hAnsi="Times New Roman" w:cs="Times New Roman"/>
+                <w:sz w:val="22"/>
+                <w:szCs w:val="22"/>
+              </w:rPr>
+            </w:pPr>
+            <w:r>
+              <w:rPr>
+                <w:rFonts w:ascii="Times New Roman" w:hAnsi="Times New Roman" w:cs="Times New Roman"/>
+                <w:sz w:val="22"/>
+                <w:szCs w:val="22"/>
               </w:rPr>
               <w:t>SAP Expert</w:t>
             </w:r>
@@ -2952,18 +3072,22 @@
         </w:tc>
         <w:tc>
           <w:tcPr>
-            <w:tcW w:w="2267" w:type="dxa"/>
+            <w:tcW w:w="0" w:type="auto"/>
           </w:tcPr>
           <w:p>
             <w:pPr>
               <w:jc w:val="both"/>
               <w:rPr>
                 <w:rFonts w:ascii="Times New Roman" w:hAnsi="Times New Roman" w:cs="Times New Roman"/>
-              </w:rPr>
-            </w:pPr>
-            <w:r>
-              <w:rPr>
-                <w:rFonts w:ascii="Times New Roman" w:hAnsi="Times New Roman" w:cs="Times New Roman"/>
+                <w:sz w:val="22"/>
+                <w:szCs w:val="22"/>
+              </w:rPr>
+            </w:pPr>
+            <w:r>
+              <w:rPr>
+                <w:rFonts w:ascii="Times New Roman" w:hAnsi="Times New Roman" w:cs="Times New Roman"/>
+                <w:sz w:val="22"/>
+                <w:szCs w:val="22"/>
               </w:rPr>
               <w:t>15.01.2026</w:t>
             </w:r>
@@ -2973,18 +3097,22 @@
       <w:tr>
         <w:tc>
           <w:tcPr>
-            <w:tcW w:w="3823" w:type="dxa"/>
+            <w:tcW w:w="0" w:type="auto"/>
           </w:tcPr>
           <w:p>
             <w:pPr>
               <w:jc w:val="both"/>
               <w:rPr>
                 <w:rFonts w:ascii="Times New Roman" w:hAnsi="Times New Roman" w:cs="Times New Roman"/>
-              </w:rPr>
-            </w:pPr>
-            <w:r>
-              <w:rPr>
-                <w:rFonts w:ascii="Times New Roman" w:hAnsi="Times New Roman" w:cs="Times New Roman"/>
+                <w:sz w:val="22"/>
+                <w:szCs w:val="22"/>
+              </w:rPr>
+            </w:pPr>
+            <w:r>
+              <w:rPr>
+                <w:rFonts w:ascii="Times New Roman" w:hAnsi="Times New Roman" w:cs="Times New Roman"/>
+                <w:sz w:val="22"/>
+                <w:szCs w:val="22"/>
               </w:rPr>
               <w:t>SAP HR Tutorial</w:t>
             </w:r>
@@ -2992,18 +3120,22 @@
         </w:tc>
         <w:tc>
           <w:tcPr>
-            <w:tcW w:w="1275" w:type="dxa"/>
+            <w:tcW w:w="0" w:type="auto"/>
           </w:tcPr>
           <w:p>
             <w:pPr>
               <w:jc w:val="both"/>
               <w:rPr>
                 <w:rFonts w:ascii="Times New Roman" w:hAnsi="Times New Roman" w:cs="Times New Roman"/>
-              </w:rPr>
-            </w:pPr>
-            <w:r>
-              <w:rPr>
-                <w:rFonts w:ascii="Times New Roman" w:hAnsi="Times New Roman" w:cs="Times New Roman"/>
+                <w:sz w:val="22"/>
+                <w:szCs w:val="22"/>
+              </w:rPr>
+            </w:pPr>
+            <w:r>
+              <w:rPr>
+                <w:rFonts w:ascii="Times New Roman" w:hAnsi="Times New Roman" w:cs="Times New Roman"/>
+                <w:sz w:val="22"/>
+                <w:szCs w:val="22"/>
               </w:rPr>
               <w:t>-</w:t>
             </w:r>
@@ -3011,18 +3143,22 @@
         </w:tc>
         <w:tc>
           <w:tcPr>
-            <w:tcW w:w="1985" w:type="dxa"/>
+            <w:tcW w:w="0" w:type="auto"/>
           </w:tcPr>
           <w:p>
             <w:pPr>
               <w:jc w:val="both"/>
               <w:rPr>
                 <w:rFonts w:ascii="Times New Roman" w:hAnsi="Times New Roman" w:cs="Times New Roman"/>
-              </w:rPr>
-            </w:pPr>
-            <w:r>
-              <w:rPr>
-                <w:rFonts w:ascii="Times New Roman" w:hAnsi="Times New Roman" w:cs="Times New Roman"/>
+                <w:sz w:val="22"/>
+                <w:szCs w:val="22"/>
+              </w:rPr>
+            </w:pPr>
+            <w:r>
+              <w:rPr>
+                <w:rFonts w:ascii="Times New Roman" w:hAnsi="Times New Roman" w:cs="Times New Roman"/>
+                <w:sz w:val="22"/>
+                <w:szCs w:val="22"/>
               </w:rPr>
               <w:t>SAP Expert</w:t>
             </w:r>
@@ -3030,18 +3166,22 @@
         </w:tc>
         <w:tc>
           <w:tcPr>
-            <w:tcW w:w="2267" w:type="dxa"/>
+            <w:tcW w:w="0" w:type="auto"/>
           </w:tcPr>
           <w:p>
             <w:pPr>
               <w:jc w:val="both"/>
               <w:rPr>
                 <w:rFonts w:ascii="Times New Roman" w:hAnsi="Times New Roman" w:cs="Times New Roman"/>
-              </w:rPr>
-            </w:pPr>
-            <w:r>
-              <w:rPr>
-                <w:rFonts w:ascii="Times New Roman" w:hAnsi="Times New Roman" w:cs="Times New Roman"/>
+                <w:sz w:val="22"/>
+                <w:szCs w:val="22"/>
+              </w:rPr>
+            </w:pPr>
+            <w:r>
+              <w:rPr>
+                <w:rFonts w:ascii="Times New Roman" w:hAnsi="Times New Roman" w:cs="Times New Roman"/>
+                <w:sz w:val="22"/>
+                <w:szCs w:val="22"/>
               </w:rPr>
               <w:t>15.01.2026</w:t>
             </w:r>
@@ -3059,6 +3199,15 @@
     </w:p>
     <w:sdt>
       <w:sdtPr>
+        <w:rPr>
+          <w:rFonts w:ascii="Times New Roman" w:eastAsiaTheme="minorEastAsia" w:hAnsi="Times New Roman" w:cs="Times New Roman"/>
+          <w:color w:val="auto"/>
+          <w:kern w:val="2"/>
+          <w:sz w:val="24"/>
+          <w:szCs w:val="24"/>
+          <w:lang w:eastAsia="ja-JP"/>
+          <w14:ligatures w14:val="standardContextual"/>
+        </w:rPr>
         <w:id w:val="1555344221"/>
         <w:docPartObj>
           <w:docPartGallery w:val="Table of Contents"/>
@@ -3067,16 +3216,7 @@
       </w:sdtPr>
       <w:sdtEndPr>
         <w:rPr>
-          <w:rFonts w:asciiTheme="minorHAnsi" w:eastAsiaTheme="minorEastAsia" w:hAnsiTheme="minorHAnsi" w:cstheme="minorBidi"/>
-          <w:b/>
-          <w:bCs/>
           <w:noProof/>
-          <w:color w:val="auto"/>
-          <w:kern w:val="2"/>
-          <w:sz w:val="24"/>
-          <w:szCs w:val="24"/>
-          <w:lang w:eastAsia="ja-JP"/>
-          <w14:ligatures w14:val="standardContextual"/>
         </w:rPr>
       </w:sdtEndPr>
       <w:sdtContent>
@@ -3130,13 +3270,11 @@
             </w:rPr>
             <w:fldChar w:fldCharType="separate"/>
           </w:r>
-          <w:hyperlink w:anchor="_Toc226556362" w:history="1">
+          <w:hyperlink w:anchor="_Toc226623688" w:history="1">
             <w:r>
               <w:rPr>
                 <w:rStyle w:val="Hyperlink"/>
                 <w:rFonts w:ascii="Times New Roman" w:hAnsi="Times New Roman" w:cs="Times New Roman"/>
-                <w:b/>
-                <w:bCs/>
                 <w:noProof/>
               </w:rPr>
               <w:t>1</w:t>
@@ -3152,8 +3290,6 @@
               <w:rPr>
                 <w:rStyle w:val="Hyperlink"/>
                 <w:rFonts w:ascii="Times New Roman" w:hAnsi="Times New Roman" w:cs="Times New Roman"/>
-                <w:b/>
-                <w:bCs/>
                 <w:noProof/>
               </w:rPr>
               <w:t>Introduction</w:t>
@@ -3180,7 +3316,7 @@
                 <w:noProof/>
                 <w:webHidden/>
               </w:rPr>
-              <w:instrText xml:space="preserve"> PAGEREF _Toc226556362 \h </w:instrText>
+              <w:instrText xml:space="preserve"> PAGEREF _Toc226623688 \h </w:instrText>
             </w:r>
             <w:r>
               <w:rPr>
@@ -3227,13 +3363,11 @@
               <w:noProof/>
             </w:rPr>
           </w:pPr>
-          <w:hyperlink w:anchor="_Toc226556363" w:history="1">
+          <w:hyperlink w:anchor="_Toc226623689" w:history="1">
             <w:r>
               <w:rPr>
                 <w:rStyle w:val="Hyperlink"/>
                 <w:rFonts w:ascii="Times New Roman" w:hAnsi="Times New Roman" w:cs="Times New Roman"/>
-                <w:b/>
-                <w:bCs/>
                 <w:noProof/>
               </w:rPr>
               <w:t>2</w:t>
@@ -3249,8 +3383,6 @@
               <w:rPr>
                 <w:rStyle w:val="Hyperlink"/>
                 <w:rFonts w:ascii="Times New Roman" w:hAnsi="Times New Roman" w:cs="Times New Roman"/>
-                <w:b/>
-                <w:bCs/>
                 <w:noProof/>
               </w:rPr>
               <w:t>Problem/Impact/Successful Outcome</w:t>
@@ -3277,7 +3409,7 @@
                 <w:noProof/>
                 <w:webHidden/>
               </w:rPr>
-              <w:instrText xml:space="preserve"> PAGEREF _Toc226556363 \h </w:instrText>
+              <w:instrText xml:space="preserve"> PAGEREF _Toc226623689 \h </w:instrText>
             </w:r>
             <w:r>
               <w:rPr>
@@ -3300,7 +3432,7 @@
                 <w:noProof/>
                 <w:webHidden/>
               </w:rPr>
-              <w:t>3</w:t>
+              <w:t>4</w:t>
             </w:r>
             <w:r>
               <w:rPr>
@@ -3313,11 +3445,207 @@
           </w:hyperlink>
         </w:p>
         <w:p>
+          <w:pPr>
+            <w:pStyle w:val="TOC1"/>
+            <w:tabs>
+              <w:tab w:val="left" w:pos="480"/>
+              <w:tab w:val="right" w:leader="dot" w:pos="9350"/>
+            </w:tabs>
+            <w:rPr>
+              <w:rFonts w:ascii="Times New Roman" w:hAnsi="Times New Roman" w:cs="Times New Roman"/>
+              <w:noProof/>
+            </w:rPr>
+          </w:pPr>
+          <w:hyperlink w:anchor="_Toc226623690" w:history="1">
+            <w:r>
+              <w:rPr>
+                <w:rStyle w:val="Hyperlink"/>
+                <w:rFonts w:ascii="Times New Roman" w:hAnsi="Times New Roman" w:cs="Times New Roman"/>
+                <w:noProof/>
+              </w:rPr>
+              <w:t>3</w:t>
+            </w:r>
+            <w:r>
+              <w:rPr>
+                <w:rFonts w:ascii="Times New Roman" w:hAnsi="Times New Roman" w:cs="Times New Roman"/>
+                <w:noProof/>
+              </w:rPr>
+              <w:tab/>
+            </w:r>
+            <w:r>
+              <w:rPr>
+                <w:rStyle w:val="Hyperlink"/>
+                <w:rFonts w:ascii="Times New Roman" w:hAnsi="Times New Roman" w:cs="Times New Roman"/>
+                <w:noProof/>
+              </w:rPr>
+              <w:t>Objectives</w:t>
+            </w:r>
+            <w:r>
+              <w:rPr>
+                <w:rFonts w:ascii="Times New Roman" w:hAnsi="Times New Roman" w:cs="Times New Roman"/>
+                <w:noProof/>
+                <w:webHidden/>
+              </w:rPr>
+              <w:tab/>
+            </w:r>
+            <w:r>
+              <w:rPr>
+                <w:rFonts w:ascii="Times New Roman" w:hAnsi="Times New Roman" w:cs="Times New Roman"/>
+                <w:noProof/>
+                <w:webHidden/>
+              </w:rPr>
+              <w:fldChar w:fldCharType="begin"/>
+            </w:r>
+            <w:r>
+              <w:rPr>
+                <w:rFonts w:ascii="Times New Roman" w:hAnsi="Times New Roman" w:cs="Times New Roman"/>
+                <w:noProof/>
+                <w:webHidden/>
+              </w:rPr>
+              <w:instrText xml:space="preserve"> PAGEREF _Toc226623690 \h </w:instrText>
+            </w:r>
+            <w:r>
+              <w:rPr>
+                <w:rFonts w:ascii="Times New Roman" w:hAnsi="Times New Roman" w:cs="Times New Roman"/>
+                <w:noProof/>
+                <w:webHidden/>
+              </w:rPr>
+            </w:r>
+            <w:r>
+              <w:rPr>
+                <w:rFonts w:ascii="Times New Roman" w:hAnsi="Times New Roman" w:cs="Times New Roman"/>
+                <w:noProof/>
+                <w:webHidden/>
+              </w:rPr>
+              <w:fldChar w:fldCharType="separate"/>
+            </w:r>
+            <w:r>
+              <w:rPr>
+                <w:rFonts w:ascii="Times New Roman" w:hAnsi="Times New Roman" w:cs="Times New Roman"/>
+                <w:noProof/>
+                <w:webHidden/>
+              </w:rPr>
+              <w:t>5</w:t>
+            </w:r>
+            <w:r>
+              <w:rPr>
+                <w:rFonts w:ascii="Times New Roman" w:hAnsi="Times New Roman" w:cs="Times New Roman"/>
+                <w:noProof/>
+                <w:webHidden/>
+              </w:rPr>
+              <w:fldChar w:fldCharType="end"/>
+            </w:r>
+          </w:hyperlink>
+        </w:p>
+        <w:p>
+          <w:pPr>
+            <w:pStyle w:val="TOC1"/>
+            <w:tabs>
+              <w:tab w:val="left" w:pos="480"/>
+              <w:tab w:val="right" w:leader="dot" w:pos="9350"/>
+            </w:tabs>
+            <w:rPr>
+              <w:rFonts w:ascii="Times New Roman" w:hAnsi="Times New Roman" w:cs="Times New Roman"/>
+              <w:noProof/>
+            </w:rPr>
+          </w:pPr>
+          <w:hyperlink w:anchor="_Toc226623691" w:history="1">
+            <w:r>
+              <w:rPr>
+                <w:rStyle w:val="Hyperlink"/>
+                <w:rFonts w:ascii="Times New Roman" w:hAnsi="Times New Roman" w:cs="Times New Roman"/>
+                <w:noProof/>
+              </w:rPr>
+              <w:t>4</w:t>
+            </w:r>
+            <w:r>
+              <w:rPr>
+                <w:rFonts w:ascii="Times New Roman" w:hAnsi="Times New Roman" w:cs="Times New Roman"/>
+                <w:noProof/>
+              </w:rPr>
+              <w:tab/>
+            </w:r>
+            <w:r>
+              <w:rPr>
+                <w:rStyle w:val="Hyperlink"/>
+                <w:rFonts w:ascii="Times New Roman" w:hAnsi="Times New Roman" w:cs="Times New Roman"/>
+                <w:noProof/>
+              </w:rPr>
+              <w:t>Purpose Of Document</w:t>
+            </w:r>
+            <w:r>
+              <w:rPr>
+                <w:rFonts w:ascii="Times New Roman" w:hAnsi="Times New Roman" w:cs="Times New Roman"/>
+                <w:noProof/>
+                <w:webHidden/>
+              </w:rPr>
+              <w:tab/>
+            </w:r>
+            <w:r>
+              <w:rPr>
+                <w:rFonts w:ascii="Times New Roman" w:hAnsi="Times New Roman" w:cs="Times New Roman"/>
+                <w:noProof/>
+                <w:webHidden/>
+              </w:rPr>
+              <w:fldChar w:fldCharType="begin"/>
+            </w:r>
+            <w:r>
+              <w:rPr>
+                <w:rFonts w:ascii="Times New Roman" w:hAnsi="Times New Roman" w:cs="Times New Roman"/>
+                <w:noProof/>
+                <w:webHidden/>
+              </w:rPr>
+              <w:instrText xml:space="preserve"> PAGEREF _Toc226623691 \h </w:instrText>
+            </w:r>
+            <w:r>
+              <w:rPr>
+                <w:rFonts w:ascii="Times New Roman" w:hAnsi="Times New Roman" w:cs="Times New Roman"/>
+                <w:noProof/>
+                <w:webHidden/>
+              </w:rPr>
+            </w:r>
+            <w:r>
+              <w:rPr>
+                <w:rFonts w:ascii="Times New Roman" w:hAnsi="Times New Roman" w:cs="Times New Roman"/>
+                <w:noProof/>
+                <w:webHidden/>
+              </w:rPr>
+              <w:fldChar w:fldCharType="separate"/>
+            </w:r>
+            <w:r>
+              <w:rPr>
+                <w:rFonts w:ascii="Times New Roman" w:hAnsi="Times New Roman" w:cs="Times New Roman"/>
+                <w:noProof/>
+                <w:webHidden/>
+              </w:rPr>
+              <w:t>6</w:t>
+            </w:r>
+            <w:r>
+              <w:rPr>
+                <w:rFonts w:ascii="Times New Roman" w:hAnsi="Times New Roman" w:cs="Times New Roman"/>
+                <w:noProof/>
+                <w:webHidden/>
+              </w:rPr>
+              <w:fldChar w:fldCharType="end"/>
+            </w:r>
+          </w:hyperlink>
+        </w:p>
+        <w:p>
+          <w:pPr>
+            <w:pStyle w:val="Header"/>
+            <w:tabs>
+              <w:tab w:val="clear" w:pos="4680"/>
+              <w:tab w:val="clear" w:pos="9360"/>
+            </w:tabs>
+            <w:spacing w:after="160" w:line="278" w:lineRule="auto"/>
+            <w:rPr>
+              <w:rFonts w:ascii="Times New Roman" w:hAnsi="Times New Roman" w:cs="Times New Roman"/>
+              <w:noProof/>
+            </w:rPr>
+          </w:pPr>
           <w:r>
             <w:rPr>
               <w:rFonts w:ascii="Times New Roman" w:hAnsi="Times New Roman" w:cs="Times New Roman"/>
-              <w:b/>
-              <w:bCs/>
               <w:noProof/>
             </w:rPr>
             <w:fldChar w:fldCharType="end"/>
@@ -3431,62 +3759,6 @@
     </w:p>
     <w:p>
       <w:pPr>
-        <w:jc w:val="both"/>
-        <w:rPr>
-          <w:rFonts w:ascii="Times New Roman" w:hAnsi="Times New Roman" w:cs="Times New Roman"/>
-        </w:rPr>
-      </w:pPr>
-    </w:p>
-    <w:p>
-      <w:pPr>
-        <w:jc w:val="both"/>
-        <w:rPr>
-          <w:rFonts w:ascii="Times New Roman" w:hAnsi="Times New Roman" w:cs="Times New Roman"/>
-        </w:rPr>
-      </w:pPr>
-    </w:p>
-    <w:p>
-      <w:pPr>
-        <w:jc w:val="both"/>
-        <w:rPr>
-          <w:rFonts w:ascii="Times New Roman" w:hAnsi="Times New Roman" w:cs="Times New Roman"/>
-        </w:rPr>
-      </w:pPr>
-    </w:p>
-    <w:p>
-      <w:pPr>
-        <w:jc w:val="both"/>
-        <w:rPr>
-          <w:rFonts w:ascii="Times New Roman" w:hAnsi="Times New Roman" w:cs="Times New Roman"/>
-        </w:rPr>
-      </w:pPr>
-    </w:p>
-    <w:p>
-      <w:pPr>
-        <w:jc w:val="both"/>
-        <w:rPr>
-          <w:rFonts w:ascii="Times New Roman" w:hAnsi="Times New Roman" w:cs="Times New Roman"/>
-        </w:rPr>
-      </w:pPr>
-    </w:p>
-    <w:p>
-      <w:pPr>
-        <w:jc w:val="both"/>
-        <w:rPr>
-          <w:rFonts w:ascii="Times New Roman" w:hAnsi="Times New Roman" w:cs="Times New Roman"/>
-        </w:rPr>
-      </w:pPr>
-    </w:p>
-    <w:p>
-      <w:pPr>
-        <w:jc w:val="both"/>
-        <w:rPr>
-          <w:rFonts w:ascii="Times New Roman" w:hAnsi="Times New Roman" w:cs="Times New Roman"/>
-        </w:rPr>
-      </w:pPr>
-    </w:p>
-    <w:p>
-      <w:pPr>
         <w:pStyle w:val="Heading1"/>
         <w:rPr>
           <w:rFonts w:ascii="Times New Roman" w:hAnsi="Times New Roman" w:cs="Times New Roman"/>
@@ -3497,7 +3769,7 @@
           <w:szCs w:val="28"/>
         </w:rPr>
       </w:pPr>
-      <w:bookmarkStart w:id="0" w:name="_Toc226556362"/>
+      <w:bookmarkStart w:id="0" w:name="_Toc226623688"/>
       <w:r>
         <w:rPr>
           <w:rFonts w:ascii="Times New Roman" w:hAnsi="Times New Roman" w:cs="Times New Roman"/>
@@ -3522,70 +3794,7 @@
         <w:t>Introduction</w:t>
       </w:r>
       <w:bookmarkEnd w:id="0"/>
-    </w:p>
-    <w:p>
-      <w:pPr>
-        <w:pStyle w:val="BodyText"/>
-      </w:pPr>
       <w:r>
-        <w:t xml:space="preserve">The “Work </w:t>
-      </w:r>
-      <w:r>
-        <w:t xml:space="preserve">Calendar </w:t>
-      </w:r>
-      <w:r>
-        <w:t>Management</w:t>
-      </w:r>
-      <w:r>
-        <w:t xml:space="preserve"> by Department in ERP Systems</w:t>
-      </w:r>
-      <w:r>
-        <w:t xml:space="preserve">” project was established to address the specific needs of time management in companies using the SAP system. </w:t>
-      </w:r>
-    </w:p>
-    <w:p>
-      <w:pPr>
-        <w:jc w:val="both"/>
-        <w:rPr>
-          <w:rFonts w:ascii="Times New Roman" w:hAnsi="Times New Roman" w:cs="Times New Roman"/>
-        </w:rPr>
-      </w:pPr>
-      <w:r>
-        <w:rPr>
-          <w:rFonts w:ascii="Times New Roman" w:hAnsi="Times New Roman" w:cs="Times New Roman"/>
-        </w:rPr>
-        <w:t xml:space="preserve">Within the HCM (Human Capital Management) module, maintaining an accurate and flexible work schedule tailored to each organizational unit is the foundation for payroll processing, absence management, and resource optimization. </w:t>
-      </w:r>
-    </w:p>
-    <w:p>
-      <w:pPr>
-        <w:jc w:val="both"/>
-        <w:rPr>
-          <w:rFonts w:ascii="Times New Roman" w:hAnsi="Times New Roman" w:cs="Times New Roman"/>
-        </w:rPr>
-      </w:pPr>
-      <w:r>
-        <w:rPr>
-          <w:rFonts w:ascii="Times New Roman" w:hAnsi="Times New Roman" w:cs="Times New Roman"/>
-        </w:rPr>
-        <w:t xml:space="preserve">This project focuses on developing a custom tool on the ABAP platform, utilizing hybrid interface technology (SMW0 &amp; SM30) to provide a user-friendly experience while ensuring the stability and security of the core ERP system. </w:t>
-      </w:r>
-    </w:p>
-    <w:p>
-      <w:pPr>
-        <w:jc w:val="both"/>
-        <w:rPr>
-          <w:rFonts w:ascii="Times New Roman" w:hAnsi="Times New Roman" w:cs="Times New Roman"/>
-          <w:b/>
-          <w:bCs/>
-          <w:sz w:val="28"/>
-          <w:szCs w:val="28"/>
-        </w:rPr>
-      </w:pPr>
-    </w:p>
-    <w:p>
-      <w:pPr>
-        <w:pStyle w:val="Heading1"/>
         <w:rPr>
           <w:rFonts w:ascii="Times New Roman" w:hAnsi="Times New Roman" w:cs="Times New Roman"/>
           <w:b/>
@@ -3594,9 +3803,249 @@
           <w:sz w:val="28"/>
           <w:szCs w:val="28"/>
         </w:rPr>
-      </w:pPr>
-      <w:bookmarkStart w:id="1" w:name="_Toc226556363"/>
+        <w:t xml:space="preserve"> </w:t>
+      </w:r>
+    </w:p>
+    <w:p>
+      <w:pPr>
+        <w:rPr>
+          <w:rFonts w:ascii="Times New Roman" w:hAnsi="Times New Roman" w:cs="Times New Roman"/>
+          <w:sz w:val="22"/>
+          <w:szCs w:val="22"/>
+        </w:rPr>
+      </w:pPr>
       <w:r>
+        <w:rPr>
+          <w:rFonts w:ascii="Times New Roman" w:hAnsi="Times New Roman" w:cs="Times New Roman"/>
+          <w:sz w:val="22"/>
+          <w:szCs w:val="22"/>
+        </w:rPr>
+        <w:t xml:space="preserve">The “Work Calendar Management by Department” project is a strategic initiative designed to enhance the operational agility of time management within the SAP ERP ecosystem. </w:t>
+      </w:r>
+    </w:p>
+    <w:p>
+      <w:pPr>
+        <w:pStyle w:val="BodyText2"/>
+      </w:pPr>
+      <w:r>
+        <w:t xml:space="preserve">In the contemporary enterprise environment, while the SAP HCM (Human Capital Management) core provides a robust framework for personnel administration, there remains a critical gap between centralized system rigidity and the need for decentralized, department-level flexibility. </w:t>
+      </w:r>
+    </w:p>
+    <w:p>
+      <w:pPr>
+        <w:rPr>
+          <w:rFonts w:ascii="Times New Roman" w:hAnsi="Times New Roman" w:cs="Times New Roman"/>
+          <w:sz w:val="22"/>
+          <w:szCs w:val="22"/>
+        </w:rPr>
+      </w:pPr>
+      <w:r>
+        <w:rPr>
+          <w:rFonts w:ascii="Times New Roman" w:hAnsi="Times New Roman" w:cs="Times New Roman"/>
+          <w:sz w:val="22"/>
+          <w:szCs w:val="22"/>
+        </w:rPr>
+        <w:t xml:space="preserve">An accurate, transparent, and department-specific work schedule is the cornerstone of high-performing HR operations, directly impacting Payroll integrity, Workforce optimization, and Regulatory compliance. </w:t>
+      </w:r>
+    </w:p>
+    <w:p>
+      <w:pPr>
+        <w:rPr>
+          <w:rFonts w:ascii="Times New Roman" w:hAnsi="Times New Roman" w:cs="Times New Roman"/>
+          <w:sz w:val="22"/>
+          <w:szCs w:val="22"/>
+        </w:rPr>
+      </w:pPr>
+      <w:r>
+        <w:rPr>
+          <w:rFonts w:ascii="Times New Roman" w:hAnsi="Times New Roman" w:cs="Times New Roman"/>
+          <w:sz w:val="22"/>
+          <w:szCs w:val="22"/>
+        </w:rPr>
+        <w:t xml:space="preserve">This project aims to deliver a sophisticated Custom Add-on solution that bridges this gap, empowering Department Managers to govern their resources autonomously while maintaining absolute alignment with the core ERP architecture. </w:t>
+      </w:r>
+    </w:p>
+    <w:p>
+      <w:pPr>
+        <w:rPr>
+          <w:rFonts w:ascii="Times New Roman" w:hAnsi="Times New Roman" w:cs="Times New Roman"/>
+          <w:sz w:val="22"/>
+          <w:szCs w:val="22"/>
+        </w:rPr>
+      </w:pPr>
+      <w:r>
+        <w:rPr>
+          <w:rFonts w:ascii="Times New Roman" w:hAnsi="Times New Roman" w:cs="Times New Roman"/>
+          <w:sz w:val="22"/>
+          <w:szCs w:val="22"/>
+        </w:rPr>
+        <w:t>Developed on the SAP ABAP platform using a hybrid integration approach, this solution is engineered to deliver a modern web-like interaction (UX) while upholding the rigorous stability, security, and data integrity standards</w:t>
+      </w:r>
+      <w:r>
+        <w:rPr>
+          <w:rFonts w:ascii="Times New Roman" w:hAnsi="Times New Roman" w:cs="Times New Roman"/>
+          <w:sz w:val="22"/>
+          <w:szCs w:val="22"/>
+        </w:rPr>
+        <w:t xml:space="preserve"> compliance.</w:t>
+      </w:r>
+    </w:p>
+    <w:p>
+      <w:pPr>
+        <w:rPr>
+          <w:rFonts w:ascii="Times New Roman" w:hAnsi="Times New Roman" w:cs="Times New Roman"/>
+          <w:sz w:val="22"/>
+          <w:szCs w:val="22"/>
+        </w:rPr>
+      </w:pPr>
+    </w:p>
+    <w:p>
+      <w:pPr>
+        <w:rPr>
+          <w:rFonts w:ascii="Times New Roman" w:hAnsi="Times New Roman" w:cs="Times New Roman"/>
+          <w:sz w:val="22"/>
+          <w:szCs w:val="22"/>
+        </w:rPr>
+      </w:pPr>
+    </w:p>
+    <w:p>
+      <w:pPr>
+        <w:rPr>
+          <w:rFonts w:ascii="Times New Roman" w:hAnsi="Times New Roman" w:cs="Times New Roman"/>
+          <w:sz w:val="22"/>
+          <w:szCs w:val="22"/>
+        </w:rPr>
+      </w:pPr>
+    </w:p>
+    <w:p>
+      <w:pPr>
+        <w:rPr>
+          <w:rFonts w:ascii="Times New Roman" w:hAnsi="Times New Roman" w:cs="Times New Roman"/>
+          <w:sz w:val="22"/>
+          <w:szCs w:val="22"/>
+        </w:rPr>
+      </w:pPr>
+    </w:p>
+    <w:p>
+      <w:pPr>
+        <w:rPr>
+          <w:rFonts w:ascii="Times New Roman" w:hAnsi="Times New Roman" w:cs="Times New Roman"/>
+          <w:sz w:val="22"/>
+          <w:szCs w:val="22"/>
+        </w:rPr>
+      </w:pPr>
+    </w:p>
+    <w:p>
+      <w:pPr>
+        <w:rPr>
+          <w:rFonts w:ascii="Times New Roman" w:hAnsi="Times New Roman" w:cs="Times New Roman"/>
+          <w:sz w:val="22"/>
+          <w:szCs w:val="22"/>
+        </w:rPr>
+      </w:pPr>
+    </w:p>
+    <w:p>
+      <w:pPr>
+        <w:rPr>
+          <w:rFonts w:ascii="Times New Roman" w:hAnsi="Times New Roman" w:cs="Times New Roman"/>
+          <w:sz w:val="22"/>
+          <w:szCs w:val="22"/>
+        </w:rPr>
+      </w:pPr>
+    </w:p>
+    <w:p>
+      <w:pPr>
+        <w:rPr>
+          <w:rFonts w:ascii="Times New Roman" w:hAnsi="Times New Roman" w:cs="Times New Roman"/>
+          <w:sz w:val="22"/>
+          <w:szCs w:val="22"/>
+        </w:rPr>
+      </w:pPr>
+    </w:p>
+    <w:p>
+      <w:pPr>
+        <w:rPr>
+          <w:rFonts w:ascii="Times New Roman" w:hAnsi="Times New Roman" w:cs="Times New Roman"/>
+          <w:sz w:val="22"/>
+          <w:szCs w:val="22"/>
+        </w:rPr>
+      </w:pPr>
+    </w:p>
+    <w:p>
+      <w:pPr>
+        <w:rPr>
+          <w:rFonts w:ascii="Times New Roman" w:hAnsi="Times New Roman" w:cs="Times New Roman"/>
+          <w:sz w:val="22"/>
+          <w:szCs w:val="22"/>
+        </w:rPr>
+      </w:pPr>
+    </w:p>
+    <w:p>
+      <w:pPr>
+        <w:rPr>
+          <w:rFonts w:ascii="Times New Roman" w:hAnsi="Times New Roman" w:cs="Times New Roman"/>
+          <w:sz w:val="22"/>
+          <w:szCs w:val="22"/>
+        </w:rPr>
+      </w:pPr>
+    </w:p>
+    <w:p>
+      <w:pPr>
+        <w:rPr>
+          <w:rFonts w:ascii="Times New Roman" w:hAnsi="Times New Roman" w:cs="Times New Roman"/>
+          <w:sz w:val="22"/>
+          <w:szCs w:val="22"/>
+        </w:rPr>
+      </w:pPr>
+    </w:p>
+    <w:p>
+      <w:pPr>
+        <w:rPr>
+          <w:rFonts w:ascii="Times New Roman" w:hAnsi="Times New Roman" w:cs="Times New Roman"/>
+          <w:sz w:val="22"/>
+          <w:szCs w:val="22"/>
+        </w:rPr>
+      </w:pPr>
+    </w:p>
+    <w:p>
+      <w:pPr>
+        <w:rPr>
+          <w:rFonts w:ascii="Times New Roman" w:hAnsi="Times New Roman" w:cs="Times New Roman"/>
+          <w:sz w:val="22"/>
+          <w:szCs w:val="22"/>
+        </w:rPr>
+      </w:pPr>
+    </w:p>
+    <w:p>
+      <w:pPr>
+        <w:rPr>
+          <w:rFonts w:ascii="Times New Roman" w:hAnsi="Times New Roman" w:cs="Times New Roman"/>
+          <w:sz w:val="22"/>
+          <w:szCs w:val="22"/>
+        </w:rPr>
+      </w:pPr>
+    </w:p>
+    <w:p>
+      <w:pPr>
+        <w:rPr>
+          <w:rFonts w:ascii="Times New Roman" w:hAnsi="Times New Roman" w:cs="Times New Roman"/>
+          <w:sz w:val="22"/>
+          <w:szCs w:val="22"/>
+        </w:rPr>
+      </w:pPr>
+    </w:p>
+    <w:p>
+      <w:pPr>
+        <w:rPr>
+          <w:rFonts w:ascii="Times New Roman" w:hAnsi="Times New Roman" w:cs="Times New Roman"/>
+          <w:sz w:val="22"/>
+          <w:szCs w:val="22"/>
+        </w:rPr>
+      </w:pPr>
+    </w:p>
+    <w:p>
+      <w:pPr>
+        <w:pStyle w:val="Heading1"/>
         <w:rPr>
           <w:rFonts w:ascii="Times New Roman" w:hAnsi="Times New Roman" w:cs="Times New Roman"/>
           <w:b/>
@@ -3605,8 +4054,8 @@
           <w:sz w:val="28"/>
           <w:szCs w:val="28"/>
         </w:rPr>
-        <w:t>2</w:t>
-      </w:r>
+      </w:pPr>
+      <w:bookmarkStart w:id="1" w:name="_Toc226623689"/>
       <w:r>
         <w:rPr>
           <w:rFonts w:ascii="Times New Roman" w:hAnsi="Times New Roman" w:cs="Times New Roman"/>
@@ -3616,10 +4065,1754 @@
           <w:sz w:val="28"/>
           <w:szCs w:val="28"/>
         </w:rPr>
+        <w:t>2</w:t>
+      </w:r>
+      <w:r>
+        <w:rPr>
+          <w:rFonts w:ascii="Times New Roman" w:hAnsi="Times New Roman" w:cs="Times New Roman"/>
+          <w:b/>
+          <w:bCs/>
+          <w:color w:val="000000" w:themeColor="text1"/>
+          <w:sz w:val="28"/>
+          <w:szCs w:val="28"/>
+        </w:rPr>
         <w:tab/>
         <w:t>Problem/Impact/Successful Outcome</w:t>
       </w:r>
       <w:bookmarkEnd w:id="1"/>
+      <w:r>
+        <w:rPr>
+          <w:rFonts w:ascii="Times New Roman" w:hAnsi="Times New Roman" w:cs="Times New Roman"/>
+          <w:b/>
+          <w:bCs/>
+          <w:color w:val="000000" w:themeColor="text1"/>
+          <w:sz w:val="28"/>
+          <w:szCs w:val="28"/>
+        </w:rPr>
+        <w:t xml:space="preserve"> </w:t>
+      </w:r>
+    </w:p>
+    <w:tbl>
+      <w:tblPr>
+        <w:tblStyle w:val="TableGrid"/>
+        <w:tblW w:w="5000" w:type="pct"/>
+        <w:tblLook w:val="04A0" w:firstRow="1" w:lastRow="0" w:firstColumn="1" w:lastColumn="0" w:noHBand="0" w:noVBand="1"/>
+      </w:tblPr>
+      <w:tblGrid>
+        <w:gridCol w:w="3065"/>
+        <w:gridCol w:w="2835"/>
+        <w:gridCol w:w="3450"/>
+      </w:tblGrid>
+      <w:tr>
+        <w:tc>
+          <w:tcPr>
+            <w:tcW w:w="1639" w:type="pct"/>
+          </w:tcPr>
+          <w:p>
+            <w:pPr>
+              <w:rPr>
+                <w:rFonts w:ascii="Times New Roman" w:hAnsi="Times New Roman" w:cs="Times New Roman"/>
+                <w:b/>
+                <w:bCs/>
+              </w:rPr>
+            </w:pPr>
+            <w:r>
+              <w:rPr>
+                <w:rFonts w:ascii="Times New Roman" w:hAnsi="Times New Roman" w:cs="Times New Roman"/>
+                <w:b/>
+                <w:bCs/>
+              </w:rPr>
+              <w:t>The Problem</w:t>
+            </w:r>
+          </w:p>
+        </w:tc>
+        <w:tc>
+          <w:tcPr>
+            <w:tcW w:w="1516" w:type="pct"/>
+          </w:tcPr>
+          <w:p>
+            <w:pPr>
+              <w:rPr>
+                <w:rFonts w:ascii="Times New Roman" w:hAnsi="Times New Roman" w:cs="Times New Roman"/>
+                <w:b/>
+                <w:bCs/>
+              </w:rPr>
+            </w:pPr>
+            <w:r>
+              <w:rPr>
+                <w:rFonts w:ascii="Times New Roman" w:hAnsi="Times New Roman" w:cs="Times New Roman"/>
+                <w:b/>
+                <w:bCs/>
+              </w:rPr>
+              <w:t>The Impact</w:t>
+            </w:r>
+          </w:p>
+        </w:tc>
+        <w:tc>
+          <w:tcPr>
+            <w:tcW w:w="1845" w:type="pct"/>
+          </w:tcPr>
+          <w:p>
+            <w:pPr>
+              <w:rPr>
+                <w:rFonts w:ascii="Times New Roman" w:hAnsi="Times New Roman" w:cs="Times New Roman"/>
+                <w:b/>
+                <w:bCs/>
+              </w:rPr>
+            </w:pPr>
+            <w:r>
+              <w:rPr>
+                <w:rFonts w:ascii="Times New Roman" w:hAnsi="Times New Roman" w:cs="Times New Roman"/>
+                <w:b/>
+                <w:bCs/>
+              </w:rPr>
+              <w:t>The Successful Outcome</w:t>
+            </w:r>
+          </w:p>
+        </w:tc>
+      </w:tr>
+      <w:tr>
+        <w:tc>
+          <w:tcPr>
+            <w:tcW w:w="1639" w:type="pct"/>
+          </w:tcPr>
+          <w:p>
+            <w:pPr>
+              <w:pStyle w:val="Header"/>
+              <w:tabs>
+                <w:tab w:val="clear" w:pos="4680"/>
+                <w:tab w:val="clear" w:pos="9360"/>
+              </w:tabs>
+              <w:rPr>
+                <w:rFonts w:ascii="Times New Roman" w:hAnsi="Times New Roman" w:cs="Times New Roman"/>
+                <w:sz w:val="22"/>
+                <w:szCs w:val="22"/>
+              </w:rPr>
+            </w:pPr>
+            <w:r>
+              <w:rPr>
+                <w:rFonts w:ascii="Times New Roman" w:hAnsi="Times New Roman" w:cs="Times New Roman"/>
+                <w:sz w:val="22"/>
+                <w:szCs w:val="22"/>
+              </w:rPr>
+              <w:t>Standard ERP systems (such as SAP HCM Standard) typically manage schedules in the form of dry lists or configuration tables. Managers find it difficult to get an overview of the entire department’s work status for the month.</w:t>
+            </w:r>
+          </w:p>
+        </w:tc>
+        <w:tc>
+          <w:tcPr>
+            <w:tcW w:w="1516" w:type="pct"/>
+          </w:tcPr>
+          <w:p>
+            <w:pPr>
+              <w:rPr>
+                <w:rFonts w:ascii="Times New Roman" w:hAnsi="Times New Roman" w:cs="Times New Roman"/>
+                <w:sz w:val="22"/>
+                <w:szCs w:val="22"/>
+              </w:rPr>
+            </w:pPr>
+            <w:r>
+              <w:rPr>
+                <w:rFonts w:ascii="Times New Roman" w:hAnsi="Times New Roman" w:cs="Times New Roman"/>
+                <w:sz w:val="22"/>
+                <w:szCs w:val="22"/>
+              </w:rPr>
+              <w:t>Managers spend too much time answering questions about the schedule. Staff are scheduled at the wrong times, causing disruptions to the supply chain or customer service.</w:t>
+            </w:r>
+          </w:p>
+        </w:tc>
+        <w:tc>
+          <w:tcPr>
+            <w:tcW w:w="1845" w:type="pct"/>
+          </w:tcPr>
+          <w:p>
+            <w:pPr>
+              <w:rPr>
+                <w:rFonts w:ascii="Times New Roman" w:hAnsi="Times New Roman" w:cs="Times New Roman"/>
+                <w:sz w:val="22"/>
+                <w:szCs w:val="22"/>
+              </w:rPr>
+            </w:pPr>
+            <w:r>
+              <w:rPr>
+                <w:rFonts w:ascii="Times New Roman" w:hAnsi="Times New Roman" w:cs="Times New Roman"/>
+                <w:sz w:val="22"/>
+                <w:szCs w:val="22"/>
+              </w:rPr>
+              <w:t>Users have a modern calendar interface right within the SAP GUI. Working and holiday statuses are clearly distinguished by color (Green/Red/Yellow), enabling managers to make decisions in just a few seconds.</w:t>
+            </w:r>
+          </w:p>
+        </w:tc>
+      </w:tr>
+      <w:tr>
+        <w:tc>
+          <w:tcPr>
+            <w:tcW w:w="1639" w:type="pct"/>
+          </w:tcPr>
+          <w:p>
+            <w:pPr>
+              <w:rPr>
+                <w:rFonts w:ascii="Times New Roman" w:hAnsi="Times New Roman" w:cs="Times New Roman"/>
+                <w:sz w:val="22"/>
+                <w:szCs w:val="22"/>
+              </w:rPr>
+            </w:pPr>
+            <w:r>
+              <w:rPr>
+                <w:rFonts w:ascii="Times New Roman" w:hAnsi="Times New Roman" w:cs="Times New Roman"/>
+                <w:sz w:val="22"/>
+                <w:szCs w:val="22"/>
+              </w:rPr>
+              <w:t>Each department has its own unique characteristics (e.g., the technical team works 24/7, while the office team follows standard business hours). Using a rigid, company-wide calendar makes it difficult to coordinate on-site resources.</w:t>
+            </w:r>
+          </w:p>
+        </w:tc>
+        <w:tc>
+          <w:tcPr>
+            <w:tcW w:w="1516" w:type="pct"/>
+          </w:tcPr>
+          <w:p>
+            <w:pPr>
+              <w:rPr>
+                <w:rFonts w:ascii="Times New Roman" w:hAnsi="Times New Roman" w:cs="Times New Roman"/>
+                <w:sz w:val="22"/>
+                <w:szCs w:val="22"/>
+              </w:rPr>
+            </w:pPr>
+            <w:r>
+              <w:rPr>
+                <w:rFonts w:ascii="Times New Roman" w:hAnsi="Times New Roman" w:cs="Times New Roman"/>
+                <w:sz w:val="22"/>
+                <w:szCs w:val="22"/>
+              </w:rPr>
+              <w:t>Confusion between holidays and workdays leads to payroll discrepancies, requiring HR to spend extra time reconciling and adjusting records.</w:t>
+            </w:r>
+          </w:p>
+        </w:tc>
+        <w:tc>
+          <w:tcPr>
+            <w:tcW w:w="1845" w:type="pct"/>
+          </w:tcPr>
+          <w:p>
+            <w:pPr>
+              <w:rPr>
+                <w:rFonts w:ascii="Times New Roman" w:hAnsi="Times New Roman" w:cs="Times New Roman"/>
+                <w:sz w:val="22"/>
+                <w:szCs w:val="22"/>
+              </w:rPr>
+            </w:pPr>
+            <w:r>
+              <w:rPr>
+                <w:rFonts w:ascii="Times New Roman" w:hAnsi="Times New Roman" w:cs="Times New Roman"/>
+                <w:sz w:val="22"/>
+                <w:szCs w:val="22"/>
+              </w:rPr>
+              <w:t>Each unit operates like a “small company” within the ERP system. They have the authority to define working days tailored to their specific needs without affecting other departments.</w:t>
+            </w:r>
+          </w:p>
+        </w:tc>
+      </w:tr>
+      <w:tr>
+        <w:tc>
+          <w:tcPr>
+            <w:tcW w:w="1639" w:type="pct"/>
+          </w:tcPr>
+          <w:p>
+            <w:pPr>
+              <w:rPr>
+                <w:rFonts w:ascii="Times New Roman" w:hAnsi="Times New Roman" w:cs="Times New Roman"/>
+                <w:sz w:val="22"/>
+                <w:szCs w:val="22"/>
+              </w:rPr>
+            </w:pPr>
+            <w:r>
+              <w:rPr>
+                <w:rFonts w:ascii="Times New Roman" w:hAnsi="Times New Roman" w:cs="Times New Roman"/>
+                <w:sz w:val="22"/>
+                <w:szCs w:val="22"/>
+              </w:rPr>
+              <w:t>Many businesses still rely on Excel or verbal notifications. When changes occur, information isn’t updated promptly, leading to employees working on their days off or vice versa.</w:t>
+            </w:r>
+          </w:p>
+        </w:tc>
+        <w:tc>
+          <w:tcPr>
+            <w:tcW w:w="1516" w:type="pct"/>
+          </w:tcPr>
+          <w:p>
+            <w:pPr>
+              <w:rPr>
+                <w:rFonts w:ascii="Times New Roman" w:hAnsi="Times New Roman" w:cs="Times New Roman"/>
+                <w:sz w:val="22"/>
+                <w:szCs w:val="22"/>
+              </w:rPr>
+            </w:pPr>
+            <w:r>
+              <w:rPr>
+                <w:rFonts w:ascii="Times New Roman" w:hAnsi="Times New Roman" w:cs="Times New Roman"/>
+                <w:sz w:val="22"/>
+                <w:szCs w:val="22"/>
+              </w:rPr>
+              <w:t>Employees feel dissatisfied when schedules change without notice, or when their leave entitlements are recorded incorrectly.</w:t>
+            </w:r>
+          </w:p>
+        </w:tc>
+        <w:tc>
+          <w:tcPr>
+            <w:tcW w:w="1845" w:type="pct"/>
+          </w:tcPr>
+          <w:p>
+            <w:pPr>
+              <w:rPr>
+                <w:rFonts w:ascii="Times New Roman" w:hAnsi="Times New Roman" w:cs="Times New Roman"/>
+                <w:sz w:val="22"/>
+                <w:szCs w:val="22"/>
+              </w:rPr>
+            </w:pPr>
+            <w:r>
+              <w:rPr>
+                <w:rFonts w:ascii="Times New Roman" w:hAnsi="Times New Roman" w:cs="Times New Roman"/>
+                <w:sz w:val="22"/>
+                <w:szCs w:val="22"/>
+              </w:rPr>
+              <w:t>The system automatically sends an email to employees as soon as a Manager clicks “</w:t>
+            </w:r>
+            <w:r>
+              <w:rPr>
+                <w:rFonts w:ascii="Times New Roman" w:hAnsi="Times New Roman" w:cs="Times New Roman"/>
+                <w:sz w:val="22"/>
+                <w:szCs w:val="22"/>
+              </w:rPr>
+              <w:t>Save changes</w:t>
+            </w:r>
+            <w:r>
+              <w:rPr>
+                <w:rFonts w:ascii="Times New Roman" w:hAnsi="Times New Roman" w:cs="Times New Roman"/>
+                <w:sz w:val="22"/>
+                <w:szCs w:val="22"/>
+              </w:rPr>
+              <w:t>” This creates a real-time information flow, helping employees proactively manage their work and personal lives.</w:t>
+            </w:r>
+          </w:p>
+        </w:tc>
+      </w:tr>
+      <w:tr>
+        <w:tc>
+          <w:tcPr>
+            <w:tcW w:w="1639" w:type="pct"/>
+          </w:tcPr>
+          <w:p>
+            <w:pPr>
+              <w:rPr>
+                <w:rFonts w:ascii="Times New Roman" w:hAnsi="Times New Roman" w:cs="Times New Roman"/>
+                <w:sz w:val="22"/>
+                <w:szCs w:val="22"/>
+              </w:rPr>
+            </w:pPr>
+            <w:r>
+              <w:rPr>
+                <w:rFonts w:ascii="Times New Roman" w:hAnsi="Times New Roman" w:cs="Times New Roman"/>
+                <w:sz w:val="22"/>
+                <w:szCs w:val="22"/>
+              </w:rPr>
+              <w:t>Work schedule data is often shared publicly via the intranet or as email attachments, leading to the risk of unauthorized edits by unauthorized personnel.</w:t>
+            </w:r>
+          </w:p>
+        </w:tc>
+        <w:tc>
+          <w:tcPr>
+            <w:tcW w:w="1516" w:type="pct"/>
+          </w:tcPr>
+          <w:p>
+            <w:pPr>
+              <w:rPr>
+                <w:rFonts w:ascii="Times New Roman" w:hAnsi="Times New Roman" w:cs="Times New Roman"/>
+                <w:sz w:val="22"/>
+                <w:szCs w:val="22"/>
+              </w:rPr>
+            </w:pPr>
+            <w:r>
+              <w:rPr>
+                <w:rFonts w:ascii="Times New Roman" w:hAnsi="Times New Roman" w:cs="Times New Roman"/>
+                <w:sz w:val="22"/>
+                <w:szCs w:val="22"/>
+              </w:rPr>
+              <w:t>In specific industries (manufacturing, healthcare), failing to maintain an audit trail of schedule changes may result in violations of quality management standards (ISO) or labor laws.</w:t>
+            </w:r>
+          </w:p>
+        </w:tc>
+        <w:tc>
+          <w:tcPr>
+            <w:tcW w:w="1845" w:type="pct"/>
+          </w:tcPr>
+          <w:p>
+            <w:pPr>
+              <w:rPr>
+                <w:rFonts w:ascii="Times New Roman" w:hAnsi="Times New Roman" w:cs="Times New Roman"/>
+                <w:sz w:val="22"/>
+                <w:szCs w:val="22"/>
+              </w:rPr>
+            </w:pPr>
+            <w:r>
+              <w:rPr>
+                <w:rFonts w:ascii="Times New Roman" w:hAnsi="Times New Roman" w:cs="Times New Roman"/>
+                <w:sz w:val="22"/>
+                <w:szCs w:val="22"/>
+              </w:rPr>
+              <w:t>Only managers granted permission via Authorization Objects can make edits. The system completely prevents unauthorized changes.</w:t>
+            </w:r>
+          </w:p>
+        </w:tc>
+      </w:tr>
+      <w:tr>
+        <w:tc>
+          <w:tcPr>
+            <w:tcW w:w="1639" w:type="pct"/>
+          </w:tcPr>
+          <w:p>
+            <w:pPr>
+              <w:rPr>
+                <w:rFonts w:ascii="Times New Roman" w:hAnsi="Times New Roman" w:cs="Times New Roman"/>
+                <w:sz w:val="22"/>
+                <w:szCs w:val="22"/>
+              </w:rPr>
+            </w:pPr>
+            <w:r>
+              <w:rPr>
+                <w:rFonts w:ascii="Times New Roman" w:hAnsi="Times New Roman" w:cs="Times New Roman"/>
+                <w:sz w:val="22"/>
+                <w:szCs w:val="22"/>
+              </w:rPr>
+              <w:t>Without a log, it is impossible to hold anyone accountable when staff shortages occur.</w:t>
+            </w:r>
+          </w:p>
+        </w:tc>
+        <w:tc>
+          <w:tcPr>
+            <w:tcW w:w="1516" w:type="pct"/>
+          </w:tcPr>
+          <w:p>
+            <w:pPr>
+              <w:rPr>
+                <w:rFonts w:ascii="Times New Roman" w:hAnsi="Times New Roman" w:cs="Times New Roman"/>
+                <w:sz w:val="22"/>
+                <w:szCs w:val="22"/>
+              </w:rPr>
+            </w:pPr>
+            <w:r>
+              <w:rPr>
+                <w:rFonts w:ascii="Times New Roman" w:hAnsi="Times New Roman" w:cs="Times New Roman"/>
+                <w:sz w:val="22"/>
+                <w:szCs w:val="22"/>
+              </w:rPr>
+              <w:t>There is no reliable data available for internal audits or monthly payroll reconciliations</w:t>
+            </w:r>
+          </w:p>
+        </w:tc>
+        <w:tc>
+          <w:tcPr>
+            <w:tcW w:w="1845" w:type="pct"/>
+          </w:tcPr>
+          <w:p>
+            <w:pPr>
+              <w:rPr>
+                <w:rFonts w:ascii="Times New Roman" w:hAnsi="Times New Roman" w:cs="Times New Roman"/>
+                <w:sz w:val="22"/>
+                <w:szCs w:val="22"/>
+              </w:rPr>
+            </w:pPr>
+            <w:r>
+              <w:rPr>
+                <w:rFonts w:ascii="Times New Roman" w:hAnsi="Times New Roman" w:cs="Times New Roman"/>
+                <w:sz w:val="22"/>
+                <w:szCs w:val="22"/>
+              </w:rPr>
+              <w:t>Every action (Create/Update) is time-stamped and logged with the user’s name (Audit Trail). This data is always available for audits or monthly payroll reconciliations.</w:t>
+            </w:r>
+          </w:p>
+        </w:tc>
+      </w:tr>
+    </w:tbl>
+    <w:p/>
+    <w:p/>
+    <w:p/>
+    <w:p/>
+    <w:p/>
+    <w:p>
+      <w:pPr>
+        <w:pStyle w:val="Heading1"/>
+        <w:rPr>
+          <w:rFonts w:ascii="Times New Roman" w:hAnsi="Times New Roman" w:cs="Times New Roman"/>
+          <w:b/>
+          <w:bCs/>
+          <w:color w:val="auto"/>
+          <w:sz w:val="28"/>
+          <w:szCs w:val="28"/>
+        </w:rPr>
+      </w:pPr>
+      <w:bookmarkStart w:id="2" w:name="_Toc226623690"/>
+      <w:r>
+        <w:rPr>
+          <w:rFonts w:ascii="Times New Roman" w:hAnsi="Times New Roman" w:cs="Times New Roman"/>
+          <w:b/>
+          <w:bCs/>
+          <w:color w:val="auto"/>
+          <w:sz w:val="28"/>
+          <w:szCs w:val="28"/>
+        </w:rPr>
+        <w:lastRenderedPageBreak/>
+        <w:t>3</w:t>
+      </w:r>
+      <w:r>
+        <w:rPr>
+          <w:rFonts w:ascii="Times New Roman" w:hAnsi="Times New Roman" w:cs="Times New Roman"/>
+          <w:b/>
+          <w:bCs/>
+          <w:color w:val="auto"/>
+          <w:sz w:val="28"/>
+          <w:szCs w:val="28"/>
+        </w:rPr>
+        <w:tab/>
+        <w:t>Objectives</w:t>
+      </w:r>
+      <w:bookmarkEnd w:id="2"/>
+      <w:r>
+        <w:rPr>
+          <w:rFonts w:ascii="Times New Roman" w:hAnsi="Times New Roman" w:cs="Times New Roman"/>
+          <w:b/>
+          <w:bCs/>
+          <w:color w:val="auto"/>
+          <w:sz w:val="28"/>
+          <w:szCs w:val="28"/>
+        </w:rPr>
+        <w:t xml:space="preserve"> </w:t>
+      </w:r>
+    </w:p>
+    <w:tbl>
+      <w:tblPr>
+        <w:tblStyle w:val="TableGrid"/>
+        <w:tblW w:w="0" w:type="auto"/>
+        <w:tblLook w:val="04A0" w:firstRow="1" w:lastRow="0" w:firstColumn="1" w:lastColumn="0" w:noHBand="0" w:noVBand="1"/>
+      </w:tblPr>
+      <w:tblGrid>
+        <w:gridCol w:w="595"/>
+        <w:gridCol w:w="3145"/>
+        <w:gridCol w:w="1594"/>
+        <w:gridCol w:w="4016"/>
+      </w:tblGrid>
+      <w:tr>
+        <w:tc>
+          <w:tcPr>
+            <w:tcW w:w="0" w:type="auto"/>
+          </w:tcPr>
+          <w:p>
+            <w:pPr>
+              <w:pStyle w:val="Header"/>
+              <w:tabs>
+                <w:tab w:val="clear" w:pos="4680"/>
+                <w:tab w:val="clear" w:pos="9360"/>
+              </w:tabs>
+              <w:spacing w:after="160" w:line="278" w:lineRule="auto"/>
+              <w:rPr>
+                <w:rFonts w:ascii="Times New Roman" w:hAnsi="Times New Roman" w:cs="Times New Roman"/>
+                <w:b/>
+                <w:bCs/>
+              </w:rPr>
+            </w:pPr>
+            <w:r>
+              <w:rPr>
+                <w:rFonts w:ascii="Times New Roman" w:hAnsi="Times New Roman" w:cs="Times New Roman"/>
+                <w:b/>
+                <w:bCs/>
+              </w:rPr>
+              <w:t>ID</w:t>
+            </w:r>
+          </w:p>
+        </w:tc>
+        <w:tc>
+          <w:tcPr>
+            <w:tcW w:w="0" w:type="auto"/>
+          </w:tcPr>
+          <w:p>
+            <w:pPr>
+              <w:pStyle w:val="Header"/>
+              <w:tabs>
+                <w:tab w:val="clear" w:pos="4680"/>
+                <w:tab w:val="clear" w:pos="9360"/>
+              </w:tabs>
+              <w:spacing w:after="160" w:line="278" w:lineRule="auto"/>
+              <w:rPr>
+                <w:rFonts w:ascii="Times New Roman" w:hAnsi="Times New Roman" w:cs="Times New Roman"/>
+                <w:b/>
+                <w:bCs/>
+              </w:rPr>
+            </w:pPr>
+            <w:r>
+              <w:rPr>
+                <w:rFonts w:ascii="Times New Roman" w:hAnsi="Times New Roman" w:cs="Times New Roman"/>
+                <w:b/>
+                <w:bCs/>
+              </w:rPr>
+              <w:t>Business Objective</w:t>
+            </w:r>
+          </w:p>
+        </w:tc>
+        <w:tc>
+          <w:tcPr>
+            <w:tcW w:w="0" w:type="auto"/>
+          </w:tcPr>
+          <w:p>
+            <w:pPr>
+              <w:pStyle w:val="Header"/>
+              <w:tabs>
+                <w:tab w:val="clear" w:pos="4680"/>
+                <w:tab w:val="clear" w:pos="9360"/>
+              </w:tabs>
+              <w:spacing w:after="160" w:line="278" w:lineRule="auto"/>
+              <w:rPr>
+                <w:rFonts w:ascii="Times New Roman" w:hAnsi="Times New Roman" w:cs="Times New Roman"/>
+                <w:b/>
+                <w:bCs/>
+              </w:rPr>
+            </w:pPr>
+            <w:r>
+              <w:rPr>
+                <w:rFonts w:ascii="Times New Roman" w:hAnsi="Times New Roman" w:cs="Times New Roman"/>
+                <w:b/>
+                <w:bCs/>
+              </w:rPr>
+              <w:t xml:space="preserve">Business Owner </w:t>
+            </w:r>
+          </w:p>
+        </w:tc>
+        <w:tc>
+          <w:tcPr>
+            <w:tcW w:w="0" w:type="auto"/>
+          </w:tcPr>
+          <w:p>
+            <w:pPr>
+              <w:pStyle w:val="Header"/>
+              <w:tabs>
+                <w:tab w:val="clear" w:pos="4680"/>
+                <w:tab w:val="clear" w:pos="9360"/>
+              </w:tabs>
+              <w:spacing w:after="160" w:line="278" w:lineRule="auto"/>
+              <w:rPr>
+                <w:rFonts w:ascii="Times New Roman" w:hAnsi="Times New Roman" w:cs="Times New Roman"/>
+                <w:b/>
+                <w:bCs/>
+              </w:rPr>
+            </w:pPr>
+            <w:r>
+              <w:rPr>
+                <w:rFonts w:ascii="Times New Roman" w:hAnsi="Times New Roman" w:cs="Times New Roman"/>
+                <w:b/>
+                <w:bCs/>
+              </w:rPr>
+              <w:t>Business Importance</w:t>
+            </w:r>
+          </w:p>
+        </w:tc>
+      </w:tr>
+      <w:tr>
+        <w:tc>
+          <w:tcPr>
+            <w:tcW w:w="0" w:type="auto"/>
+          </w:tcPr>
+          <w:p>
+            <w:pPr>
+              <w:pStyle w:val="Header"/>
+              <w:tabs>
+                <w:tab w:val="clear" w:pos="4680"/>
+                <w:tab w:val="clear" w:pos="9360"/>
+              </w:tabs>
+              <w:spacing w:after="160" w:line="278" w:lineRule="auto"/>
+              <w:rPr>
+                <w:rFonts w:ascii="Times New Roman" w:hAnsi="Times New Roman" w:cs="Times New Roman"/>
+                <w:sz w:val="22"/>
+                <w:szCs w:val="22"/>
+              </w:rPr>
+            </w:pPr>
+            <w:r>
+              <w:rPr>
+                <w:rFonts w:ascii="Times New Roman" w:hAnsi="Times New Roman" w:cs="Times New Roman"/>
+                <w:sz w:val="22"/>
+                <w:szCs w:val="22"/>
+              </w:rPr>
+              <w:t>O01</w:t>
+            </w:r>
+          </w:p>
+        </w:tc>
+        <w:tc>
+          <w:tcPr>
+            <w:tcW w:w="0" w:type="auto"/>
+          </w:tcPr>
+          <w:p>
+            <w:pPr>
+              <w:pStyle w:val="Header"/>
+              <w:tabs>
+                <w:tab w:val="clear" w:pos="4680"/>
+                <w:tab w:val="clear" w:pos="9360"/>
+              </w:tabs>
+              <w:spacing w:after="160" w:line="278" w:lineRule="auto"/>
+              <w:rPr>
+                <w:rFonts w:ascii="Times New Roman" w:hAnsi="Times New Roman" w:cs="Times New Roman"/>
+                <w:sz w:val="22"/>
+                <w:szCs w:val="22"/>
+              </w:rPr>
+            </w:pPr>
+            <w:r>
+              <w:rPr>
+                <w:rFonts w:ascii="Times New Roman" w:hAnsi="Times New Roman" w:cs="Times New Roman"/>
+                <w:sz w:val="22"/>
+                <w:szCs w:val="22"/>
+              </w:rPr>
+              <w:t>Optimize resource management through data visualization: Convert all raw time data into a 100% interactive calendar interface.</w:t>
+            </w:r>
+          </w:p>
+        </w:tc>
+        <w:tc>
+          <w:tcPr>
+            <w:tcW w:w="0" w:type="auto"/>
+          </w:tcPr>
+          <w:p>
+            <w:pPr>
+              <w:pStyle w:val="Header"/>
+              <w:tabs>
+                <w:tab w:val="clear" w:pos="4680"/>
+                <w:tab w:val="clear" w:pos="9360"/>
+              </w:tabs>
+              <w:spacing w:after="160" w:line="278" w:lineRule="auto"/>
+              <w:rPr>
+                <w:rFonts w:ascii="Times New Roman" w:hAnsi="Times New Roman" w:cs="Times New Roman"/>
+                <w:sz w:val="22"/>
+                <w:szCs w:val="22"/>
+              </w:rPr>
+            </w:pPr>
+            <w:r>
+              <w:rPr>
+                <w:rFonts w:ascii="Times New Roman" w:hAnsi="Times New Roman" w:cs="Times New Roman"/>
+                <w:sz w:val="22"/>
+                <w:szCs w:val="22"/>
+              </w:rPr>
+              <w:t>Department Head</w:t>
+            </w:r>
+          </w:p>
+        </w:tc>
+        <w:tc>
+          <w:tcPr>
+            <w:tcW w:w="0" w:type="auto"/>
+          </w:tcPr>
+          <w:p>
+            <w:pPr>
+              <w:pStyle w:val="Header"/>
+              <w:tabs>
+                <w:tab w:val="clear" w:pos="4680"/>
+                <w:tab w:val="clear" w:pos="9360"/>
+              </w:tabs>
+              <w:spacing w:after="160" w:line="278" w:lineRule="auto"/>
+              <w:rPr>
+                <w:rFonts w:ascii="Times New Roman" w:hAnsi="Times New Roman" w:cs="Times New Roman"/>
+                <w:sz w:val="22"/>
+                <w:szCs w:val="22"/>
+              </w:rPr>
+            </w:pPr>
+            <w:r>
+              <w:rPr>
+                <w:rFonts w:ascii="Times New Roman" w:hAnsi="Times New Roman" w:cs="Times New Roman"/>
+                <w:sz w:val="22"/>
+                <w:szCs w:val="22"/>
+              </w:rPr>
+              <w:t>Reduce the time managers spend on monthly scheduling and workforce planning by 50%. Ensure visual data enables immediate identification of staffing gaps or schedule overlaps.</w:t>
+            </w:r>
+          </w:p>
+        </w:tc>
+      </w:tr>
+      <w:tr>
+        <w:tc>
+          <w:tcPr>
+            <w:tcW w:w="0" w:type="auto"/>
+          </w:tcPr>
+          <w:p>
+            <w:pPr>
+              <w:pStyle w:val="Header"/>
+              <w:tabs>
+                <w:tab w:val="clear" w:pos="4680"/>
+                <w:tab w:val="clear" w:pos="9360"/>
+              </w:tabs>
+              <w:spacing w:after="160" w:line="278" w:lineRule="auto"/>
+              <w:rPr>
+                <w:rFonts w:ascii="Times New Roman" w:hAnsi="Times New Roman" w:cs="Times New Roman"/>
+                <w:sz w:val="22"/>
+                <w:szCs w:val="22"/>
+              </w:rPr>
+            </w:pPr>
+            <w:r>
+              <w:rPr>
+                <w:rFonts w:ascii="Times New Roman" w:hAnsi="Times New Roman" w:cs="Times New Roman"/>
+                <w:sz w:val="22"/>
+                <w:szCs w:val="22"/>
+              </w:rPr>
+              <w:t>O02</w:t>
+            </w:r>
+          </w:p>
+        </w:tc>
+        <w:tc>
+          <w:tcPr>
+            <w:tcW w:w="0" w:type="auto"/>
+          </w:tcPr>
+          <w:p>
+            <w:pPr>
+              <w:pStyle w:val="Header"/>
+              <w:tabs>
+                <w:tab w:val="clear" w:pos="4680"/>
+                <w:tab w:val="clear" w:pos="9360"/>
+              </w:tabs>
+              <w:spacing w:after="160" w:line="278" w:lineRule="auto"/>
+              <w:rPr>
+                <w:rFonts w:ascii="Times New Roman" w:hAnsi="Times New Roman" w:cs="Times New Roman"/>
+                <w:sz w:val="22"/>
+                <w:szCs w:val="22"/>
+              </w:rPr>
+            </w:pPr>
+            <w:r>
+              <w:rPr>
+                <w:rFonts w:ascii="Times New Roman" w:hAnsi="Times New Roman" w:cs="Times New Roman"/>
+                <w:sz w:val="22"/>
+                <w:szCs w:val="22"/>
+              </w:rPr>
+              <w:t xml:space="preserve">Enhance operational autonomy at the unit level: Shift the scheduling model from centralized to decentralized, allowing each department to maintain its own independent schedule.    </w:t>
+            </w:r>
+          </w:p>
+        </w:tc>
+        <w:tc>
+          <w:tcPr>
+            <w:tcW w:w="0" w:type="auto"/>
+          </w:tcPr>
+          <w:p>
+            <w:pPr>
+              <w:pStyle w:val="Header"/>
+              <w:tabs>
+                <w:tab w:val="clear" w:pos="4680"/>
+                <w:tab w:val="clear" w:pos="9360"/>
+              </w:tabs>
+              <w:spacing w:after="160" w:line="278" w:lineRule="auto"/>
+              <w:rPr>
+                <w:rFonts w:ascii="Times New Roman" w:hAnsi="Times New Roman" w:cs="Times New Roman"/>
+                <w:sz w:val="22"/>
+                <w:szCs w:val="22"/>
+              </w:rPr>
+            </w:pPr>
+            <w:r>
+              <w:rPr>
+                <w:rFonts w:ascii="Times New Roman" w:hAnsi="Times New Roman" w:cs="Times New Roman"/>
+                <w:sz w:val="22"/>
+                <w:szCs w:val="22"/>
+              </w:rPr>
+              <w:t>Department Manager</w:t>
+            </w:r>
+            <w:r>
+              <w:rPr>
+                <w:rFonts w:ascii="Times New Roman" w:hAnsi="Times New Roman" w:cs="Times New Roman"/>
+                <w:sz w:val="22"/>
+                <w:szCs w:val="22"/>
+              </w:rPr>
+              <w:t>s</w:t>
+            </w:r>
+          </w:p>
+        </w:tc>
+        <w:tc>
+          <w:tcPr>
+            <w:tcW w:w="0" w:type="auto"/>
+          </w:tcPr>
+          <w:p>
+            <w:pPr>
+              <w:pStyle w:val="Header"/>
+              <w:tabs>
+                <w:tab w:val="clear" w:pos="4680"/>
+                <w:tab w:val="clear" w:pos="9360"/>
+              </w:tabs>
+              <w:spacing w:after="160" w:line="278" w:lineRule="auto"/>
+              <w:rPr>
+                <w:rFonts w:ascii="Times New Roman" w:hAnsi="Times New Roman" w:cs="Times New Roman"/>
+                <w:sz w:val="22"/>
+                <w:szCs w:val="22"/>
+              </w:rPr>
+            </w:pPr>
+            <w:r>
+              <w:rPr>
+                <w:rFonts w:ascii="Times New Roman" w:hAnsi="Times New Roman" w:cs="Times New Roman"/>
+                <w:sz w:val="22"/>
+                <w:szCs w:val="22"/>
+              </w:rPr>
+              <w:t>Improve business flexibility. Ensure each unit can immediately adjust its schedule to align with its specific production/service needs without intermediaries, thereby accelerating response times to market changes.</w:t>
+            </w:r>
+          </w:p>
+        </w:tc>
+      </w:tr>
+      <w:tr>
+        <w:tc>
+          <w:tcPr>
+            <w:tcW w:w="0" w:type="auto"/>
+          </w:tcPr>
+          <w:p>
+            <w:pPr>
+              <w:pStyle w:val="Header"/>
+              <w:tabs>
+                <w:tab w:val="clear" w:pos="4680"/>
+                <w:tab w:val="clear" w:pos="9360"/>
+              </w:tabs>
+              <w:spacing w:after="160" w:line="278" w:lineRule="auto"/>
+              <w:rPr>
+                <w:rFonts w:ascii="Times New Roman" w:hAnsi="Times New Roman" w:cs="Times New Roman"/>
+                <w:sz w:val="22"/>
+                <w:szCs w:val="22"/>
+              </w:rPr>
+            </w:pPr>
+            <w:r>
+              <w:rPr>
+                <w:rFonts w:ascii="Times New Roman" w:hAnsi="Times New Roman" w:cs="Times New Roman"/>
+                <w:sz w:val="22"/>
+                <w:szCs w:val="22"/>
+              </w:rPr>
+              <w:t>O03</w:t>
+            </w:r>
+          </w:p>
+        </w:tc>
+        <w:tc>
+          <w:tcPr>
+            <w:tcW w:w="0" w:type="auto"/>
+          </w:tcPr>
+          <w:p>
+            <w:pPr>
+              <w:pStyle w:val="Header"/>
+              <w:tabs>
+                <w:tab w:val="clear" w:pos="4680"/>
+                <w:tab w:val="clear" w:pos="9360"/>
+              </w:tabs>
+              <w:spacing w:after="160" w:line="278" w:lineRule="auto"/>
+              <w:rPr>
+                <w:rFonts w:ascii="Times New Roman" w:hAnsi="Times New Roman" w:cs="Times New Roman"/>
+                <w:sz w:val="22"/>
+                <w:szCs w:val="22"/>
+              </w:rPr>
+            </w:pPr>
+            <w:r>
+              <w:rPr>
+                <w:rFonts w:ascii="Times New Roman" w:hAnsi="Times New Roman" w:cs="Times New Roman"/>
+                <w:sz w:val="22"/>
+                <w:szCs w:val="22"/>
+              </w:rPr>
+              <w:t xml:space="preserve">Establish a Risk Management &amp; Data Integrity Framework: Implement a strict Role-Based Access Control (RBAC) security mechanism to protect HR data.  </w:t>
+            </w:r>
+          </w:p>
+        </w:tc>
+        <w:tc>
+          <w:tcPr>
+            <w:tcW w:w="0" w:type="auto"/>
+          </w:tcPr>
+          <w:p>
+            <w:pPr>
+              <w:pStyle w:val="Header"/>
+              <w:tabs>
+                <w:tab w:val="clear" w:pos="4680"/>
+                <w:tab w:val="clear" w:pos="9360"/>
+              </w:tabs>
+              <w:spacing w:after="160" w:line="278" w:lineRule="auto"/>
+              <w:rPr>
+                <w:rFonts w:ascii="Times New Roman" w:hAnsi="Times New Roman" w:cs="Times New Roman"/>
+                <w:sz w:val="22"/>
+                <w:szCs w:val="22"/>
+              </w:rPr>
+            </w:pPr>
+            <w:r>
+              <w:rPr>
+                <w:rFonts w:ascii="Times New Roman" w:hAnsi="Times New Roman" w:cs="Times New Roman"/>
+                <w:sz w:val="22"/>
+                <w:szCs w:val="22"/>
+              </w:rPr>
+              <w:t>Director of Risk Management</w:t>
+            </w:r>
+          </w:p>
+        </w:tc>
+        <w:tc>
+          <w:tcPr>
+            <w:tcW w:w="0" w:type="auto"/>
+          </w:tcPr>
+          <w:p>
+            <w:pPr>
+              <w:pStyle w:val="Header"/>
+              <w:tabs>
+                <w:tab w:val="clear" w:pos="4680"/>
+                <w:tab w:val="clear" w:pos="9360"/>
+              </w:tabs>
+              <w:spacing w:after="160" w:line="278" w:lineRule="auto"/>
+              <w:rPr>
+                <w:rFonts w:ascii="Times New Roman" w:hAnsi="Times New Roman" w:cs="Times New Roman"/>
+                <w:sz w:val="22"/>
+                <w:szCs w:val="22"/>
+              </w:rPr>
+            </w:pPr>
+            <w:r>
+              <w:rPr>
+                <w:rFonts w:ascii="Times New Roman" w:hAnsi="Times New Roman" w:cs="Times New Roman"/>
+                <w:sz w:val="22"/>
+                <w:szCs w:val="22"/>
+              </w:rPr>
+              <w:t xml:space="preserve">Eliminate </w:t>
+            </w:r>
+            <w:r>
+              <w:rPr>
+                <w:rFonts w:ascii="Times New Roman" w:hAnsi="Times New Roman" w:cs="Times New Roman"/>
+                <w:sz w:val="22"/>
+                <w:szCs w:val="22"/>
+              </w:rPr>
+              <w:t>99,9</w:t>
+            </w:r>
+            <w:r>
+              <w:rPr>
+                <w:rFonts w:ascii="Times New Roman" w:hAnsi="Times New Roman" w:cs="Times New Roman"/>
+                <w:sz w:val="22"/>
+                <w:szCs w:val="22"/>
+              </w:rPr>
+              <w:t>5</w:t>
+            </w:r>
+            <w:r>
+              <w:rPr>
+                <w:rFonts w:ascii="Times New Roman" w:hAnsi="Times New Roman" w:cs="Times New Roman"/>
+                <w:sz w:val="22"/>
+                <w:szCs w:val="22"/>
+              </w:rPr>
+              <w:t>% of unauthorized data modification risks. Ensure absolute consistency of real-time data, which serves as the foundation for preventing discrepancies in payroll processes, helping the company avoid financial losses and employee complaints.</w:t>
+            </w:r>
+          </w:p>
+        </w:tc>
+      </w:tr>
+      <w:tr>
+        <w:tc>
+          <w:tcPr>
+            <w:tcW w:w="0" w:type="auto"/>
+          </w:tcPr>
+          <w:p>
+            <w:pPr>
+              <w:pStyle w:val="Header"/>
+              <w:tabs>
+                <w:tab w:val="clear" w:pos="4680"/>
+                <w:tab w:val="clear" w:pos="9360"/>
+              </w:tabs>
+              <w:spacing w:after="160" w:line="278" w:lineRule="auto"/>
+              <w:rPr>
+                <w:rFonts w:ascii="Times New Roman" w:hAnsi="Times New Roman" w:cs="Times New Roman"/>
+                <w:sz w:val="22"/>
+                <w:szCs w:val="22"/>
+              </w:rPr>
+            </w:pPr>
+            <w:r>
+              <w:rPr>
+                <w:rFonts w:ascii="Times New Roman" w:hAnsi="Times New Roman" w:cs="Times New Roman"/>
+                <w:sz w:val="22"/>
+                <w:szCs w:val="22"/>
+              </w:rPr>
+              <w:t>O04</w:t>
+            </w:r>
+          </w:p>
+        </w:tc>
+        <w:tc>
+          <w:tcPr>
+            <w:tcW w:w="0" w:type="auto"/>
+          </w:tcPr>
+          <w:p>
+            <w:pPr>
+              <w:pStyle w:val="Header"/>
+              <w:tabs>
+                <w:tab w:val="clear" w:pos="4680"/>
+                <w:tab w:val="clear" w:pos="9360"/>
+              </w:tabs>
+              <w:spacing w:after="160" w:line="278" w:lineRule="auto"/>
+              <w:rPr>
+                <w:rFonts w:ascii="Times New Roman" w:hAnsi="Times New Roman" w:cs="Times New Roman"/>
+                <w:sz w:val="22"/>
+                <w:szCs w:val="22"/>
+              </w:rPr>
+            </w:pPr>
+            <w:r>
+              <w:rPr>
+                <w:rFonts w:ascii="Times New Roman" w:hAnsi="Times New Roman" w:cs="Times New Roman"/>
+                <w:sz w:val="22"/>
+                <w:szCs w:val="22"/>
+              </w:rPr>
+              <w:t>Ensuring Transparency and Accountability: Establish an immutable audit trail system that records every interaction on the system.</w:t>
+            </w:r>
+            <w:r>
+              <w:rPr>
+                <w:rFonts w:ascii="Times New Roman" w:hAnsi="Times New Roman" w:cs="Times New Roman"/>
+                <w:sz w:val="22"/>
+                <w:szCs w:val="22"/>
+              </w:rPr>
+              <w:tab/>
+            </w:r>
+          </w:p>
+        </w:tc>
+        <w:tc>
+          <w:tcPr>
+            <w:tcW w:w="0" w:type="auto"/>
+          </w:tcPr>
+          <w:p>
+            <w:pPr>
+              <w:pStyle w:val="Header"/>
+              <w:tabs>
+                <w:tab w:val="clear" w:pos="4680"/>
+                <w:tab w:val="clear" w:pos="9360"/>
+              </w:tabs>
+              <w:spacing w:after="160" w:line="278" w:lineRule="auto"/>
+              <w:rPr>
+                <w:rFonts w:ascii="Times New Roman" w:hAnsi="Times New Roman" w:cs="Times New Roman"/>
+                <w:sz w:val="22"/>
+                <w:szCs w:val="22"/>
+              </w:rPr>
+            </w:pPr>
+            <w:r>
+              <w:rPr>
+                <w:rFonts w:ascii="Times New Roman" w:hAnsi="Times New Roman" w:cs="Times New Roman"/>
+                <w:sz w:val="22"/>
+                <w:szCs w:val="22"/>
+              </w:rPr>
+              <w:t>Compliance &amp; Audit Board Commitment</w:t>
+            </w:r>
+          </w:p>
+        </w:tc>
+        <w:tc>
+          <w:tcPr>
+            <w:tcW w:w="0" w:type="auto"/>
+          </w:tcPr>
+          <w:p>
+            <w:pPr>
+              <w:pStyle w:val="Header"/>
+              <w:tabs>
+                <w:tab w:val="clear" w:pos="4680"/>
+                <w:tab w:val="clear" w:pos="9360"/>
+              </w:tabs>
+              <w:spacing w:after="160" w:line="278" w:lineRule="auto"/>
+              <w:rPr>
+                <w:rFonts w:ascii="Times New Roman" w:hAnsi="Times New Roman" w:cs="Times New Roman"/>
+                <w:sz w:val="22"/>
+                <w:szCs w:val="22"/>
+              </w:rPr>
+            </w:pPr>
+            <w:r>
+              <w:rPr>
+                <w:rFonts w:ascii="Times New Roman" w:hAnsi="Times New Roman" w:cs="Times New Roman"/>
+                <w:sz w:val="22"/>
+                <w:szCs w:val="22"/>
+              </w:rPr>
+              <w:t xml:space="preserve">The system is always in an Audit-Ready state. Provide clear, 100% transparent legal evidence of the entire history of adjustments for internal audits or government inspections, reinforcing the company’s reputation and compliance with </w:t>
+            </w:r>
+            <w:r>
+              <w:rPr>
+                <w:rFonts w:ascii="Times New Roman" w:hAnsi="Times New Roman" w:cs="Times New Roman"/>
+                <w:sz w:val="22"/>
+                <w:szCs w:val="22"/>
+              </w:rPr>
+              <w:t xml:space="preserve">Vietnamese Data Security </w:t>
+            </w:r>
+            <w:r>
+              <w:rPr>
+                <w:rFonts w:ascii="Times New Roman" w:hAnsi="Times New Roman" w:cs="Times New Roman"/>
+                <w:sz w:val="22"/>
+                <w:szCs w:val="22"/>
+              </w:rPr>
+              <w:t>laws.</w:t>
+            </w:r>
+          </w:p>
+        </w:tc>
+      </w:tr>
+      <w:tr>
+        <w:tc>
+          <w:tcPr>
+            <w:tcW w:w="0" w:type="auto"/>
+          </w:tcPr>
+          <w:p>
+            <w:pPr>
+              <w:pStyle w:val="Header"/>
+              <w:tabs>
+                <w:tab w:val="clear" w:pos="4680"/>
+                <w:tab w:val="clear" w:pos="9360"/>
+              </w:tabs>
+              <w:spacing w:after="160" w:line="278" w:lineRule="auto"/>
+              <w:rPr>
+                <w:rFonts w:ascii="Times New Roman" w:hAnsi="Times New Roman" w:cs="Times New Roman"/>
+                <w:sz w:val="22"/>
+                <w:szCs w:val="22"/>
+              </w:rPr>
+            </w:pPr>
+            <w:r>
+              <w:rPr>
+                <w:rFonts w:ascii="Times New Roman" w:hAnsi="Times New Roman" w:cs="Times New Roman"/>
+                <w:sz w:val="22"/>
+                <w:szCs w:val="22"/>
+              </w:rPr>
+              <w:t>O05</w:t>
+            </w:r>
+          </w:p>
+        </w:tc>
+        <w:tc>
+          <w:tcPr>
+            <w:tcW w:w="0" w:type="auto"/>
+          </w:tcPr>
+          <w:p>
+            <w:pPr>
+              <w:pStyle w:val="Header"/>
+              <w:tabs>
+                <w:tab w:val="clear" w:pos="4680"/>
+                <w:tab w:val="clear" w:pos="9360"/>
+              </w:tabs>
+              <w:spacing w:after="160" w:line="278" w:lineRule="auto"/>
+              <w:rPr>
+                <w:rFonts w:ascii="Times New Roman" w:hAnsi="Times New Roman" w:cs="Times New Roman"/>
+                <w:sz w:val="22"/>
+                <w:szCs w:val="22"/>
+              </w:rPr>
+            </w:pPr>
+            <w:r>
+              <w:rPr>
+                <w:rFonts w:ascii="Times New Roman" w:hAnsi="Times New Roman" w:cs="Times New Roman"/>
+                <w:sz w:val="22"/>
+                <w:szCs w:val="22"/>
+              </w:rPr>
+              <w:t>Digitizing Internal Communication Processes (Automated Workforce Communication): Fully automates the flow of change-related information from management to individual employees via email.</w:t>
+            </w:r>
+          </w:p>
+        </w:tc>
+        <w:tc>
+          <w:tcPr>
+            <w:tcW w:w="0" w:type="auto"/>
+          </w:tcPr>
+          <w:p>
+            <w:pPr>
+              <w:pStyle w:val="Header"/>
+              <w:tabs>
+                <w:tab w:val="clear" w:pos="4680"/>
+                <w:tab w:val="clear" w:pos="9360"/>
+              </w:tabs>
+              <w:spacing w:after="160" w:line="278" w:lineRule="auto"/>
+              <w:rPr>
+                <w:rFonts w:ascii="Times New Roman" w:hAnsi="Times New Roman" w:cs="Times New Roman"/>
+                <w:sz w:val="22"/>
+                <w:szCs w:val="22"/>
+              </w:rPr>
+            </w:pPr>
+            <w:r>
+              <w:rPr>
+                <w:rFonts w:ascii="Times New Roman" w:hAnsi="Times New Roman" w:cs="Times New Roman"/>
+                <w:sz w:val="22"/>
+                <w:szCs w:val="22"/>
+              </w:rPr>
+              <w:t>All Employees &amp; internal Comm.</w:t>
+            </w:r>
+          </w:p>
+        </w:tc>
+        <w:tc>
+          <w:tcPr>
+            <w:tcW w:w="0" w:type="auto"/>
+          </w:tcPr>
+          <w:p>
+            <w:pPr>
+              <w:pStyle w:val="Header"/>
+              <w:tabs>
+                <w:tab w:val="clear" w:pos="4680"/>
+                <w:tab w:val="clear" w:pos="9360"/>
+              </w:tabs>
+              <w:spacing w:after="160" w:line="278" w:lineRule="auto"/>
+              <w:rPr>
+                <w:rFonts w:ascii="Times New Roman" w:hAnsi="Times New Roman" w:cs="Times New Roman"/>
+                <w:sz w:val="22"/>
+                <w:szCs w:val="22"/>
+              </w:rPr>
+            </w:pPr>
+            <w:r>
+              <w:rPr>
+                <w:rFonts w:ascii="Times New Roman" w:hAnsi="Times New Roman" w:cs="Times New Roman"/>
+                <w:sz w:val="22"/>
+                <w:szCs w:val="22"/>
+              </w:rPr>
+              <w:t>Eliminate information asymmetry within the company. Ensure that 100% of relevant employees receive change notifications immediately upon approval, helping to minimize discrepancies between actual schedules, improve work discipline, and enhance the HR team’s trust in the management system.</w:t>
+            </w:r>
+          </w:p>
+        </w:tc>
+      </w:tr>
+    </w:tbl>
+    <w:p>
+      <w:pPr>
+        <w:pStyle w:val="Header"/>
+        <w:tabs>
+          <w:tab w:val="clear" w:pos="4680"/>
+          <w:tab w:val="clear" w:pos="9360"/>
+        </w:tabs>
+        <w:spacing w:after="160" w:line="278" w:lineRule="auto"/>
+        <w:rPr>
+          <w:rFonts w:ascii="Times New Roman" w:hAnsi="Times New Roman" w:cs="Times New Roman"/>
+        </w:rPr>
+      </w:pPr>
+    </w:p>
+    <w:p>
+      <w:pPr>
+        <w:pStyle w:val="Header"/>
+        <w:tabs>
+          <w:tab w:val="clear" w:pos="4680"/>
+          <w:tab w:val="clear" w:pos="9360"/>
+        </w:tabs>
+        <w:spacing w:after="160" w:line="278" w:lineRule="auto"/>
+        <w:rPr>
+          <w:rFonts w:ascii="Times New Roman" w:hAnsi="Times New Roman" w:cs="Times New Roman"/>
+        </w:rPr>
+      </w:pPr>
+    </w:p>
+    <w:p>
+      <w:pPr>
+        <w:pStyle w:val="Header"/>
+        <w:tabs>
+          <w:tab w:val="clear" w:pos="4680"/>
+          <w:tab w:val="clear" w:pos="9360"/>
+        </w:tabs>
+        <w:spacing w:after="160" w:line="278" w:lineRule="auto"/>
+        <w:outlineLvl w:val="0"/>
+        <w:rPr>
+          <w:rFonts w:ascii="Times New Roman" w:hAnsi="Times New Roman" w:cs="Times New Roman"/>
+          <w:b/>
+          <w:bCs/>
+          <w:sz w:val="28"/>
+          <w:szCs w:val="28"/>
+        </w:rPr>
+      </w:pPr>
+      <w:bookmarkStart w:id="3" w:name="_Toc226623691"/>
+      <w:r>
+        <w:rPr>
+          <w:rFonts w:ascii="Times New Roman" w:hAnsi="Times New Roman" w:cs="Times New Roman"/>
+          <w:b/>
+          <w:bCs/>
+          <w:sz w:val="28"/>
+          <w:szCs w:val="28"/>
+        </w:rPr>
+        <w:lastRenderedPageBreak/>
+        <w:t>4</w:t>
+      </w:r>
+      <w:r>
+        <w:rPr>
+          <w:rFonts w:ascii="Times New Roman" w:hAnsi="Times New Roman" w:cs="Times New Roman"/>
+          <w:b/>
+          <w:bCs/>
+          <w:sz w:val="28"/>
+          <w:szCs w:val="28"/>
+        </w:rPr>
+        <w:tab/>
+        <w:t>Purpose Of Document</w:t>
+      </w:r>
+      <w:bookmarkEnd w:id="3"/>
+    </w:p>
+    <w:p>
+      <w:pPr>
+        <w:pStyle w:val="Header"/>
+        <w:tabs>
+          <w:tab w:val="clear" w:pos="4680"/>
+          <w:tab w:val="clear" w:pos="9360"/>
+        </w:tabs>
+        <w:spacing w:after="160" w:line="278" w:lineRule="auto"/>
+        <w:rPr>
+          <w:rFonts w:ascii="Times New Roman" w:hAnsi="Times New Roman" w:cs="Times New Roman"/>
+          <w:sz w:val="22"/>
+          <w:szCs w:val="22"/>
+        </w:rPr>
+      </w:pPr>
+      <w:r>
+        <w:rPr>
+          <w:rFonts w:ascii="Times New Roman" w:hAnsi="Times New Roman" w:cs="Times New Roman"/>
+          <w:sz w:val="22"/>
+          <w:szCs w:val="22"/>
+        </w:rPr>
+        <w:t xml:space="preserve">The Business Requirements </w:t>
+      </w:r>
+      <w:r>
+        <w:rPr>
+          <w:rFonts w:ascii="Times New Roman" w:hAnsi="Times New Roman" w:cs="Times New Roman"/>
+          <w:sz w:val="22"/>
+          <w:szCs w:val="22"/>
+        </w:rPr>
+        <w:t>Document</w:t>
+      </w:r>
+      <w:r>
+        <w:rPr>
+          <w:rFonts w:ascii="Times New Roman" w:hAnsi="Times New Roman" w:cs="Times New Roman"/>
+          <w:sz w:val="22"/>
+          <w:szCs w:val="22"/>
+        </w:rPr>
+        <w:t xml:space="preserve"> (BR</w:t>
+      </w:r>
+      <w:r>
+        <w:rPr>
+          <w:rFonts w:ascii="Times New Roman" w:hAnsi="Times New Roman" w:cs="Times New Roman"/>
+          <w:sz w:val="22"/>
+          <w:szCs w:val="22"/>
+        </w:rPr>
+        <w:t>D</w:t>
+      </w:r>
+      <w:r>
+        <w:rPr>
+          <w:rFonts w:ascii="Times New Roman" w:hAnsi="Times New Roman" w:cs="Times New Roman"/>
+          <w:sz w:val="22"/>
+          <w:szCs w:val="22"/>
+        </w:rPr>
+        <w:t>) serves as the authoritative blueprint for the “Work Calendar Management by Department</w:t>
+      </w:r>
+      <w:r>
+        <w:rPr>
+          <w:rFonts w:ascii="Times New Roman" w:hAnsi="Times New Roman" w:cs="Times New Roman"/>
+          <w:sz w:val="22"/>
+          <w:szCs w:val="22"/>
+        </w:rPr>
+        <w:t xml:space="preserve"> in ERP Systems</w:t>
+      </w:r>
+      <w:r>
+        <w:rPr>
+          <w:rFonts w:ascii="Times New Roman" w:hAnsi="Times New Roman" w:cs="Times New Roman"/>
+          <w:sz w:val="22"/>
+          <w:szCs w:val="22"/>
+        </w:rPr>
+        <w:t>” solution. It meticulously encapsulates the operational mandates elicited from key stakeholders, including</w:t>
+      </w:r>
+      <w:r>
+        <w:rPr>
+          <w:rFonts w:ascii="Times New Roman" w:hAnsi="Times New Roman" w:cs="Times New Roman"/>
+          <w:sz w:val="22"/>
+          <w:szCs w:val="22"/>
+        </w:rPr>
+        <w:t xml:space="preserve"> FPT University HCM</w:t>
+      </w:r>
+      <w:r>
+        <w:rPr>
+          <w:rFonts w:ascii="Times New Roman" w:hAnsi="Times New Roman" w:cs="Times New Roman"/>
+          <w:sz w:val="22"/>
+          <w:szCs w:val="22"/>
+        </w:rPr>
+        <w:t xml:space="preserve"> Education &amp; Training Department</w:t>
+      </w:r>
+      <w:r>
+        <w:rPr>
+          <w:rFonts w:ascii="Times New Roman" w:hAnsi="Times New Roman" w:cs="Times New Roman"/>
+          <w:sz w:val="22"/>
+          <w:szCs w:val="22"/>
+        </w:rPr>
+        <w:t>, Fsoft Mentors, FPT Lecturers,</w:t>
+      </w:r>
+      <w:r>
+        <w:rPr>
+          <w:rFonts w:ascii="Times New Roman" w:hAnsi="Times New Roman" w:cs="Times New Roman"/>
+          <w:sz w:val="22"/>
+          <w:szCs w:val="22"/>
+        </w:rPr>
+        <w:t xml:space="preserve"> Departmental Leads, HR Operations, and Enterprise Architects.</w:t>
+      </w:r>
+      <w:r>
+        <w:rPr>
+          <w:rFonts w:ascii="Times New Roman" w:hAnsi="Times New Roman" w:cs="Times New Roman"/>
+          <w:sz w:val="22"/>
+          <w:szCs w:val="22"/>
+        </w:rPr>
+        <w:t xml:space="preserve"> </w:t>
+      </w:r>
+    </w:p>
+    <w:p>
+      <w:pPr>
+        <w:pStyle w:val="Header"/>
+        <w:spacing w:after="160" w:line="278" w:lineRule="auto"/>
+        <w:rPr>
+          <w:rFonts w:ascii="Times New Roman" w:hAnsi="Times New Roman" w:cs="Times New Roman"/>
+          <w:sz w:val="22"/>
+          <w:szCs w:val="22"/>
+        </w:rPr>
+      </w:pPr>
+      <w:r>
+        <w:rPr>
+          <w:rFonts w:ascii="Times New Roman" w:hAnsi="Times New Roman" w:cs="Times New Roman"/>
+          <w:sz w:val="22"/>
+          <w:szCs w:val="22"/>
+        </w:rPr>
+        <w:t>The primary objective of this document is to present business requirements in a rigorous, structured format that facilitates formal review, validation, and sign-off by designated approvers. Bridging the gap between the high-level strategic vision and technical execution, this BR</w:t>
+      </w:r>
+      <w:r>
+        <w:rPr>
+          <w:rFonts w:ascii="Times New Roman" w:hAnsi="Times New Roman" w:cs="Times New Roman"/>
+          <w:sz w:val="22"/>
+          <w:szCs w:val="22"/>
+        </w:rPr>
+        <w:t>D</w:t>
+      </w:r>
+      <w:r>
+        <w:rPr>
+          <w:rFonts w:ascii="Times New Roman" w:hAnsi="Times New Roman" w:cs="Times New Roman"/>
+          <w:sz w:val="22"/>
+          <w:szCs w:val="22"/>
+        </w:rPr>
+        <w:t xml:space="preserve"> translates complex organizational needs into precise business language, defining exactly what the solution must deliver to achieve successful business value realization.</w:t>
+      </w:r>
+    </w:p>
+    <w:p>
+      <w:pPr>
+        <w:pStyle w:val="Header"/>
+        <w:spacing w:after="160" w:line="278" w:lineRule="auto"/>
+        <w:rPr>
+          <w:rFonts w:ascii="Times New Roman" w:hAnsi="Times New Roman" w:cs="Times New Roman"/>
+          <w:sz w:val="22"/>
+          <w:szCs w:val="22"/>
+        </w:rPr>
+      </w:pPr>
+      <w:r>
+        <w:rPr>
+          <w:rFonts w:ascii="Times New Roman" w:hAnsi="Times New Roman" w:cs="Times New Roman"/>
+          <w:sz w:val="22"/>
+          <w:szCs w:val="22"/>
+        </w:rPr>
+        <w:t xml:space="preserve">This document establishes the "contractual" baseline for the project, ensuring that the delivered SAP Add-on remains strictly aligned with stakeholder expectations. </w:t>
+      </w:r>
+      <w:r>
+        <w:rPr>
+          <w:rFonts w:ascii="Times New Roman" w:hAnsi="Times New Roman" w:cs="Times New Roman"/>
+          <w:sz w:val="22"/>
+          <w:szCs w:val="22"/>
+        </w:rPr>
+        <w:t>Es</w:t>
+      </w:r>
+      <w:r>
+        <w:rPr>
+          <w:rFonts w:ascii="Times New Roman" w:hAnsi="Times New Roman" w:cs="Times New Roman"/>
+          <w:sz w:val="22"/>
+          <w:szCs w:val="22"/>
+        </w:rPr>
+        <w:t>pecially</w:t>
+      </w:r>
+      <w:r>
+        <w:rPr>
+          <w:rFonts w:ascii="Times New Roman" w:hAnsi="Times New Roman" w:cs="Times New Roman"/>
+          <w:sz w:val="22"/>
+          <w:szCs w:val="22"/>
+        </w:rPr>
+        <w:t>, it is designed to:</w:t>
+      </w:r>
+    </w:p>
+    <w:p>
+      <w:pPr>
+        <w:pStyle w:val="Header"/>
+        <w:numPr>
+          <w:ilvl w:val="0"/>
+          <w:numId w:val="3"/>
+        </w:numPr>
+        <w:spacing w:after="160" w:line="278" w:lineRule="auto"/>
+        <w:rPr>
+          <w:rFonts w:ascii="Times New Roman" w:hAnsi="Times New Roman" w:cs="Times New Roman"/>
+          <w:sz w:val="22"/>
+          <w:szCs w:val="22"/>
+        </w:rPr>
+      </w:pPr>
+      <w:r>
+        <w:rPr>
+          <w:rFonts w:ascii="Times New Roman" w:hAnsi="Times New Roman" w:cs="Times New Roman"/>
+          <w:sz w:val="22"/>
+          <w:szCs w:val="22"/>
+        </w:rPr>
+        <w:t>Establish a Unified Strategic Consensus: Ensure a shared, crystal-clear understanding of the business scope and operational rules among all stakeholders (Department Managers, HR Personnel, and the Technical Development Team).</w:t>
+      </w:r>
+    </w:p>
+    <w:p>
+      <w:pPr>
+        <w:pStyle w:val="Header"/>
+        <w:numPr>
+          <w:ilvl w:val="0"/>
+          <w:numId w:val="3"/>
+        </w:numPr>
+        <w:spacing w:after="160" w:line="278" w:lineRule="auto"/>
+        <w:rPr>
+          <w:rFonts w:ascii="Times New Roman" w:hAnsi="Times New Roman" w:cs="Times New Roman"/>
+          <w:sz w:val="22"/>
+          <w:szCs w:val="22"/>
+        </w:rPr>
+      </w:pPr>
+      <w:r>
+        <w:rPr>
+          <w:rFonts w:ascii="Times New Roman" w:hAnsi="Times New Roman" w:cs="Times New Roman"/>
+          <w:sz w:val="22"/>
+          <w:szCs w:val="22"/>
+        </w:rPr>
+        <w:t xml:space="preserve">Provide the Definitive Foundation for Functional/Technical Design: Act as the primary input for the preparation of the Functional Specifications (FS) and </w:t>
+      </w:r>
+      <w:r>
+        <w:rPr>
+          <w:rFonts w:ascii="Times New Roman" w:hAnsi="Times New Roman" w:cs="Times New Roman"/>
+          <w:sz w:val="22"/>
+          <w:szCs w:val="22"/>
+        </w:rPr>
+        <w:t>Software Requirements Document (SRS)</w:t>
+      </w:r>
+      <w:r>
+        <w:rPr>
+          <w:rFonts w:ascii="Times New Roman" w:hAnsi="Times New Roman" w:cs="Times New Roman"/>
+          <w:sz w:val="22"/>
+          <w:szCs w:val="22"/>
+        </w:rPr>
+        <w:t>, serving as the "Source of Truth" for the ABAP development lifecycle.</w:t>
+      </w:r>
+    </w:p>
+    <w:p>
+      <w:pPr>
+        <w:pStyle w:val="Header"/>
+        <w:numPr>
+          <w:ilvl w:val="0"/>
+          <w:numId w:val="3"/>
+        </w:numPr>
+        <w:spacing w:after="160" w:line="278" w:lineRule="auto"/>
+        <w:rPr>
+          <w:rFonts w:ascii="Times New Roman" w:hAnsi="Times New Roman" w:cs="Times New Roman"/>
+          <w:sz w:val="22"/>
+          <w:szCs w:val="22"/>
+        </w:rPr>
+      </w:pPr>
+      <w:r>
+        <w:rPr>
+          <w:rFonts w:ascii="Times New Roman" w:hAnsi="Times New Roman" w:cs="Times New Roman"/>
+          <w:sz w:val="22"/>
+          <w:szCs w:val="22"/>
+        </w:rPr>
+        <w:t>Accelerate Architectural Decision-Making: Facilitate the evaluation and identification of optimal architectural solutions (specifically the hybrid SAP-HTML integration model) to ensure the system is both robust and scalable.</w:t>
+      </w:r>
+    </w:p>
+    <w:p>
+      <w:pPr>
+        <w:pStyle w:val="Header"/>
+        <w:numPr>
+          <w:ilvl w:val="0"/>
+          <w:numId w:val="3"/>
+        </w:numPr>
+        <w:spacing w:after="160" w:line="278" w:lineRule="auto"/>
+        <w:rPr>
+          <w:rFonts w:ascii="Times New Roman" w:hAnsi="Times New Roman" w:cs="Times New Roman"/>
+          <w:sz w:val="22"/>
+          <w:szCs w:val="22"/>
+        </w:rPr>
+      </w:pPr>
+      <w:r>
+        <w:rPr>
+          <w:rFonts w:ascii="Times New Roman" w:hAnsi="Times New Roman" w:cs="Times New Roman"/>
+          <w:sz w:val="22"/>
+          <w:szCs w:val="22"/>
+        </w:rPr>
+        <w:t>Enable Effective Quality Assurance &amp; Validation: Provide the essential criteria against which User Acceptance Testing (UAT) will be conducted, guaranteeing that every business rule</w:t>
+      </w:r>
+      <w:r>
+        <w:rPr>
+          <w:rFonts w:ascii="Times New Roman" w:hAnsi="Times New Roman" w:cs="Times New Roman"/>
+          <w:sz w:val="22"/>
+          <w:szCs w:val="22"/>
+        </w:rPr>
+        <w:t xml:space="preserve"> - f</w:t>
+      </w:r>
+      <w:r>
+        <w:rPr>
+          <w:rFonts w:ascii="Times New Roman" w:hAnsi="Times New Roman" w:cs="Times New Roman"/>
+          <w:sz w:val="22"/>
+          <w:szCs w:val="22"/>
+        </w:rPr>
+        <w:t xml:space="preserve">rom </w:t>
+      </w:r>
+      <w:r>
+        <w:rPr>
+          <w:rFonts w:ascii="Times New Roman" w:hAnsi="Times New Roman" w:cs="Times New Roman"/>
+          <w:sz w:val="22"/>
+          <w:szCs w:val="22"/>
+        </w:rPr>
+        <w:t xml:space="preserve">UI Visualization, </w:t>
+      </w:r>
+      <w:r>
+        <w:rPr>
+          <w:rFonts w:ascii="Times New Roman" w:hAnsi="Times New Roman" w:cs="Times New Roman"/>
+          <w:sz w:val="22"/>
+          <w:szCs w:val="22"/>
+        </w:rPr>
+        <w:t>Role-Based Access</w:t>
+      </w:r>
+      <w:r>
+        <w:rPr>
+          <w:rFonts w:ascii="Times New Roman" w:hAnsi="Times New Roman" w:cs="Times New Roman"/>
+          <w:sz w:val="22"/>
+          <w:szCs w:val="22"/>
+        </w:rPr>
+        <w:t xml:space="preserve"> </w:t>
+      </w:r>
+      <w:r>
+        <w:rPr>
+          <w:rFonts w:ascii="Times New Roman" w:hAnsi="Times New Roman" w:cs="Times New Roman"/>
+          <w:sz w:val="22"/>
+          <w:szCs w:val="22"/>
+        </w:rPr>
+        <w:t>Control</w:t>
+      </w:r>
+      <w:r>
+        <w:rPr>
+          <w:rFonts w:ascii="Times New Roman" w:hAnsi="Times New Roman" w:cs="Times New Roman"/>
+          <w:sz w:val="22"/>
+          <w:szCs w:val="22"/>
+        </w:rPr>
+        <w:t xml:space="preserve"> to Automated Notifications</w:t>
+      </w:r>
+      <w:r>
+        <w:rPr>
+          <w:rFonts w:ascii="Times New Roman" w:hAnsi="Times New Roman" w:cs="Times New Roman"/>
+          <w:sz w:val="22"/>
+          <w:szCs w:val="22"/>
+        </w:rPr>
+        <w:t xml:space="preserve"> - </w:t>
+      </w:r>
+      <w:r>
+        <w:rPr>
+          <w:rFonts w:ascii="Times New Roman" w:hAnsi="Times New Roman" w:cs="Times New Roman"/>
+          <w:sz w:val="22"/>
+          <w:szCs w:val="22"/>
+        </w:rPr>
+        <w:t>is fully operational and compliant</w:t>
+      </w:r>
+      <w:r>
+        <w:rPr>
+          <w:rFonts w:ascii="Times New Roman" w:hAnsi="Times New Roman" w:cs="Times New Roman"/>
+          <w:sz w:val="22"/>
+          <w:szCs w:val="22"/>
+        </w:rPr>
+        <w:t>.</w:t>
+      </w:r>
+    </w:p>
+    <w:p>
+      <w:pPr>
+        <w:pStyle w:val="Header"/>
+        <w:spacing w:after="160" w:line="278" w:lineRule="auto"/>
+        <w:rPr>
+          <w:rFonts w:ascii="Times New Roman" w:hAnsi="Times New Roman" w:cs="Times New Roman"/>
+          <w:sz w:val="22"/>
+          <w:szCs w:val="22"/>
+        </w:rPr>
+      </w:pPr>
+    </w:p>
+    <w:p>
+      <w:pPr>
+        <w:pStyle w:val="Header"/>
+        <w:tabs>
+          <w:tab w:val="clear" w:pos="4680"/>
+          <w:tab w:val="clear" w:pos="9360"/>
+        </w:tabs>
+        <w:spacing w:after="160" w:line="278" w:lineRule="auto"/>
+        <w:rPr>
+          <w:rFonts w:ascii="Times New Roman" w:hAnsi="Times New Roman" w:cs="Times New Roman"/>
+          <w:b/>
+          <w:bCs/>
+          <w:sz w:val="28"/>
+          <w:szCs w:val="28"/>
+        </w:rPr>
+      </w:pPr>
     </w:p>
     <w:sectPr>
       <w:headerReference w:type="first" r:id="rId13"/>
@@ -3943,6 +6136,155 @@
 <file path=word/numbering.xml><?xml version="1.0" encoding="utf-8"?>
 <w:numbering xmlns:wpc="http://schemas.microsoft.com/office/word/2010/wordprocessingCanvas" xmlns:cx="http://schemas.microsoft.com/office/drawing/2014/chartex" xmlns:cx1="http://schemas.microsoft.com/office/drawing/2015/9/8/chartex" xmlns:cx2="http://schemas.microsoft.com/office/drawing/2015/10/21/chartex" xmlns:cx3="http://schemas.microsoft.com/office/drawing/2016/5/9/chartex" xmlns:cx4="http://schemas.microsoft.com/office/drawing/2016/5/10/chartex" xmlns:cx5="http://schemas.microsoft.com/office/drawing/2016/5/11/chartex" xmlns:cx6="http://schemas.microsoft.com/office/drawing/2016/5/12/chartex" xmlns:cx7="http://schemas.microsoft.com/office/drawing/2016/5/13/chartex" xmlns:cx8="http://schemas.microsoft.com/office/drawing/2016/5/14/chartex" xmlns:mc="http://schemas.openxmlformats.org/markup-compatibility/2006" xmlns:aink="http://schemas.microsoft.com/office/drawing/2016/ink" xmlns:am3d="http://schemas.microsoft.com/office/drawing/2017/model3d" xmlns:o="urn:schemas-microsoft-com:office:office" xmlns:oel="http://schemas.microsoft.com/office/2019/extlst" xmlns:r="http://schemas.openxmlformats.org/officeDocument/2006/relationships" xmlns:m="http://schemas.openxmlformats.org/officeDocument/2006/math" xmlns:v="urn:schemas-microsoft-com:vml" xmlns:wp14="http://schemas.microsoft.com/office/word/2010/wordprocessingDrawing" xmlns:wp="http://schemas.openxmlformats.org/drawingml/2006/wordprocessingDrawing" xmlns:w10="urn:schemas-microsoft-com:office:word" xmlns:w="http://schemas.openxmlformats.org/wordprocessingml/2006/main" xmlns:w14="http://schemas.microsoft.com/office/word/2010/wordml" xmlns:w15="http://schemas.microsoft.com/office/word/2012/wordml" xmlns:w16cex="http://schemas.microsoft.com/office/word/2018/wordml/cex" xmlns:w16cid="http://schemas.microsoft.com/office/word/2016/wordml/cid" xmlns:w16="http://schemas.microsoft.com/office/word/2018/wordml" xmlns:w16du="http://schemas.microsoft.com/office/word/2023/wordml/word16du" xmlns:w16sdtdh="http://schemas.microsoft.com/office/word/2020/wordml/sdtdatahash" xmlns:w16sdtfl="http://schemas.microsoft.com/office/word/2024/wordml/sdtformatlock" xmlns:w16se="http://schemas.microsoft.com/office/word/2015/wordml/symex" xmlns:wpg="http://schemas.microsoft.com/office/word/2010/wordprocessingGroup" xmlns:wpi="http://schemas.microsoft.com/office/word/2010/wordprocessingInk" xmlns:wne="http://schemas.microsoft.com/office/word/2006/wordml" xmlns:wps="http://schemas.microsoft.com/office/word/2010/wordprocessingShape" mc:Ignorable="w14 w15 w16se w16cid w16 w16cex w16sdtdh w16sdtfl w16du wp14">
   <w:abstractNum w:abstractNumId="0" w15:restartNumberingAfterBreak="0">
+    <w:nsid w:val="09A53343"/>
+    <w:multiLevelType w:val="multilevel"/>
+    <w:tmpl w:val="B7224828"/>
+    <w:lvl w:ilvl="0">
+      <w:start w:val="1"/>
+      <w:numFmt w:val="bullet"/>
+      <w:lvlText w:val=""/>
+      <w:lvlJc w:val="left"/>
+      <w:pPr>
+        <w:tabs>
+          <w:tab w:val="num" w:pos="720"/>
+        </w:tabs>
+        <w:ind w:left="720" w:hanging="360"/>
+      </w:pPr>
+      <w:rPr>
+        <w:rFonts w:ascii="Symbol" w:hAnsi="Symbol" w:hint="default"/>
+        <w:sz w:val="20"/>
+      </w:rPr>
+    </w:lvl>
+    <w:lvl w:ilvl="1" w:tentative="1">
+      <w:start w:val="1"/>
+      <w:numFmt w:val="bullet"/>
+      <w:lvlText w:val="o"/>
+      <w:lvlJc w:val="left"/>
+      <w:pPr>
+        <w:tabs>
+          <w:tab w:val="num" w:pos="1440"/>
+        </w:tabs>
+        <w:ind w:left="1440" w:hanging="360"/>
+      </w:pPr>
+      <w:rPr>
+        <w:rFonts w:ascii="Courier New" w:hAnsi="Courier New" w:hint="default"/>
+        <w:sz w:val="20"/>
+      </w:rPr>
+    </w:lvl>
+    <w:lvl w:ilvl="2" w:tentative="1">
+      <w:start w:val="1"/>
+      <w:numFmt w:val="bullet"/>
+      <w:lvlText w:val=""/>
+      <w:lvlJc w:val="left"/>
+      <w:pPr>
+        <w:tabs>
+          <w:tab w:val="num" w:pos="2160"/>
+        </w:tabs>
+        <w:ind w:left="2160" w:hanging="360"/>
+      </w:pPr>
+      <w:rPr>
+        <w:rFonts w:ascii="Wingdings" w:hAnsi="Wingdings" w:hint="default"/>
+        <w:sz w:val="20"/>
+      </w:rPr>
+    </w:lvl>
+    <w:lvl w:ilvl="3" w:tentative="1">
+      <w:start w:val="1"/>
+      <w:numFmt w:val="bullet"/>
+      <w:lvlText w:val=""/>
+      <w:lvlJc w:val="left"/>
+      <w:pPr>
+        <w:tabs>
+          <w:tab w:val="num" w:pos="2880"/>
+        </w:tabs>
+        <w:ind w:left="2880" w:hanging="360"/>
+      </w:pPr>
+      <w:rPr>
+        <w:rFonts w:ascii="Wingdings" w:hAnsi="Wingdings" w:hint="default"/>
+        <w:sz w:val="20"/>
+      </w:rPr>
+    </w:lvl>
+    <w:lvl w:ilvl="4" w:tentative="1">
+      <w:start w:val="1"/>
+      <w:numFmt w:val="bullet"/>
+      <w:lvlText w:val=""/>
+      <w:lvlJc w:val="left"/>
+      <w:pPr>
+        <w:tabs>
+          <w:tab w:val="num" w:pos="3600"/>
+        </w:tabs>
+        <w:ind w:left="3600" w:hanging="360"/>
+      </w:pPr>
+      <w:rPr>
+        <w:rFonts w:ascii="Wingdings" w:hAnsi="Wingdings" w:hint="default"/>
+        <w:sz w:val="20"/>
+      </w:rPr>
+    </w:lvl>
+    <w:lvl w:ilvl="5" w:tentative="1">
+      <w:start w:val="1"/>
+      <w:numFmt w:val="bullet"/>
+      <w:lvlText w:val=""/>
+      <w:lvlJc w:val="left"/>
+      <w:pPr>
+        <w:tabs>
+          <w:tab w:val="num" w:pos="4320"/>
+        </w:tabs>
+        <w:ind w:left="4320" w:hanging="360"/>
+      </w:pPr>
+      <w:rPr>
+        <w:rFonts w:ascii="Wingdings" w:hAnsi="Wingdings" w:hint="default"/>
+        <w:sz w:val="20"/>
+      </w:rPr>
+    </w:lvl>
+    <w:lvl w:ilvl="6" w:tentative="1">
+      <w:start w:val="1"/>
+      <w:numFmt w:val="bullet"/>
+      <w:lvlText w:val=""/>
+      <w:lvlJc w:val="left"/>
+      <w:pPr>
+        <w:tabs>
+          <w:tab w:val="num" w:pos="5040"/>
+        </w:tabs>
+        <w:ind w:left="5040" w:hanging="360"/>
+      </w:pPr>
+      <w:rPr>
+        <w:rFonts w:ascii="Wingdings" w:hAnsi="Wingdings" w:hint="default"/>
+        <w:sz w:val="20"/>
+      </w:rPr>
+    </w:lvl>
+    <w:lvl w:ilvl="7" w:tentative="1">
+      <w:start w:val="1"/>
+      <w:numFmt w:val="bullet"/>
+      <w:lvlText w:val=""/>
+      <w:lvlJc w:val="left"/>
+      <w:pPr>
+        <w:tabs>
+          <w:tab w:val="num" w:pos="5760"/>
+        </w:tabs>
+        <w:ind w:left="5760" w:hanging="360"/>
+      </w:pPr>
+      <w:rPr>
+        <w:rFonts w:ascii="Wingdings" w:hAnsi="Wingdings" w:hint="default"/>
+        <w:sz w:val="20"/>
+      </w:rPr>
+    </w:lvl>
+    <w:lvl w:ilvl="8" w:tentative="1">
+      <w:start w:val="1"/>
+      <w:numFmt w:val="bullet"/>
+      <w:lvlText w:val=""/>
+      <w:lvlJc w:val="left"/>
+      <w:pPr>
+        <w:tabs>
+          <w:tab w:val="num" w:pos="6480"/>
+        </w:tabs>
+        <w:ind w:left="6480" w:hanging="360"/>
+      </w:pPr>
+      <w:rPr>
+        <w:rFonts w:ascii="Wingdings" w:hAnsi="Wingdings" w:hint="default"/>
+        <w:sz w:val="20"/>
+      </w:rPr>
+    </w:lvl>
+  </w:abstractNum>
+  <w:abstractNum w:abstractNumId="1" w15:restartNumberingAfterBreak="0">
     <w:nsid w:val="15225B89"/>
     <w:multiLevelType w:val="hybridMultilevel"/>
     <w:tmpl w:val="18CA4D1E"/>
@@ -4031,7 +6373,126 @@
       </w:pPr>
     </w:lvl>
   </w:abstractNum>
+  <w:abstractNum w:abstractNumId="2" w15:restartNumberingAfterBreak="0">
+    <w:nsid w:val="51156BC7"/>
+    <w:multiLevelType w:val="hybridMultilevel"/>
+    <w:tmpl w:val="E7AE990E"/>
+    <w:lvl w:ilvl="0" w:tplc="04090001">
+      <w:start w:val="1"/>
+      <w:numFmt w:val="bullet"/>
+      <w:lvlText w:val=""/>
+      <w:lvlJc w:val="left"/>
+      <w:pPr>
+        <w:ind w:left="720" w:hanging="360"/>
+      </w:pPr>
+      <w:rPr>
+        <w:rFonts w:ascii="Symbol" w:hAnsi="Symbol" w:hint="default"/>
+      </w:rPr>
+    </w:lvl>
+    <w:lvl w:ilvl="1" w:tplc="04090003" w:tentative="1">
+      <w:start w:val="1"/>
+      <w:numFmt w:val="bullet"/>
+      <w:lvlText w:val="o"/>
+      <w:lvlJc w:val="left"/>
+      <w:pPr>
+        <w:ind w:left="1440" w:hanging="360"/>
+      </w:pPr>
+      <w:rPr>
+        <w:rFonts w:ascii="Courier New" w:hAnsi="Courier New" w:cs="Courier New" w:hint="default"/>
+      </w:rPr>
+    </w:lvl>
+    <w:lvl w:ilvl="2" w:tplc="04090005" w:tentative="1">
+      <w:start w:val="1"/>
+      <w:numFmt w:val="bullet"/>
+      <w:lvlText w:val=""/>
+      <w:lvlJc w:val="left"/>
+      <w:pPr>
+        <w:ind w:left="2160" w:hanging="360"/>
+      </w:pPr>
+      <w:rPr>
+        <w:rFonts w:ascii="Wingdings" w:hAnsi="Wingdings" w:hint="default"/>
+      </w:rPr>
+    </w:lvl>
+    <w:lvl w:ilvl="3" w:tplc="04090001" w:tentative="1">
+      <w:start w:val="1"/>
+      <w:numFmt w:val="bullet"/>
+      <w:lvlText w:val=""/>
+      <w:lvlJc w:val="left"/>
+      <w:pPr>
+        <w:ind w:left="2880" w:hanging="360"/>
+      </w:pPr>
+      <w:rPr>
+        <w:rFonts w:ascii="Symbol" w:hAnsi="Symbol" w:hint="default"/>
+      </w:rPr>
+    </w:lvl>
+    <w:lvl w:ilvl="4" w:tplc="04090003" w:tentative="1">
+      <w:start w:val="1"/>
+      <w:numFmt w:val="bullet"/>
+      <w:lvlText w:val="o"/>
+      <w:lvlJc w:val="left"/>
+      <w:pPr>
+        <w:ind w:left="3600" w:hanging="360"/>
+      </w:pPr>
+      <w:rPr>
+        <w:rFonts w:ascii="Courier New" w:hAnsi="Courier New" w:cs="Courier New" w:hint="default"/>
+      </w:rPr>
+    </w:lvl>
+    <w:lvl w:ilvl="5" w:tplc="04090005" w:tentative="1">
+      <w:start w:val="1"/>
+      <w:numFmt w:val="bullet"/>
+      <w:lvlText w:val=""/>
+      <w:lvlJc w:val="left"/>
+      <w:pPr>
+        <w:ind w:left="4320" w:hanging="360"/>
+      </w:pPr>
+      <w:rPr>
+        <w:rFonts w:ascii="Wingdings" w:hAnsi="Wingdings" w:hint="default"/>
+      </w:rPr>
+    </w:lvl>
+    <w:lvl w:ilvl="6" w:tplc="04090001" w:tentative="1">
+      <w:start w:val="1"/>
+      <w:numFmt w:val="bullet"/>
+      <w:lvlText w:val=""/>
+      <w:lvlJc w:val="left"/>
+      <w:pPr>
+        <w:ind w:left="5040" w:hanging="360"/>
+      </w:pPr>
+      <w:rPr>
+        <w:rFonts w:ascii="Symbol" w:hAnsi="Symbol" w:hint="default"/>
+      </w:rPr>
+    </w:lvl>
+    <w:lvl w:ilvl="7" w:tplc="04090003" w:tentative="1">
+      <w:start w:val="1"/>
+      <w:numFmt w:val="bullet"/>
+      <w:lvlText w:val="o"/>
+      <w:lvlJc w:val="left"/>
+      <w:pPr>
+        <w:ind w:left="5760" w:hanging="360"/>
+      </w:pPr>
+      <w:rPr>
+        <w:rFonts w:ascii="Courier New" w:hAnsi="Courier New" w:cs="Courier New" w:hint="default"/>
+      </w:rPr>
+    </w:lvl>
+    <w:lvl w:ilvl="8" w:tplc="04090005" w:tentative="1">
+      <w:start w:val="1"/>
+      <w:numFmt w:val="bullet"/>
+      <w:lvlText w:val=""/>
+      <w:lvlJc w:val="left"/>
+      <w:pPr>
+        <w:ind w:left="6480" w:hanging="360"/>
+      </w:pPr>
+      <w:rPr>
+        <w:rFonts w:ascii="Wingdings" w:hAnsi="Wingdings" w:hint="default"/>
+      </w:rPr>
+    </w:lvl>
+  </w:abstractNum>
   <w:num w:numId="1" w16cid:durableId="461465089">
+    <w:abstractNumId w:val="1"/>
+  </w:num>
+  <w:num w:numId="2" w16cid:durableId="2044330909">
+    <w:abstractNumId w:val="2"/>
+  </w:num>
+  <w:num w:numId="3" w16cid:durableId="1206403853">
     <w:abstractNumId w:val="0"/>
   </w:num>
 </w:numbering>
@@ -5084,6 +7545,31 @@
       <w:u w:val="single"/>
     </w:rPr>
   </w:style>
+  <w:style w:type="paragraph" w:styleId="BodyText2">
+    <w:name w:val="Body Text 2"/>
+    <w:basedOn w:val="Normal"/>
+    <w:link w:val="BodyText2Char"/>
+    <w:uiPriority w:val="99"/>
+    <w:unhideWhenUsed/>
+    <w:rsid w:val="005546CE"/>
+    <w:rPr>
+      <w:rFonts w:ascii="Times New Roman" w:hAnsi="Times New Roman" w:cs="Times New Roman"/>
+      <w:sz w:val="22"/>
+      <w:szCs w:val="22"/>
+    </w:rPr>
+  </w:style>
+  <w:style w:type="character" w:customStyle="1" w:styleId="BodyText2Char">
+    <w:name w:val="Body Text 2 Char"/>
+    <w:basedOn w:val="DefaultParagraphFont"/>
+    <w:link w:val="BodyText2"/>
+    <w:uiPriority w:val="99"/>
+    <w:rsid w:val="005546CE"/>
+    <w:rPr>
+      <w:rFonts w:ascii="Times New Roman" w:hAnsi="Times New Roman" w:cs="Times New Roman"/>
+      <w:sz w:val="22"/>
+      <w:szCs w:val="22"/>
+    </w:rPr>
+  </w:style>
 </w:styles>
 </file>
 

</xml_diff>